<commit_message>
Voeg 5 nieuwe partijen toe aan de uitbreidingspool
Partijpool uitgebreid van 10 naar 15 partijen voor meer reelplayability.
Spelers selecteren nog steeds 6-10 partijen per spel uit de totale pool.

Nieuwe partijen:
- OMA (Ouderenzorg, Memoires en Appeltaart) — senioren, centrumlinks
- BNB (Boer en Nederlandsch Boerenverstand) — agrarisch/populistisch
- WOK (Wonen of Kraken) — wooncrisis, links
- KGW (Kerk, Gezin en Waarden) — christelijk-conservatief
- SVB (Sportief Verbond voor Beweging) — sport/gezondheid, centrumrechts

Wijzigingen in index.html, tv.html (PARTIES, LEADERS, QUIRKS, CROWN_JEWELS,
INTROS, DEALBREAKERS, HEMI_COLORS, HEMI_ORDER) en De_Formatie_Spellenavond_v2.docx.

https://claude.ai/code/session_01VqEnzCuiKTqytotYUfyKxb
</commit_message>
<xml_diff>
--- a/De_Formatie_Spellenavond_v2.docx
+++ b/De_Formatie_Spellenavond_v2.docx
@@ -16808,6 +16808,490 @@
         </w:tc>
       </w:tr>
     </w:tbl>
+    <w:p>
+      <w:r>
+        <w:br w:type="page"/>
+      </w:r>
+    </w:p>
+    <w:p>
+      <w:r>
+        <w:rPr>
+          <w:b/>
+          <w:sz w:val="32"/>
+        </w:rPr>
+        <w:t>EXTRA PARTIJEN (UITBREIDINGSPOOL)</w:t>
+      </w:r>
+    </w:p>
+    <w:p>
+      <w:r>
+        <w:t>De volgende 5 partijen zijn aanvullende partijen voor de uitbreidingspool. Selecteer bij de start van het spel 6–10 partijen uit de totale pool van 15. Dit vergroot de reelplayability en zorgt voor een andere spelervaring elke avond.</w:t>
+      </w:r>
+    </w:p>
+    <w:p/>
+    <w:p>
+      <w:r>
+        <w:rPr>
+          <w:b/>
+          <w:sz w:val="26"/>
+        </w:rPr>
+        <w:t>OMA — Ouderenzorg, Memoires en Appeltaart</w:t>
+      </w:r>
+    </w:p>
+    <w:p>
+      <w:r>
+        <w:t>Lijsttrekker: Tante Riet van de Rolstoel</w:t>
+      </w:r>
+    </w:p>
+    <w:p>
+      <w:r>
+        <w:rPr>
+          <w:b/>
+        </w:rPr>
+        <w:t>Wie zijn wij?</w:t>
+      </w:r>
+    </w:p>
+    <w:p>
+      <w:r>
+        <w:t>De partij van de wijze ouderen die vroeger alles beter wisten. OMA strijdt voor een eerlijk pensioen voor iedereen die daarvoor te oud is om nog te strijden.</w:t>
+      </w:r>
+    </w:p>
+    <w:p>
+      <w:r>
+        <w:rPr>
+          <w:b/>
+        </w:rPr>
+        <w:t>Standpunten:</w:t>
+      </w:r>
+    </w:p>
+    <w:p>
+      <w:pPr>
+        <w:pStyle w:val="ListParagraph"/>
+      </w:pPr>
+      <w:r>
+        <w:t>• Pensioenleeftijd terug naar 60</w:t>
+      </w:r>
+    </w:p>
+    <w:p>
+      <w:pPr>
+        <w:pStyle w:val="ListParagraph"/>
+      </w:pPr>
+      <w:r>
+        <w:t>• Gratis stamppot in elk verzorgingstehuis</w:t>
+      </w:r>
+    </w:p>
+    <w:p>
+      <w:pPr>
+        <w:pStyle w:val="ListParagraph"/>
+      </w:pPr>
+      <w:r>
+        <w:t>• Meer rustbanken in het centrum</w:t>
+      </w:r>
+    </w:p>
+    <w:p>
+      <w:pPr>
+        <w:pStyle w:val="ListParagraph"/>
+      </w:pPr>
+      <w:r>
+        <w:t>• Geen modernisering van het OV zonder instructiefilmpje</w:t>
+      </w:r>
+    </w:p>
+    <w:p>
+      <w:r>
+        <w:t>Dealbreaker: WIFI — te moderne technologie, te ingewikkeld, vroeger had je gewoon een vaste lijn</w:t>
+      </w:r>
+    </w:p>
+    <w:p>
+      <w:r>
+        <w:t>Kroonjuweel: Pensioenleeftijd terug naar 60 + gratis stamppot in elk verzorgingstehuis</w:t>
+      </w:r>
+    </w:p>
+    <w:p>
+      <w:r>
+        <w:t>Karakter-quirk: Vergeet halverwege wat ze wilde zeggen en vertelt een irrelevant verhaal over 1987</w:t>
+      </w:r>
+    </w:p>
+    <w:p>
+      <w:r>
+        <w:t>Speeltip: Speel OMA als iemand die het altijd goed bedoelt maar niemand meer volgt. Elk punt begint met "Nou, in mijn tijd..." en eindigt ergens anders dan het begon.</w:t>
+      </w:r>
+    </w:p>
+    <w:p>
+      <w:r>
+        <w:t>Geheime objectievenkaart bonus: Woord "pensioen" staat in de TITEL van het coalitieakkoord (+3 punten)</w:t>
+      </w:r>
+    </w:p>
+    <w:p/>
+    <w:p>
+      <w:r>
+        <w:rPr>
+          <w:b/>
+          <w:sz w:val="26"/>
+        </w:rPr>
+        <w:t>BNB — Boer en Nederlandsch Boerenverstand</w:t>
+      </w:r>
+    </w:p>
+    <w:p>
+      <w:r>
+        <w:t>Lijsttrekker: Kees van den Trekker</w:t>
+      </w:r>
+    </w:p>
+    <w:p>
+      <w:r>
+        <w:rPr>
+          <w:b/>
+        </w:rPr>
+        <w:t>Wie zijn wij?</w:t>
+      </w:r>
+    </w:p>
+    <w:p>
+      <w:r>
+        <w:t>De stem van het platteland, de boer, en iedereen die Den Haag te ver weg vindt. BNB gelooft dat gezond verstand en een goede oogst de oplossing zijn voor elk maatschappelijk probleem.</w:t>
+      </w:r>
+    </w:p>
+    <w:p>
+      <w:r>
+        <w:rPr>
+          <w:b/>
+        </w:rPr>
+        <w:t>Standpunten:</w:t>
+      </w:r>
+    </w:p>
+    <w:p>
+      <w:pPr>
+        <w:pStyle w:val="ListParagraph"/>
+      </w:pPr>
+      <w:r>
+        <w:t>• Alle stikstofregels onmiddellijk afgeschaft</w:t>
+      </w:r>
+    </w:p>
+    <w:p>
+      <w:pPr>
+        <w:pStyle w:val="ListParagraph"/>
+      </w:pPr>
+      <w:r>
+        <w:t>• Tractoren altijd voorrang op de snelweg</w:t>
+      </w:r>
+    </w:p>
+    <w:p>
+      <w:pPr>
+        <w:pStyle w:val="ListParagraph"/>
+      </w:pPr>
+      <w:r>
+        <w:t>• Subsidie voor boerenmarkten in elke gemeente</w:t>
+      </w:r>
+    </w:p>
+    <w:p>
+      <w:pPr>
+        <w:pStyle w:val="ListParagraph"/>
+      </w:pPr>
+      <w:r>
+        <w:t>• Geen klimaatwet die de veestapel verkleint</w:t>
+      </w:r>
+    </w:p>
+    <w:p>
+      <w:r>
+        <w:t>Dealbreaker: PPP — klimaatfanatici die nooit een koe van dichtbij hebben gezien</w:t>
+      </w:r>
+    </w:p>
+    <w:p>
+      <w:r>
+        <w:t>Kroonjuweel: Alle stikstofregels afgeschaft</w:t>
+      </w:r>
+    </w:p>
+    <w:p>
+      <w:r>
+        <w:t>Karakter-quirk: Elke politieke stelling "bewijst" hij met een anekdote over zijn koe Betsie</w:t>
+      </w:r>
+    </w:p>
+    <w:p>
+      <w:r>
+        <w:t>Speeltip: Speel BNB als iemand die diep overtuigd is dat de stad het probleem is. Betsie de koe is altijd het beste argument.</w:t>
+      </w:r>
+    </w:p>
+    <w:p>
+      <w:r>
+        <w:t>Geheime objectievenkaart bonus: Geen enkele milieu- of klimaatregel staat in het coalitieakkoord (+3 punten)</w:t>
+      </w:r>
+    </w:p>
+    <w:p/>
+    <w:p>
+      <w:r>
+        <w:rPr>
+          <w:b/>
+          <w:sz w:val="26"/>
+        </w:rPr>
+        <w:t>WOK — Wonen of Kraken</w:t>
+      </w:r>
+    </w:p>
+    <w:p>
+      <w:r>
+        <w:t>Lijsttrekker: Vera van de Wachtlijst</w:t>
+      </w:r>
+    </w:p>
+    <w:p>
+      <w:r>
+        <w:rPr>
+          <w:b/>
+        </w:rPr>
+        <w:t>Wie zijn wij?</w:t>
+      </w:r>
+    </w:p>
+    <w:p>
+      <w:r>
+        <w:t>De partij van mensen die op een wachtlijst staan, ooit op een wachtlijst hebben gestaan, of bang zijn dat ze op een wachtlijst komen. WOK strijdt voor een dak boven elk hoofd — betaalbaar, nu.</w:t>
+      </w:r>
+    </w:p>
+    <w:p>
+      <w:r>
+        <w:rPr>
+          <w:b/>
+        </w:rPr>
+        <w:t>Standpunten:</w:t>
+      </w:r>
+    </w:p>
+    <w:p>
+      <w:pPr>
+        <w:pStyle w:val="ListParagraph"/>
+      </w:pPr>
+      <w:r>
+        <w:t>• Maximale huurprijs €400 per maand</w:t>
+      </w:r>
+    </w:p>
+    <w:p>
+      <w:pPr>
+        <w:pStyle w:val="ListParagraph"/>
+      </w:pPr>
+      <w:r>
+        <w:t>• 500.000 sociale huurwoningen erbij</w:t>
+      </w:r>
+    </w:p>
+    <w:p>
+      <w:pPr>
+        <w:pStyle w:val="ListParagraph"/>
+      </w:pPr>
+      <w:r>
+        <w:t>• Leegstaande kantoren worden woonruimte</w:t>
+      </w:r>
+    </w:p>
+    <w:p>
+      <w:pPr>
+        <w:pStyle w:val="ListParagraph"/>
+      </w:pPr>
+      <w:r>
+        <w:t>• Verhuurders met meer dan 3 panden betalen dubbele belasting</w:t>
+      </w:r>
+    </w:p>
+    <w:p>
+      <w:r>
+        <w:t>Dealbreaker: DDP — die alleen dure appartementen wil bouwen als "investeringskansen"</w:t>
+      </w:r>
+    </w:p>
+    <w:p>
+      <w:r>
+        <w:t>Kroonjuweel: Maximale huurprijs €400 per maand</w:t>
+      </w:r>
+    </w:p>
+    <w:p>
+      <w:r>
+        <w:t>Karakter-quirk: Elke zin eindigt met "...en mijn wachtlijst staat al op jaar zeven"</w:t>
+      </w:r>
+    </w:p>
+    <w:p>
+      <w:r>
+        <w:t>Speeltip: Speel WOK als iemand die persoonlijk geraakt is door elk debatpunt. De wachtlijst van jaar zeven is altijd relevant — ook als het over kaasbeleid gaat.</w:t>
+      </w:r>
+    </w:p>
+    <w:p>
+      <w:r>
+        <w:t>Geheime objectievenkaart bonus: Ministerie van Volkshuisvesting aanwezig in het kabinet (+3 punten)</w:t>
+      </w:r>
+    </w:p>
+    <w:p/>
+    <w:p>
+      <w:r>
+        <w:rPr>
+          <w:b/>
+          <w:sz w:val="26"/>
+        </w:rPr>
+        <w:t>KGW — Kerk, Gezin en Waarden</w:t>
+      </w:r>
+    </w:p>
+    <w:p>
+      <w:r>
+        <w:t>Lijsttrekker: Dominee Adriaan van het Kruispad</w:t>
+      </w:r>
+    </w:p>
+    <w:p>
+      <w:r>
+        <w:rPr>
+          <w:b/>
+        </w:rPr>
+        <w:t>Wie zijn wij?</w:t>
+      </w:r>
+    </w:p>
+    <w:p>
+      <w:r>
+        <w:t>De partij van traditionele waarden, het gezin als hoeksteen van de samenleving, en de zondag als heilige dag van rust. KGW gelooft dat Nederland zijn moreel kompas kwijt is.</w:t>
+      </w:r>
+    </w:p>
+    <w:p>
+      <w:r>
+        <w:rPr>
+          <w:b/>
+        </w:rPr>
+        <w:t>Standpunten:</w:t>
+      </w:r>
+    </w:p>
+    <w:p>
+      <w:pPr>
+        <w:pStyle w:val="ListParagraph"/>
+      </w:pPr>
+      <w:r>
+        <w:t>• Zondag als verplichte nationale rustdag</w:t>
+      </w:r>
+    </w:p>
+    <w:p>
+      <w:pPr>
+        <w:pStyle w:val="ListParagraph"/>
+      </w:pPr>
+      <w:r>
+        <w:t>• Belastingvoordeel voor gezinnen met meer dan 3 kinderen</w:t>
+      </w:r>
+    </w:p>
+    <w:p>
+      <w:pPr>
+        <w:pStyle w:val="ListParagraph"/>
+      </w:pPr>
+      <w:r>
+        <w:t>• Bijbelonderwijs als keuzevak op elke school</w:t>
+      </w:r>
+    </w:p>
+    <w:p>
+      <w:pPr>
+        <w:pStyle w:val="ListParagraph"/>
+      </w:pPr>
+      <w:r>
+        <w:t>• Geen winkels open op zon- en feestdagen</w:t>
+      </w:r>
+    </w:p>
+    <w:p>
+      <w:r>
+        <w:t>Dealbreaker: FBL — luiheid is een zonde, ook op zondag (en dat is de enige rustdag die KGW erkent)</w:t>
+      </w:r>
+    </w:p>
+    <w:p>
+      <w:r>
+        <w:t>Kroonjuweel: Zondag als verplichte nationale rustdag</w:t>
+      </w:r>
+    </w:p>
+    <w:p>
+      <w:r>
+        <w:t>Karakter-quirk: Citeert bijbelteksten die totaal niet van toepassing zijn, volkomen serieus</w:t>
+      </w:r>
+    </w:p>
+    <w:p>
+      <w:r>
+        <w:t>Speeltip: Speel KGW volkomen serieus. De bijbeltekst is altijd relevant. "Zoals staat geschreven in Spreuken 14:23 — dus daarom is de 3-daagse werkweek een zonde."</w:t>
+      </w:r>
+    </w:p>
+    <w:p>
+      <w:r>
+        <w:t>Geheime objectievenkaart bonus: Woord "gezin" of "familie" staat minstens 2x in het coalitieakkoord (+3 punten)</w:t>
+      </w:r>
+    </w:p>
+    <w:p/>
+    <w:p>
+      <w:r>
+        <w:rPr>
+          <w:b/>
+          <w:sz w:val="26"/>
+        </w:rPr>
+        <w:t>SVB — Sportief Verbond voor Beweging</w:t>
+      </w:r>
+    </w:p>
+    <w:p>
+      <w:r>
+        <w:t>Lijsttrekker: Duco Spierenboer-Hardloper</w:t>
+      </w:r>
+    </w:p>
+    <w:p>
+      <w:r>
+        <w:rPr>
+          <w:b/>
+        </w:rPr>
+        <w:t>Wie zijn wij?</w:t>
+      </w:r>
+    </w:p>
+    <w:p>
+      <w:r>
+        <w:t>De partij die gelooft dat een gezond land begint bij een gezond lichaam. SVB wil sport verplicht stellen voor ambtenaren en elke coalitieonderhandeling behandelen als een teamwedstrijd.</w:t>
+      </w:r>
+    </w:p>
+    <w:p>
+      <w:r>
+        <w:rPr>
+          <w:b/>
+        </w:rPr>
+        <w:t>Standpunten:</w:t>
+      </w:r>
+    </w:p>
+    <w:p>
+      <w:pPr>
+        <w:pStyle w:val="ListParagraph"/>
+      </w:pPr>
+      <w:r>
+        <w:t>• Verplicht gym-uur per werkdag voor alle ambtenaren</w:t>
+      </w:r>
+    </w:p>
+    <w:p>
+      <w:pPr>
+        <w:pStyle w:val="ListParagraph"/>
+      </w:pPr>
+      <w:r>
+        <w:t>• Sportkantine-aftrek voor bedrijven</w:t>
+      </w:r>
+    </w:p>
+    <w:p>
+      <w:pPr>
+        <w:pStyle w:val="ListParagraph"/>
+      </w:pPr>
+      <w:r>
+        <w:t>• Nationaal hardlooppad langs alle snelwegen</w:t>
+      </w:r>
+    </w:p>
+    <w:p>
+      <w:pPr>
+        <w:pStyle w:val="ListParagraph"/>
+      </w:pPr>
+      <w:r>
+        <w:t>• Minister-president doet elke ochtend live workout op NPO 1</w:t>
+      </w:r>
+    </w:p>
+    <w:p>
+      <w:r>
+        <w:t>Dealbreaker: FBL — de 3-daagse werkweek is anti-sport en leidt tot nationale verzwakking</w:t>
+      </w:r>
+    </w:p>
+    <w:p>
+      <w:r>
+        <w:t>Kroonjuweel: Verplicht gym-uur per werkdag voor alle ambtenaren</w:t>
+      </w:r>
+    </w:p>
+    <w:p>
+      <w:r>
+        <w:t>Karakter-quirk: Elk debatpunt begint met "als in topsport..." en eindigt met aanmoedigend "kom op team!"</w:t>
+      </w:r>
+    </w:p>
+    <w:p>
+      <w:r>
+        <w:t>Speeltip: Speel SVB als eeuwig optimistisch en teamgericht. Elk conflict is "een kans om als team te groeien". Nooit negatief, altijd in beweging.</w:t>
+      </w:r>
+    </w:p>
+    <w:p>
+      <w:r>
+        <w:t>Geheime objectievenkaart bonus: Ministerie van Sport en Gezondheid aanwezig in het kabinet (+3 punten)</w:t>
+      </w:r>
+    </w:p>
     <w:sectPr>
       <w:headerReference w:type="default" r:id="rId6"/>
       <w:footerReference w:type="default" r:id="rId7"/>

</xml_diff>

<commit_message>
Sync docx with app and add complete markdown rulebook
- Updated De_Formatie_Spellenavond_v2.docx:
  - Changed player count from 11 to 6-10
  - Updated card counts (15 parties, 25 crisis cards, 20 laws, 12 cabinet crises)
  - Fixed Opportunist and Kingmaker definitions to match app
  - Expanded score table from 10 to 15 parties
  - Added objective cards for 5 expansion parties (OMA, BNB, WOK, KGW, SVB)

- Added De_Formatie_Spellenavond_v2.md:
  - Complete markdown rulebook synced with app
  - All 15 parties with standpoints, relations, quirks, tips
  - All 15 objective cards
  - All 25 formation crisis cards
  - All 20 laws with informateur hints
  - All 12 cabinet crisis cards
  - All 28 speed-debat stellingen
  - Secret agenda definitions with variable distribution
  - Coalition agreement template
  - Score sheet for 15 parties
</commit_message>
<xml_diff>
--- a/De_Formatie_Spellenavond_v2.docx
+++ b/De_Formatie_Spellenavond_v2.docx
@@ -86,7 +86,7 @@
           <w:sz w:val="28"/>
           <w:szCs w:val="28"/>
         </w:rPr>
-        <w:t xml:space="preserve">voor 11 spelers</w:t>
+        <w:t xml:space="preserve">voor 6–10 spelers</w:t>
       </w:r>
     </w:p>
     <w:p>
@@ -118,7 +118,7 @@
           <w:sz w:val="22"/>
           <w:szCs w:val="22"/>
         </w:rPr>
-        <w:t xml:space="preserve">10 Partijkaarten met standpunten, karakter en strategie</w:t>
+        <w:t xml:space="preserve">15 Partijkaarten met standpunten, karakter en strategie</w:t>
       </w:r>
     </w:p>
     <w:p>
@@ -133,7 +133,7 @@
           <w:sz w:val="22"/>
           <w:szCs w:val="22"/>
         </w:rPr>
-        <w:t xml:space="preserve">11 Geheime Objectievenkaarten</w:t>
+        <w:t xml:space="preserve">15 Geheime Objectievenkaarten</w:t>
       </w:r>
     </w:p>
     <w:p>
@@ -148,7 +148,7 @@
           <w:sz w:val="22"/>
           <w:szCs w:val="22"/>
         </w:rPr>
-        <w:t xml:space="preserve">10 Formatiecrisiskaarten</w:t>
+        <w:t xml:space="preserve">25 Formatiecrisiskaarten</w:t>
       </w:r>
     </w:p>
     <w:p>
@@ -163,7 +163,7 @@
           <w:sz w:val="22"/>
           <w:szCs w:val="22"/>
         </w:rPr>
-        <w:t xml:space="preserve">8 Wetsvoorstellen</w:t>
+        <w:t xml:space="preserve">20 Wetsvoorstellen</w:t>
       </w:r>
     </w:p>
     <w:p>
@@ -178,7 +178,7 @@
           <w:sz w:val="22"/>
           <w:szCs w:val="22"/>
         </w:rPr>
-        <w:t xml:space="preserve">6 Kabinetscrisis-kaarten &amp; 10 Geheime Agenda’s</w:t>
+        <w:t xml:space="preserve">12 Kabinetscrisis-kaarten &amp; variabele Geheime Agenda’s (6–10 stuks)</w:t>
       </w:r>
     </w:p>
     <w:p>
@@ -1085,7 +1085,7 @@
         <w:spacing w:after="120"/>
       </w:pPr>
       <w:r>
-        <w:t xml:space="preserve">De Informateur zet twee stoelen vooraan. Steeds twee partijen debatteren over een stelling. Elke speler krijgt 30 seconden. De rest mag reageren (boe/applaus). Stellingen:</w:t>
+        <w:t xml:space="preserve">De Informateur zet twee stoelen vooraan. Steeds twee partijen debatteren over een stelling. Elke speler krijgt 30 seconden. De rest mag reageren (boe/applaus). De app kiest 5 willekeurige stellingen uit een pool van 28. In de printversie kiest de Informateur er 5 uit:</w:t>
       </w:r>
     </w:p>
     <w:p>
@@ -1697,7 +1697,7 @@
           <w:sz w:val="22"/>
           <w:szCs w:val="22"/>
         </w:rPr>
-        <w:t xml:space="preserve">LOYALIST (3x): </w:t>
+        <w:t xml:space="preserve">LOYALIST: </w:t>
       </w:r>
       <w:r>
         <w:rPr>
@@ -1730,7 +1730,7 @@
           <w:sz w:val="22"/>
           <w:szCs w:val="22"/>
         </w:rPr>
-        <w:t xml:space="preserve">OPSTANDELING (3x): </w:t>
+        <w:t xml:space="preserve">OPSTANDELING: </w:t>
       </w:r>
       <w:r>
         <w:rPr>
@@ -1763,7 +1763,7 @@
           <w:sz w:val="22"/>
           <w:szCs w:val="22"/>
         </w:rPr>
-        <w:t xml:space="preserve">OPPORTUNIST (2x): </w:t>
+        <w:t xml:space="preserve">OPPORTUNIST: </w:t>
       </w:r>
       <w:r>
         <w:rPr>
@@ -1771,7 +1771,7 @@
           <w:sz w:val="22"/>
           <w:szCs w:val="22"/>
         </w:rPr>
-        <w:t xml:space="preserve">Je krijgt +3 punten als je minstens één keer van stem wisselt (eerst voor, dan tegen, of andersom) tijdens de crisisrondes.</w:t>
+        <w:t xml:space="preserve">Je krijgt +3 punten als je in de coalitie zit EN minimaal 1Ã TEGEN het kabinet stemt bij een crisis. Sabotage van binnenuit!</w:t>
       </w:r>
     </w:p>
     <w:p>
@@ -1796,7 +1796,7 @@
           <w:sz w:val="22"/>
           <w:szCs w:val="22"/>
         </w:rPr>
-        <w:t xml:space="preserve">KINGMAKER (2x): </w:t>
+        <w:t xml:space="preserve">KINGMAKER: </w:t>
       </w:r>
       <w:r>
         <w:rPr>
@@ -1804,7 +1804,21 @@
           <w:sz w:val="22"/>
           <w:szCs w:val="22"/>
         </w:rPr>
-        <w:t xml:space="preserve">Je krijgt +3 punten als jouw stem op enig moment het verschil maakt — het kantelpunt tussen overleven en vallen. De Informateur bepaalt dit.</w:t>
+        <w:t xml:space="preserve">Je krijgt +3 punten als je NIET in de coalitie zit, maar de Minister-President toch alle 6 crises overleeft. De koningmaker achter de schermen!</w:t>
+      </w:r>
+    </w:p>
+    <w:p>
+      <w:pPr>
+        <w:spacing w:after="120"/>
+        <w:ind w:left="200"/>
+      </w:pPr>
+      <w:r>
+        <w:rPr>
+          <w:rFonts w:ascii="Arial" w:cs="Arial" w:eastAsia="Arial" w:hAnsi="Arial"/>
+          <w:sz w:val="22"/>
+          <w:szCs w:val="22"/>
+        </w:rPr>
+        <w:t xml:space="preserve">De verdeling hangt af van het aantal spelers: 6 spelers = 2/2/1/1, 7 spelers = 3/2/1/1, 8 spelers = 3/3/1/1, 9 spelers = 3/3/2/1, 10 spelers = 3/3/2/2.</w:t>
       </w:r>
     </w:p>
     <w:p>
@@ -10323,52 +10337,6 @@
         </w:tc>
       </w:tr>
     </w:tbl>
-    <w:p>
-      <w:pPr>
-        <w:spacing w:after="100"/>
-        <w:jc w:val="center"/>
-      </w:pPr>
-      <w:r>
-        <w:rPr>
-          <w:rFonts w:ascii="Arial" w:cs="Arial" w:eastAsia="Arial" w:hAnsi="Arial"/>
-          <w:color w:val="AAAAAA"/>
-          <w:sz w:val="18"/>
-          <w:szCs w:val="18"/>
-        </w:rPr>
-        <w:t xml:space="preserve">✂ - - - - - - - - - - - - - - - - - - - - - - - - - - - - - - - - - - - - ✂</w:t>
-      </w:r>
-    </w:p>
-    <w:p>
-      <w:r>
-        <w:br w:type="page"/>
-      </w:r>
-    </w:p>
-    <w:p>
-      <w:pPr>
-        <w:pStyle w:val="Heading1"/>
-      </w:pPr>
-      <w:r>
-        <w:t xml:space="preserve">Crisiskaarten — De Formatie</w:t>
-      </w:r>
-    </w:p>
-    <w:p>
-      <w:pPr>
-        <w:spacing w:after="120"/>
-      </w:pPr>
-      <w:r>
-        <w:rPr>
-          <w:i/>
-          <w:iCs/>
-          <w:color w:val="666666"/>
-        </w:rPr>
-        <w:t xml:space="preserve">Knip uit, leg omgedraaid op een stapel. Trek tussen de fasen door.</w:t>
-      </w:r>
-    </w:p>
-    <w:p>
-      <w:pPr>
-        <w:spacing w:after="80"/>
-      </w:pPr>
-    </w:p>
     <w:tbl>
       <w:tblPr>
         <w:tblW w:type="pct" w:w="100%"/>
@@ -10394,7 +10362,7 @@
               <w:bottom w:val="single" w:color="1B3A5C" w:sz="2"/>
               <w:right w:val="single" w:color="1B3A5C" w:sz="2"/>
             </w:tcBorders>
-            <w:shd w:fill="FDE8E8" w:val="clear"/>
+            <w:shd w:fill="F5F5F5" w:val="clear"/>
             <w:tcMar>
               <w:top w:type="dxa" w:w="120"/>
               <w:left w:type="dxa" w:w="200"/>
@@ -10411,39 +10379,91 @@
                 <w:rFonts w:ascii="Arial" w:cs="Arial" w:eastAsia="Arial" w:hAnsi="Arial"/>
                 <w:b/>
                 <w:bCs/>
-                <w:color w:val="CC0000"/>
-                <w:sz w:val="22"/>
-                <w:szCs w:val="22"/>
-              </w:rPr>
-              <w:t xml:space="preserve">⚠️ CRISIS #1: Geheim Overleg Uitgelekt!</w:t>
-            </w:r>
-          </w:p>
-          <w:p>
-            <w:pPr>
-              <w:spacing w:after="120"/>
-            </w:pPr>
-            <w:r>
-              <w:t xml:space="preserve">De Informateur wijst twee partijen aan die stiekem samen gezien zijn in een achterkamertje. Zij moeten 2 minuten samen staan en hun ‘geheime plan’ verzinnen en aan de hele groep presenteren. De rest mag boe roepen.</w:t>
+                <w:color w:val="1B3A5C"/>
+                <w:sz w:val="22"/>
+                <w:szCs w:val="22"/>
+              </w:rPr>
+              <w:t xml:space="preserve">🔒 GEHEIM — SVB (Duco Spierenboer-Hardloper)
+🟢 MUST-HAVE: "Sport" of "gym-uur voor ambtenaren" staat in het coalitieakkoord
+🔴 DEALBREAKER: FBL — de 3-daagse werkweek is anti-sport en leidt tot nationale verzwakking
+🎯 GEHEIME BONUS: Woord "sport" of "gezondheid" staat in het akkoord (+3 punten)</w:t>
+            </w:r>
+          </w:p>
+          <w:p>
+            <w:pPr>
+              <w:spacing w:after="60"/>
+            </w:pPr>
+            <w:r>
+              <w:rPr>
+                <w:rFonts w:ascii="Arial" w:cs="Arial" w:eastAsia="Arial" w:hAnsi="Arial"/>
+                <w:b/>
+                <w:bCs/>
+                <w:color w:val="FF6B00"/>
+                <w:sz w:val="20"/>
+                <w:szCs w:val="20"/>
+              </w:rPr>
+              <w:t xml:space="preserve"/>
+            </w:r>
+            <w:r>
+              <w:rPr>
+                <w:rFonts w:ascii="Arial" w:cs="Arial" w:eastAsia="Arial" w:hAnsi="Arial"/>
+                <w:sz w:val="20"/>
+                <w:szCs w:val="20"/>
+              </w:rPr>
+              <w:t xml:space="preserve"/>
+            </w:r>
+          </w:p>
+          <w:p>
+            <w:pPr>
+              <w:spacing w:after="60"/>
+            </w:pPr>
+            <w:r>
+              <w:rPr>
+                <w:rFonts w:ascii="Arial" w:cs="Arial" w:eastAsia="Arial" w:hAnsi="Arial"/>
+                <w:b/>
+                <w:bCs/>
+                <w:color w:val="FF6B00"/>
+                <w:sz w:val="20"/>
+                <w:szCs w:val="20"/>
+              </w:rPr>
+              <w:t xml:space="preserve"/>
+            </w:r>
+            <w:r>
+              <w:rPr>
+                <w:rFonts w:ascii="Arial" w:cs="Arial" w:eastAsia="Arial" w:hAnsi="Arial"/>
+                <w:sz w:val="20"/>
+                <w:szCs w:val="20"/>
+              </w:rPr>
+              <w:t xml:space="preserve"/>
+            </w:r>
+          </w:p>
+          <w:p>
+            <w:pPr>
+              <w:spacing w:after="60"/>
+            </w:pPr>
+            <w:r>
+              <w:rPr>
+                <w:rFonts w:ascii="Arial" w:cs="Arial" w:eastAsia="Arial" w:hAnsi="Arial"/>
+                <w:b/>
+                <w:bCs/>
+                <w:color w:val="FF6B00"/>
+                <w:sz w:val="20"/>
+                <w:szCs w:val="20"/>
+              </w:rPr>
+              <w:t xml:space="preserve"/>
+            </w:r>
+            <w:r>
+              <w:rPr>
+                <w:rFonts w:ascii="Arial" w:cs="Arial" w:eastAsia="Arial" w:hAnsi="Arial"/>
+                <w:sz w:val="20"/>
+                <w:szCs w:val="20"/>
+              </w:rPr>
+              <w:t xml:space="preserve"/>
             </w:r>
           </w:p>
         </w:tc>
       </w:tr>
     </w:tbl>
-    <w:p>
-      <w:pPr>
-        <w:spacing w:after="100"/>
-        <w:jc w:val="center"/>
-      </w:pPr>
-      <w:r>
-        <w:rPr>
-          <w:rFonts w:ascii="Arial" w:cs="Arial" w:eastAsia="Arial" w:hAnsi="Arial"/>
-          <w:color w:val="AAAAAA"/>
-          <w:sz w:val="18"/>
-          <w:szCs w:val="18"/>
-        </w:rPr>
-        <w:t xml:space="preserve">✂ - - - - - - - - - - - - - - - - - - - - - - - - - - - - - - - - - - - - ✂</w:t>
-      </w:r>
-    </w:p>
     <w:tbl>
       <w:tblPr>
         <w:tblW w:type="pct" w:w="100%"/>
@@ -10469,7 +10489,7 @@
               <w:bottom w:val="single" w:color="1B3A5C" w:sz="2"/>
               <w:right w:val="single" w:color="1B3A5C" w:sz="2"/>
             </w:tcBorders>
-            <w:shd w:fill="FDE8E8" w:val="clear"/>
+            <w:shd w:fill="F5F5F5" w:val="clear"/>
             <w:tcMar>
               <w:top w:type="dxa" w:w="120"/>
               <w:left w:type="dxa" w:w="200"/>
@@ -10486,39 +10506,91 @@
                 <w:rFonts w:ascii="Arial" w:cs="Arial" w:eastAsia="Arial" w:hAnsi="Arial"/>
                 <w:b/>
                 <w:bCs/>
-                <w:color w:val="CC0000"/>
-                <w:sz w:val="22"/>
-                <w:szCs w:val="22"/>
-              </w:rPr>
-              <w:t xml:space="preserve">⚠️ CRISIS #2: De Koning Belt!</w:t>
-            </w:r>
-          </w:p>
-          <w:p>
-            <w:pPr>
-              <w:spacing w:after="120"/>
-            </w:pPr>
-            <w:r>
-              <w:t xml:space="preserve">De Koning wil ONMIDDELLIJK een voortgangsrapport! De partij met de meeste zetels moet binnen 30 seconden uitleggen hoe het gaat. Is het rapport onvoldoende (groep mag stemmen)? Die partij verliest 2 zetels.</w:t>
+                <w:color w:val="1B3A5C"/>
+                <w:sz w:val="22"/>
+                <w:szCs w:val="22"/>
+              </w:rPr>
+              <w:t xml:space="preserve">🔒 GEHEIM — KGW (Dominee Adriaan van het Kruispad)
+🟢 MUST-HAVE: "Zondag als rustdag" of "zondagsrust" staat in het coalitieakkoord
+🔴 DEALBREAKER: FBL — luiheid is een zonde, ook op zondag (en dat is de enige rustdag die KGW erkent)
+🎯 GEHEIME BONUS: Zondag als rustdag staat in het akkoord (+3 punten)</w:t>
+            </w:r>
+          </w:p>
+          <w:p>
+            <w:pPr>
+              <w:spacing w:after="60"/>
+            </w:pPr>
+            <w:r>
+              <w:rPr>
+                <w:rFonts w:ascii="Arial" w:cs="Arial" w:eastAsia="Arial" w:hAnsi="Arial"/>
+                <w:b/>
+                <w:bCs/>
+                <w:color w:val="FF6B00"/>
+                <w:sz w:val="20"/>
+                <w:szCs w:val="20"/>
+              </w:rPr>
+              <w:t xml:space="preserve"/>
+            </w:r>
+            <w:r>
+              <w:rPr>
+                <w:rFonts w:ascii="Arial" w:cs="Arial" w:eastAsia="Arial" w:hAnsi="Arial"/>
+                <w:sz w:val="20"/>
+                <w:szCs w:val="20"/>
+              </w:rPr>
+              <w:t xml:space="preserve"/>
+            </w:r>
+          </w:p>
+          <w:p>
+            <w:pPr>
+              <w:spacing w:after="60"/>
+            </w:pPr>
+            <w:r>
+              <w:rPr>
+                <w:rFonts w:ascii="Arial" w:cs="Arial" w:eastAsia="Arial" w:hAnsi="Arial"/>
+                <w:b/>
+                <w:bCs/>
+                <w:color w:val="FF6B00"/>
+                <w:sz w:val="20"/>
+                <w:szCs w:val="20"/>
+              </w:rPr>
+              <w:t xml:space="preserve"/>
+            </w:r>
+            <w:r>
+              <w:rPr>
+                <w:rFonts w:ascii="Arial" w:cs="Arial" w:eastAsia="Arial" w:hAnsi="Arial"/>
+                <w:sz w:val="20"/>
+                <w:szCs w:val="20"/>
+              </w:rPr>
+              <w:t xml:space="preserve"/>
+            </w:r>
+          </w:p>
+          <w:p>
+            <w:pPr>
+              <w:spacing w:after="60"/>
+            </w:pPr>
+            <w:r>
+              <w:rPr>
+                <w:rFonts w:ascii="Arial" w:cs="Arial" w:eastAsia="Arial" w:hAnsi="Arial"/>
+                <w:b/>
+                <w:bCs/>
+                <w:color w:val="FF6B00"/>
+                <w:sz w:val="20"/>
+                <w:szCs w:val="20"/>
+              </w:rPr>
+              <w:t xml:space="preserve"/>
+            </w:r>
+            <w:r>
+              <w:rPr>
+                <w:rFonts w:ascii="Arial" w:cs="Arial" w:eastAsia="Arial" w:hAnsi="Arial"/>
+                <w:sz w:val="20"/>
+                <w:szCs w:val="20"/>
+              </w:rPr>
+              <w:t xml:space="preserve"/>
             </w:r>
           </w:p>
         </w:tc>
       </w:tr>
     </w:tbl>
-    <w:p>
-      <w:pPr>
-        <w:spacing w:after="100"/>
-        <w:jc w:val="center"/>
-      </w:pPr>
-      <w:r>
-        <w:rPr>
-          <w:rFonts w:ascii="Arial" w:cs="Arial" w:eastAsia="Arial" w:hAnsi="Arial"/>
-          <w:color w:val="AAAAAA"/>
-          <w:sz w:val="18"/>
-          <w:szCs w:val="18"/>
-        </w:rPr>
-        <w:t xml:space="preserve">✂ - - - - - - - - - - - - - - - - - - - - - - - - - - - - - - - - - - - - ✂</w:t>
-      </w:r>
-    </w:p>
     <w:tbl>
       <w:tblPr>
         <w:tblW w:type="pct" w:w="100%"/>
@@ -10544,7 +10616,7 @@
               <w:bottom w:val="single" w:color="1B3A5C" w:sz="2"/>
               <w:right w:val="single" w:color="1B3A5C" w:sz="2"/>
             </w:tcBorders>
-            <w:shd w:fill="FDE8E8" w:val="clear"/>
+            <w:shd w:fill="F5F5F5" w:val="clear"/>
             <w:tcMar>
               <w:top w:type="dxa" w:w="120"/>
               <w:left w:type="dxa" w:w="200"/>
@@ -10561,39 +10633,91 @@
                 <w:rFonts w:ascii="Arial" w:cs="Arial" w:eastAsia="Arial" w:hAnsi="Arial"/>
                 <w:b/>
                 <w:bCs/>
-                <w:color w:val="CC0000"/>
-                <w:sz w:val="22"/>
-                <w:szCs w:val="22"/>
-              </w:rPr>
-              <w:t xml:space="preserve">⚠️ CRISIS #3: Peiling Alert!</w:t>
-            </w:r>
-          </w:p>
-          <w:p>
-            <w:pPr>
-              <w:spacing w:after="120"/>
-            </w:pPr>
-            <w:r>
-              <w:t xml:space="preserve">Gooi een dobbelsteen: EVEN = de kleinste partij krijgt +3 zetels. ONEVEN = de grootste partij verliest -3 zetels. Pas de zetelverdeling aan!</w:t>
+                <w:color w:val="1B3A5C"/>
+                <w:sz w:val="22"/>
+                <w:szCs w:val="22"/>
+              </w:rPr>
+              <w:t xml:space="preserve">🔒 GEHEIM — WOK (Vera van de Wachtlijst)
+🟢 MUST-HAVE: "Maximale huurprijs" of "sociale huurwoningen" staat in het coalitieakkoord
+🔴 DEALBREAKER: DDP — die alleen dure appartementen wil bouwen als "investeringskansen"
+🎯 GEHEIME BONUS: Maximale huurprijs staat letterlijk in het akkoord (+3 punten)</w:t>
+            </w:r>
+          </w:p>
+          <w:p>
+            <w:pPr>
+              <w:spacing w:after="60"/>
+            </w:pPr>
+            <w:r>
+              <w:rPr>
+                <w:rFonts w:ascii="Arial" w:cs="Arial" w:eastAsia="Arial" w:hAnsi="Arial"/>
+                <w:b/>
+                <w:bCs/>
+                <w:color w:val="FF6B00"/>
+                <w:sz w:val="20"/>
+                <w:szCs w:val="20"/>
+              </w:rPr>
+              <w:t xml:space="preserve"/>
+            </w:r>
+            <w:r>
+              <w:rPr>
+                <w:rFonts w:ascii="Arial" w:cs="Arial" w:eastAsia="Arial" w:hAnsi="Arial"/>
+                <w:sz w:val="20"/>
+                <w:szCs w:val="20"/>
+              </w:rPr>
+              <w:t xml:space="preserve"/>
+            </w:r>
+          </w:p>
+          <w:p>
+            <w:pPr>
+              <w:spacing w:after="60"/>
+            </w:pPr>
+            <w:r>
+              <w:rPr>
+                <w:rFonts w:ascii="Arial" w:cs="Arial" w:eastAsia="Arial" w:hAnsi="Arial"/>
+                <w:b/>
+                <w:bCs/>
+                <w:color w:val="FF6B00"/>
+                <w:sz w:val="20"/>
+                <w:szCs w:val="20"/>
+              </w:rPr>
+              <w:t xml:space="preserve"/>
+            </w:r>
+            <w:r>
+              <w:rPr>
+                <w:rFonts w:ascii="Arial" w:cs="Arial" w:eastAsia="Arial" w:hAnsi="Arial"/>
+                <w:sz w:val="20"/>
+                <w:szCs w:val="20"/>
+              </w:rPr>
+              <w:t xml:space="preserve"/>
+            </w:r>
+          </w:p>
+          <w:p>
+            <w:pPr>
+              <w:spacing w:after="60"/>
+            </w:pPr>
+            <w:r>
+              <w:rPr>
+                <w:rFonts w:ascii="Arial" w:cs="Arial" w:eastAsia="Arial" w:hAnsi="Arial"/>
+                <w:b/>
+                <w:bCs/>
+                <w:color w:val="FF6B00"/>
+                <w:sz w:val="20"/>
+                <w:szCs w:val="20"/>
+              </w:rPr>
+              <w:t xml:space="preserve"/>
+            </w:r>
+            <w:r>
+              <w:rPr>
+                <w:rFonts w:ascii="Arial" w:cs="Arial" w:eastAsia="Arial" w:hAnsi="Arial"/>
+                <w:sz w:val="20"/>
+                <w:szCs w:val="20"/>
+              </w:rPr>
+              <w:t xml:space="preserve"/>
             </w:r>
           </w:p>
         </w:tc>
       </w:tr>
     </w:tbl>
-    <w:p>
-      <w:pPr>
-        <w:spacing w:after="100"/>
-        <w:jc w:val="center"/>
-      </w:pPr>
-      <w:r>
-        <w:rPr>
-          <w:rFonts w:ascii="Arial" w:cs="Arial" w:eastAsia="Arial" w:hAnsi="Arial"/>
-          <w:color w:val="AAAAAA"/>
-          <w:sz w:val="18"/>
-          <w:szCs w:val="18"/>
-        </w:rPr>
-        <w:t xml:space="preserve">✂ - - - - - - - - - - - - - - - - - - - - - - - - - - - - - - - - - - - - ✂</w:t>
-      </w:r>
-    </w:p>
     <w:tbl>
       <w:tblPr>
         <w:tblW w:type="pct" w:w="100%"/>
@@ -10619,7 +10743,7 @@
               <w:bottom w:val="single" w:color="1B3A5C" w:sz="2"/>
               <w:right w:val="single" w:color="1B3A5C" w:sz="2"/>
             </w:tcBorders>
-            <w:shd w:fill="FDE8E8" w:val="clear"/>
+            <w:shd w:fill="F5F5F5" w:val="clear"/>
             <w:tcMar>
               <w:top w:type="dxa" w:w="120"/>
               <w:left w:type="dxa" w:w="200"/>
@@ -10636,39 +10760,91 @@
                 <w:rFonts w:ascii="Arial" w:cs="Arial" w:eastAsia="Arial" w:hAnsi="Arial"/>
                 <w:b/>
                 <w:bCs/>
-                <w:color w:val="CC0000"/>
-                <w:sz w:val="22"/>
-                <w:szCs w:val="22"/>
-              </w:rPr>
-              <w:t xml:space="preserve">⚠️ CRISIS #4: Schandaal in de Kantine!</w:t>
-            </w:r>
-          </w:p>
-          <w:p>
-            <w:pPr>
-              <w:spacing w:after="120"/>
-            </w:pPr>
-            <w:r>
-              <w:t xml:space="preserve">De Informateur wijst een willekeurige partij aan. Die partij is betrapt op het stelen van bitterballen uit de Tweede Kamerkantine! Straf: -2 zetels ÉN een excuus-speech van 30 seconden. Hoe dramatischer, hoe beter.</w:t>
+                <w:color w:val="1B3A5C"/>
+                <w:sz w:val="22"/>
+                <w:szCs w:val="22"/>
+              </w:rPr>
+              <w:t xml:space="preserve">🔒 GEHEIM — BNB (Kees van den Trekker)
+🟢 MUST-HAVE: "Stikstof" of "boerenbeleid" staat in het coalitieakkoord
+🔴 DEALBREAKER: PPP — klimaatfanatici die nooit een koe van dichtbij hebben gezien
+🎯 GEHEIME BONUS: Geen enkele milieu- of klimaatregel staat in het coalitieakkoord (+3 punten)</w:t>
+            </w:r>
+          </w:p>
+          <w:p>
+            <w:pPr>
+              <w:spacing w:after="60"/>
+            </w:pPr>
+            <w:r>
+              <w:rPr>
+                <w:rFonts w:ascii="Arial" w:cs="Arial" w:eastAsia="Arial" w:hAnsi="Arial"/>
+                <w:b/>
+                <w:bCs/>
+                <w:color w:val="FF6B00"/>
+                <w:sz w:val="20"/>
+                <w:szCs w:val="20"/>
+              </w:rPr>
+              <w:t xml:space="preserve"/>
+            </w:r>
+            <w:r>
+              <w:rPr>
+                <w:rFonts w:ascii="Arial" w:cs="Arial" w:eastAsia="Arial" w:hAnsi="Arial"/>
+                <w:sz w:val="20"/>
+                <w:szCs w:val="20"/>
+              </w:rPr>
+              <w:t xml:space="preserve"/>
+            </w:r>
+          </w:p>
+          <w:p>
+            <w:pPr>
+              <w:spacing w:after="60"/>
+            </w:pPr>
+            <w:r>
+              <w:rPr>
+                <w:rFonts w:ascii="Arial" w:cs="Arial" w:eastAsia="Arial" w:hAnsi="Arial"/>
+                <w:b/>
+                <w:bCs/>
+                <w:color w:val="FF6B00"/>
+                <w:sz w:val="20"/>
+                <w:szCs w:val="20"/>
+              </w:rPr>
+              <w:t xml:space="preserve"/>
+            </w:r>
+            <w:r>
+              <w:rPr>
+                <w:rFonts w:ascii="Arial" w:cs="Arial" w:eastAsia="Arial" w:hAnsi="Arial"/>
+                <w:sz w:val="20"/>
+                <w:szCs w:val="20"/>
+              </w:rPr>
+              <w:t xml:space="preserve"/>
+            </w:r>
+          </w:p>
+          <w:p>
+            <w:pPr>
+              <w:spacing w:after="60"/>
+            </w:pPr>
+            <w:r>
+              <w:rPr>
+                <w:rFonts w:ascii="Arial" w:cs="Arial" w:eastAsia="Arial" w:hAnsi="Arial"/>
+                <w:b/>
+                <w:bCs/>
+                <w:color w:val="FF6B00"/>
+                <w:sz w:val="20"/>
+                <w:szCs w:val="20"/>
+              </w:rPr>
+              <w:t xml:space="preserve"/>
+            </w:r>
+            <w:r>
+              <w:rPr>
+                <w:rFonts w:ascii="Arial" w:cs="Arial" w:eastAsia="Arial" w:hAnsi="Arial"/>
+                <w:sz w:val="20"/>
+                <w:szCs w:val="20"/>
+              </w:rPr>
+              <w:t xml:space="preserve"/>
             </w:r>
           </w:p>
         </w:tc>
       </w:tr>
     </w:tbl>
-    <w:p>
-      <w:pPr>
-        <w:spacing w:after="100"/>
-        <w:jc w:val="center"/>
-      </w:pPr>
-      <w:r>
-        <w:rPr>
-          <w:rFonts w:ascii="Arial" w:cs="Arial" w:eastAsia="Arial" w:hAnsi="Arial"/>
-          <w:color w:val="AAAAAA"/>
-          <w:sz w:val="18"/>
-          <w:szCs w:val="18"/>
-        </w:rPr>
-        <w:t xml:space="preserve">✂ - - - - - - - - - - - - - - - - - - - - - - - - - - - - - - - - - - - - ✂</w:t>
-      </w:r>
-    </w:p>
     <w:tbl>
       <w:tblPr>
         <w:tblW w:type="pct" w:w="100%"/>
@@ -10694,7 +10870,7 @@
               <w:bottom w:val="single" w:color="1B3A5C" w:sz="2"/>
               <w:right w:val="single" w:color="1B3A5C" w:sz="2"/>
             </w:tcBorders>
-            <w:shd w:fill="FDE8E8" w:val="clear"/>
+            <w:shd w:fill="F5F5F5" w:val="clear"/>
             <w:tcMar>
               <w:top w:type="dxa" w:w="120"/>
               <w:left w:type="dxa" w:w="200"/>
@@ -10711,19 +10887,86 @@
                 <w:rFonts w:ascii="Arial" w:cs="Arial" w:eastAsia="Arial" w:hAnsi="Arial"/>
                 <w:b/>
                 <w:bCs/>
-                <w:color w:val="CC0000"/>
-                <w:sz w:val="22"/>
-                <w:szCs w:val="22"/>
-              </w:rPr>
-              <w:t xml:space="preserve">⚠️ CRISIS #5: Twitterstorm!</w:t>
-            </w:r>
-          </w:p>
-          <w:p>
-            <w:pPr>
-              <w:spacing w:after="120"/>
-            </w:pPr>
-            <w:r>
-              <w:t xml:space="preserve">De Informateur kiest een partij. Die partij heeft per ongeluk een extreem dom bericht op X geplaatst. De speler moet 30 seconden lang hun standpunt verdedigen terwijl ALLE anderen “BOE!” en “AFTREDEN!” roepen.</w:t>
+                <w:color w:val="1B3A5C"/>
+                <w:sz w:val="22"/>
+                <w:szCs w:val="22"/>
+              </w:rPr>
+              <w:t xml:space="preserve">🔒 GEHEIM — OMA (Tante Riet van de Rolstoel)
+🟢 MUST-HAVE: '"Pensioenleeftijd" of "ouderenzorg" staat in het coalitieakkoord
+🔴 DEALBREAKER: WIFI — te moderne technologie, te ingewikkeld, vroeger had je gewoon een vaste lijn
+🎯 GEHEIME BONUS: Woord "pensioen" staat in de TITEL van het coalitieakkoord (+3 punten)</w:t>
+            </w:r>
+          </w:p>
+          <w:p>
+            <w:pPr>
+              <w:spacing w:after="60"/>
+            </w:pPr>
+            <w:r>
+              <w:rPr>
+                <w:rFonts w:ascii="Arial" w:cs="Arial" w:eastAsia="Arial" w:hAnsi="Arial"/>
+                <w:b/>
+                <w:bCs/>
+                <w:color w:val="FF6B00"/>
+                <w:sz w:val="20"/>
+                <w:szCs w:val="20"/>
+              </w:rPr>
+              <w:t xml:space="preserve"/>
+            </w:r>
+            <w:r>
+              <w:rPr>
+                <w:rFonts w:ascii="Arial" w:cs="Arial" w:eastAsia="Arial" w:hAnsi="Arial"/>
+                <w:sz w:val="20"/>
+                <w:szCs w:val="20"/>
+              </w:rPr>
+              <w:t xml:space="preserve"/>
+            </w:r>
+          </w:p>
+          <w:p>
+            <w:pPr>
+              <w:spacing w:after="60"/>
+            </w:pPr>
+            <w:r>
+              <w:rPr>
+                <w:rFonts w:ascii="Arial" w:cs="Arial" w:eastAsia="Arial" w:hAnsi="Arial"/>
+                <w:b/>
+                <w:bCs/>
+                <w:color w:val="FF6B00"/>
+                <w:sz w:val="20"/>
+                <w:szCs w:val="20"/>
+              </w:rPr>
+              <w:t xml:space="preserve"/>
+            </w:r>
+            <w:r>
+              <w:rPr>
+                <w:rFonts w:ascii="Arial" w:cs="Arial" w:eastAsia="Arial" w:hAnsi="Arial"/>
+                <w:sz w:val="20"/>
+                <w:szCs w:val="20"/>
+              </w:rPr>
+              <w:t xml:space="preserve"/>
+            </w:r>
+          </w:p>
+          <w:p>
+            <w:pPr>
+              <w:spacing w:after="60"/>
+            </w:pPr>
+            <w:r>
+              <w:rPr>
+                <w:rFonts w:ascii="Arial" w:cs="Arial" w:eastAsia="Arial" w:hAnsi="Arial"/>
+                <w:b/>
+                <w:bCs/>
+                <w:color w:val="FF6B00"/>
+                <w:sz w:val="20"/>
+                <w:szCs w:val="20"/>
+              </w:rPr>
+              <w:t xml:space="preserve"/>
+            </w:r>
+            <w:r>
+              <w:rPr>
+                <w:rFonts w:ascii="Arial" w:cs="Arial" w:eastAsia="Arial" w:hAnsi="Arial"/>
+                <w:sz w:val="20"/>
+                <w:szCs w:val="20"/>
+              </w:rPr>
+              <w:t xml:space="preserve"/>
             </w:r>
           </w:p>
         </w:tc>
@@ -10743,6 +10986,37 @@
         </w:rPr>
         <w:t xml:space="preserve">✂ - - - - - - - - - - - - - - - - - - - - - - - - - - - - - - - - - - - - ✂</w:t>
       </w:r>
+    </w:p>
+    <w:p>
+      <w:r>
+        <w:br w:type="page"/>
+      </w:r>
+    </w:p>
+    <w:p>
+      <w:pPr>
+        <w:pStyle w:val="Heading1"/>
+      </w:pPr>
+      <w:r>
+        <w:t xml:space="preserve">Crisiskaarten — De Formatie</w:t>
+      </w:r>
+    </w:p>
+    <w:p>
+      <w:pPr>
+        <w:spacing w:after="120"/>
+      </w:pPr>
+      <w:r>
+        <w:rPr>
+          <w:i/>
+          <w:iCs/>
+          <w:color w:val="666666"/>
+        </w:rPr>
+        <w:t xml:space="preserve">Knip uit, leg omgedraaid op een stapel. Trek tussen de fasen door.</w:t>
+      </w:r>
+    </w:p>
+    <w:p>
+      <w:pPr>
+        <w:spacing w:after="80"/>
+      </w:pPr>
     </w:p>
     <w:tbl>
       <w:tblPr>
@@ -10790,7 +11064,7 @@
                 <w:sz w:val="22"/>
                 <w:szCs w:val="22"/>
               </w:rPr>
-              <w:t xml:space="preserve">⚠️ CRISIS #6: Dubbelagent!</w:t>
+              <w:t xml:space="preserve">⚠️ CRISIS #1: Geheim Overleg Uitgelekt!</w:t>
             </w:r>
           </w:p>
           <w:p>
@@ -10798,7 +11072,7 @@
               <w:spacing w:after="120"/>
             </w:pPr>
             <w:r>
-              <w:t xml:space="preserve">Eén partij (Informateur kiest) heeft stiekem met de oppositie gesproken! Die partij mag nu 2 minuten met IEDEREEN tegelijk onderhandelen — in het openbaar. Alle deals liggen op tafel.</w:t>
+              <w:t xml:space="preserve">De Informateur wijst twee partijen aan die stiekem samen gezien zijn in een achterkamertje. Zij moeten 2 minuten samen staan en hun ‘geheime plan’ verzinnen en aan de hele groep presenteren. De rest mag boe roepen.</w:t>
             </w:r>
           </w:p>
         </w:tc>
@@ -10865,7 +11139,7 @@
                 <w:sz w:val="22"/>
                 <w:szCs w:val="22"/>
               </w:rPr>
-              <w:t xml:space="preserve">⚠️ CRISIS #7: De Telegraaf Lekt!</w:t>
+              <w:t xml:space="preserve">⚠️ CRISIS #2: De Koning Belt!</w:t>
             </w:r>
           </w:p>
           <w:p>
@@ -10873,7 +11147,7 @@
               <w:spacing w:after="120"/>
             </w:pPr>
             <w:r>
-              <w:t xml:space="preserve">Alle lopende, geheime afspraken worden NU hardop voorgelezen! Elke partij die al een deal heeft gesloten moet deze onthullen. Daarna mag iedereen 2 minuten van partner wisselen.</w:t>
+              <w:t xml:space="preserve">De Koning wil ONMIDDELLIJK een voortgangsrapport! De partij met de meeste zetels moet binnen 30 seconden uitleggen hoe het gaat. Is het rapport onvoldoende (groep mag stemmen)? Die partij verliest 2 zetels.</w:t>
             </w:r>
           </w:p>
         </w:tc>
@@ -10940,7 +11214,7 @@
                 <w:sz w:val="22"/>
                 <w:szCs w:val="22"/>
               </w:rPr>
-              <w:t xml:space="preserve">⚠️ CRISIS #8: Motie Tegen de Informateur!</w:t>
+              <w:t xml:space="preserve">⚠️ CRISIS #3: Peiling Alert!</w:t>
             </w:r>
           </w:p>
           <w:p>
@@ -10948,7 +11222,7 @@
               <w:spacing w:after="120"/>
             </w:pPr>
             <w:r>
-              <w:t xml:space="preserve">Alle spelers stemmen (hand opsteken): bij meerderheid wordt de Informateur 5 minuten vervangen door de speler met de MINSTE zetels. Die is nu tijdelijk de baas.</w:t>
+              <w:t xml:space="preserve">Gooi een dobbelsteen: EVEN = de kleinste partij krijgt +3 zetels. ONEVEN = de grootste partij verliest -3 zetels. Pas de zetelverdeling aan!</w:t>
             </w:r>
           </w:p>
         </w:tc>
@@ -11015,7 +11289,7 @@
                 <w:sz w:val="22"/>
                 <w:szCs w:val="22"/>
               </w:rPr>
-              <w:t xml:space="preserve">⚠️ CRISIS #9: Koningshuis in Crisis!</w:t>
+              <w:t xml:space="preserve">⚠️ CRISIS #4: Schandaal in de Kantine!</w:t>
             </w:r>
           </w:p>
           <w:p>
@@ -11023,7 +11297,7 @@
               <w:spacing w:after="120"/>
             </w:pPr>
             <w:r>
-              <w:t xml:space="preserve">De Koning dreigt af te treden als er niet binnen 5 minuten een concrete doorbraak is! Alle partijen moeten NU in dezelfde ruimte blijven — niet apart overleggen. Onderhandel in het openbaar!</w:t>
+              <w:t xml:space="preserve">De Informateur wijst een willekeurige partij aan. Die partij is betrapt op het stelen van bitterballen uit de Tweede Kamerkantine! Straf: -2 zetels ÉN een excuus-speech van 30 seconden. Hoe dramatischer, hoe beter.</w:t>
             </w:r>
           </w:p>
         </w:tc>
@@ -11090,7 +11364,7 @@
                 <w:sz w:val="22"/>
                 <w:szCs w:val="22"/>
               </w:rPr>
-              <w:t xml:space="preserve">⚠️ CRISIS #10: Wildcard!</w:t>
+              <w:t xml:space="preserve">⚠️ CRISIS #5: Twitterstorm!</w:t>
             </w:r>
           </w:p>
           <w:p>
@@ -11098,7 +11372,7 @@
               <w:spacing w:after="120"/>
             </w:pPr>
             <w:r>
-              <w:t xml:space="preserve">De Informateur bedenkt TER PLEKKE een crisiskaart! Mag alles zijn, zolang het grappig en eerlijk is. Geen genade.</w:t>
+              <w:t xml:space="preserve">De Informateur kiest een partij. Die partij heeft per ongeluk een extreem dom bericht op X geplaatst. De speler moet 30 seconden lang hun standpunt verdedigen terwijl ALLE anderen “BOE!” en “AFTREDEN!” roepen.</w:t>
             </w:r>
           </w:p>
         </w:tc>
@@ -11118,37 +11392,6 @@
         </w:rPr>
         <w:t xml:space="preserve">✂ - - - - - - - - - - - - - - - - - - - - - - - - - - - - - - - - - - - - ✂</w:t>
       </w:r>
-    </w:p>
-    <w:p>
-      <w:r>
-        <w:br w:type="page"/>
-      </w:r>
-    </w:p>
-    <w:p>
-      <w:pPr>
-        <w:pStyle w:val="Heading1"/>
-      </w:pPr>
-      <w:r>
-        <w:t xml:space="preserve">Wetsvoorstellen — De Regeerperiode</w:t>
-      </w:r>
-    </w:p>
-    <w:p>
-      <w:pPr>
-        <w:spacing w:after="120"/>
-      </w:pPr>
-      <w:r>
-        <w:rPr>
-          <w:i/>
-          <w:iCs/>
-          <w:color w:val="666666"/>
-        </w:rPr>
-        <w:t xml:space="preserve">De Informateur leest deze voor in Ronde 3. De hint is alleen voor de Informateur!</w:t>
-      </w:r>
-    </w:p>
-    <w:p>
-      <w:pPr>
-        <w:spacing w:after="80"/>
-      </w:pPr>
     </w:p>
     <w:tbl>
       <w:tblPr>
@@ -11175,7 +11418,7 @@
               <w:bottom w:val="single" w:color="1B3A5C" w:sz="2"/>
               <w:right w:val="single" w:color="1B3A5C" w:sz="2"/>
             </w:tcBorders>
-            <w:shd w:fill="E8F0FE" w:val="clear"/>
+            <w:shd w:fill="FDE8E8" w:val="clear"/>
             <w:tcMar>
               <w:top w:type="dxa" w:w="120"/>
               <w:left w:type="dxa" w:w="200"/>
@@ -11192,11 +11435,11 @@
                 <w:rFonts w:ascii="Arial" w:cs="Arial" w:eastAsia="Arial" w:hAnsi="Arial"/>
                 <w:b/>
                 <w:bCs/>
-                <w:color w:val="1B3A5C"/>
-                <w:sz w:val="24"/>
-                <w:szCs w:val="24"/>
-              </w:rPr>
-              <w:t xml:space="preserve">WET #1: De Nationale Snackwet</w:t>
+                <w:color w:val="CC0000"/>
+                <w:sz w:val="22"/>
+                <w:szCs w:val="22"/>
+              </w:rPr>
+              <w:t xml:space="preserve">⚠️ CRISIS #6: Dubbelagent!</w:t>
             </w:r>
           </w:p>
           <w:p>
@@ -11204,39 +11447,7 @@
               <w:spacing w:after="120"/>
             </w:pPr>
             <w:r>
-              <w:t xml:space="preserve">BTW op alle traditionele Nederlandse snacks (bitterballen, frikandellen, kroketten, kaassoufflés) wordt verlaagd naar 0%.</w:t>
-            </w:r>
-          </w:p>
-          <w:p>
-            <w:pPr>
-              <w:spacing w:after="80"/>
-            </w:pPr>
-          </w:p>
-          <w:p>
-            <w:pPr>
-              <w:spacing w:after="40"/>
-            </w:pPr>
-            <w:r>
-              <w:rPr>
-                <w:rFonts w:ascii="Arial" w:cs="Arial" w:eastAsia="Arial" w:hAnsi="Arial"/>
-                <w:b/>
-                <w:bCs/>
-                <w:color w:val="888888"/>
-                <w:sz w:val="18"/>
-                <w:szCs w:val="18"/>
-              </w:rPr>
-              <w:t xml:space="preserve">👁️ HINT VOOR DE INFORMATEUR: </w:t>
-            </w:r>
-            <w:r>
-              <w:rPr>
-                <w:rFonts w:ascii="Arial" w:cs="Arial" w:eastAsia="Arial" w:hAnsi="Arial"/>
-                <w:i/>
-                <w:iCs/>
-                <w:color w:val="888888"/>
-                <w:sz w:val="18"/>
-                <w:szCs w:val="18"/>
-              </w:rPr>
-              <w:t xml:space="preserve">VBB/KKB/DDP waarschijnlijk vóór (snacks, kaas, minder belasting). PPP waarschijnlijk tegen (ongezond, dierlijk). FBL neutraal. FRR wil “verantwoord snackbeleid”.</w:t>
+              <w:t xml:space="preserve">Eén partij (Informateur kiest) heeft stiekem met de oppositie gesproken! Die partij mag nu 2 minuten met IEDEREEN tegelijk onderhandelen — in het openbaar. Alle deals liggen op tafel.</w:t>
             </w:r>
           </w:p>
         </w:tc>
@@ -11282,7 +11493,7 @@
               <w:bottom w:val="single" w:color="1B3A5C" w:sz="2"/>
               <w:right w:val="single" w:color="1B3A5C" w:sz="2"/>
             </w:tcBorders>
-            <w:shd w:fill="E8F0FE" w:val="clear"/>
+            <w:shd w:fill="FDE8E8" w:val="clear"/>
             <w:tcMar>
               <w:top w:type="dxa" w:w="120"/>
               <w:left w:type="dxa" w:w="200"/>
@@ -11299,11 +11510,11 @@
                 <w:rFonts w:ascii="Arial" w:cs="Arial" w:eastAsia="Arial" w:hAnsi="Arial"/>
                 <w:b/>
                 <w:bCs/>
-                <w:color w:val="1B3A5C"/>
-                <w:sz w:val="24"/>
-                <w:szCs w:val="24"/>
-              </w:rPr>
-              <w:t xml:space="preserve">WET #2: Wet Digitale Grondrechten</w:t>
+                <w:color w:val="CC0000"/>
+                <w:sz w:val="22"/>
+                <w:szCs w:val="22"/>
+              </w:rPr>
+              <w:t xml:space="preserve">⚠️ CRISIS #7: De Telegraaf Lekt!</w:t>
             </w:r>
           </w:p>
           <w:p>
@@ -11311,39 +11522,7 @@
               <w:spacing w:after="120"/>
             </w:pPr>
             <w:r>
-              <w:t xml:space="preserve">Gratis WiFi wordt als grondrecht opgenomen in de Grondwet. Elke Nederlander heeft recht op een basisniveau van gratis internet.</w:t>
-            </w:r>
-          </w:p>
-          <w:p>
-            <w:pPr>
-              <w:spacing w:after="80"/>
-            </w:pPr>
-          </w:p>
-          <w:p>
-            <w:pPr>
-              <w:spacing w:after="40"/>
-            </w:pPr>
-            <w:r>
-              <w:rPr>
-                <w:rFonts w:ascii="Arial" w:cs="Arial" w:eastAsia="Arial" w:hAnsi="Arial"/>
-                <w:b/>
-                <w:bCs/>
-                <w:color w:val="888888"/>
-                <w:sz w:val="18"/>
-                <w:szCs w:val="18"/>
-              </w:rPr>
-              <w:t xml:space="preserve">👁️ HINT VOOR DE INFORMATEUR: </w:t>
-            </w:r>
-            <w:r>
-              <w:rPr>
-                <w:rFonts w:ascii="Arial" w:cs="Arial" w:eastAsia="Arial" w:hAnsi="Arial"/>
-                <w:i/>
-                <w:iCs/>
-                <w:color w:val="888888"/>
-                <w:sz w:val="18"/>
-                <w:szCs w:val="18"/>
-              </w:rPr>
-              <w:t xml:space="preserve">WIFI/DDP/KCV waarschijnlijk vóór (innovatie, groei, toegang). FRR waarschijnlijk tegen (meer schermtijd). PAN misschien vóór (gratis spul). PTNT-types huiverig.</w:t>
+              <w:t xml:space="preserve">Alle lopende, geheime afspraken worden NU hardop voorgelezen! Elke partij die al een deal heeft gesloten moet deze onthullen. Daarna mag iedereen 2 minuten van partner wisselen.</w:t>
             </w:r>
           </w:p>
         </w:tc>
@@ -11389,7 +11568,7 @@
               <w:bottom w:val="single" w:color="1B3A5C" w:sz="2"/>
               <w:right w:val="single" w:color="1B3A5C" w:sz="2"/>
             </w:tcBorders>
-            <w:shd w:fill="E8F0FE" w:val="clear"/>
+            <w:shd w:fill="FDE8E8" w:val="clear"/>
             <w:tcMar>
               <w:top w:type="dxa" w:w="120"/>
               <w:left w:type="dxa" w:w="200"/>
@@ -11406,11 +11585,11 @@
                 <w:rFonts w:ascii="Arial" w:cs="Arial" w:eastAsia="Arial" w:hAnsi="Arial"/>
                 <w:b/>
                 <w:bCs/>
-                <w:color w:val="1B3A5C"/>
-                <w:sz w:val="24"/>
-                <w:szCs w:val="24"/>
-              </w:rPr>
-              <w:t xml:space="preserve">WET #3: De Nationale Siësta Act</w:t>
+                <w:color w:val="CC0000"/>
+                <w:sz w:val="22"/>
+                <w:szCs w:val="22"/>
+              </w:rPr>
+              <w:t xml:space="preserve">⚠️ CRISIS #8: Motie Tegen de Informateur!</w:t>
             </w:r>
           </w:p>
           <w:p>
@@ -11418,39 +11597,7 @@
               <w:spacing w:after="120"/>
             </w:pPr>
             <w:r>
-              <w:t xml:space="preserve">Verplichte middagpauze van 14:00 tot 15:30 voor alle werknemers. Werkgevers die bellen of mailen tijdens de siësta worden beboet.</w:t>
-            </w:r>
-          </w:p>
-          <w:p>
-            <w:pPr>
-              <w:spacing w:after="80"/>
-            </w:pPr>
-          </w:p>
-          <w:p>
-            <w:pPr>
-              <w:spacing w:after="40"/>
-            </w:pPr>
-            <w:r>
-              <w:rPr>
-                <w:rFonts w:ascii="Arial" w:cs="Arial" w:eastAsia="Arial" w:hAnsi="Arial"/>
-                <w:b/>
-                <w:bCs/>
-                <w:color w:val="888888"/>
-                <w:sz w:val="18"/>
-                <w:szCs w:val="18"/>
-              </w:rPr>
-              <w:t xml:space="preserve">👁️ HINT VOOR DE INFORMATEUR: </w:t>
-            </w:r>
-            <w:r>
-              <w:rPr>
-                <w:rFonts w:ascii="Arial" w:cs="Arial" w:eastAsia="Arial" w:hAnsi="Arial"/>
-                <w:i/>
-                <w:iCs/>
-                <w:color w:val="888888"/>
-                <w:sz w:val="18"/>
-                <w:szCs w:val="18"/>
-              </w:rPr>
-              <w:t xml:space="preserve">FBL/VBB vóór (rust en borrel!). DDP/FRR sterk tegen (productiviteit/orde). PPP vóór (minder produceren). PAN: “Afschaffen van de middag!”</w:t>
+              <w:t xml:space="preserve">Alle spelers stemmen (hand opsteken): bij meerderheid wordt de Informateur 5 minuten vervangen door de speler met de MINSTE zetels. Die is nu tijdelijk de baas.</w:t>
             </w:r>
           </w:p>
         </w:tc>
@@ -11496,7 +11643,7 @@
               <w:bottom w:val="single" w:color="1B3A5C" w:sz="2"/>
               <w:right w:val="single" w:color="1B3A5C" w:sz="2"/>
             </w:tcBorders>
-            <w:shd w:fill="E8F0FE" w:val="clear"/>
+            <w:shd w:fill="FDE8E8" w:val="clear"/>
             <w:tcMar>
               <w:top w:type="dxa" w:w="120"/>
               <w:left w:type="dxa" w:w="200"/>
@@ -11513,11 +11660,11 @@
                 <w:rFonts w:ascii="Arial" w:cs="Arial" w:eastAsia="Arial" w:hAnsi="Arial"/>
                 <w:b/>
                 <w:bCs/>
-                <w:color w:val="1B3A5C"/>
-                <w:sz w:val="24"/>
-                <w:szCs w:val="24"/>
-              </w:rPr>
-              <w:t xml:space="preserve">WET #4: De Groene Woensdag</w:t>
+                <w:color w:val="CC0000"/>
+                <w:sz w:val="22"/>
+                <w:szCs w:val="22"/>
+              </w:rPr>
+              <w:t xml:space="preserve">⚠️ CRISIS #9: Koningshuis in Crisis!</w:t>
             </w:r>
           </w:p>
           <w:p>
@@ -11525,39 +11672,7 @@
               <w:spacing w:after="120"/>
             </w:pPr>
             <w:r>
-              <w:t xml:space="preserve">Elke woensdag wordt autovrij in heel Nederland. Alle niet-essentiële winkels zijn dicht. Iedereen besteedt de dag aan natuur en gemeenschap.</w:t>
-            </w:r>
-          </w:p>
-          <w:p>
-            <w:pPr>
-              <w:spacing w:after="80"/>
-            </w:pPr>
-          </w:p>
-          <w:p>
-            <w:pPr>
-              <w:spacing w:after="40"/>
-            </w:pPr>
-            <w:r>
-              <w:rPr>
-                <w:rFonts w:ascii="Arial" w:cs="Arial" w:eastAsia="Arial" w:hAnsi="Arial"/>
-                <w:b/>
-                <w:bCs/>
-                <w:color w:val="888888"/>
-                <w:sz w:val="18"/>
-                <w:szCs w:val="18"/>
-              </w:rPr>
-              <w:t xml:space="preserve">👁️ HINT VOOR DE INFORMATEUR: </w:t>
-            </w:r>
-            <w:r>
-              <w:rPr>
-                <w:rFonts w:ascii="Arial" w:cs="Arial" w:eastAsia="Arial" w:hAnsi="Arial"/>
-                <w:i/>
-                <w:iCs/>
-                <w:color w:val="888888"/>
-                <w:sz w:val="18"/>
-                <w:szCs w:val="18"/>
-              </w:rPr>
-              <w:t xml:space="preserve">PPP sterk vóór, FBL vóór (vrije dag!). DDP/VBB sterk tegen (economie, horeca dicht!). KKB: “Kaasmarkten dan ook dicht?!” FRR: structuur is fijn, sluiting niet.</w:t>
+              <w:t xml:space="preserve">De Koning dreigt af te treden als er niet binnen 5 minuten een concrete doorbraak is! Alle partijen moeten NU in dezelfde ruimte blijven — niet apart overleggen. Onderhandel in het openbaar!</w:t>
             </w:r>
           </w:p>
         </w:tc>
@@ -11603,7 +11718,7 @@
               <w:bottom w:val="single" w:color="1B3A5C" w:sz="2"/>
               <w:right w:val="single" w:color="1B3A5C" w:sz="2"/>
             </w:tcBorders>
-            <w:shd w:fill="E8F0FE" w:val="clear"/>
+            <w:shd w:fill="FDE8E8" w:val="clear"/>
             <w:tcMar>
               <w:top w:type="dxa" w:w="120"/>
               <w:left w:type="dxa" w:w="200"/>
@@ -11620,11 +11735,11 @@
                 <w:rFonts w:ascii="Arial" w:cs="Arial" w:eastAsia="Arial" w:hAnsi="Arial"/>
                 <w:b/>
                 <w:bCs/>
-                <w:color w:val="1B3A5C"/>
-                <w:sz w:val="24"/>
-                <w:szCs w:val="24"/>
-              </w:rPr>
-              <w:t xml:space="preserve">WET #5: Kaas als Strategische Reserve</w:t>
+                <w:color w:val="CC0000"/>
+                <w:sz w:val="22"/>
+                <w:szCs w:val="22"/>
+              </w:rPr>
+              <w:t xml:space="preserve">⚠️ CRISIS #10: Wildcard!</w:t>
             </w:r>
           </w:p>
           <w:p>
@@ -11632,39 +11747,7 @@
               <w:spacing w:after="120"/>
             </w:pPr>
             <w:r>
-              <w:t xml:space="preserve">Nederland legt een nationale kaasvoorraad aan van 10 miljoen kilo, vergelijkbaar met de strategische oliereserve. Te financieren uit een kleine heffing op zuivelimport.</w:t>
-            </w:r>
-          </w:p>
-          <w:p>
-            <w:pPr>
-              <w:spacing w:after="80"/>
-            </w:pPr>
-          </w:p>
-          <w:p>
-            <w:pPr>
-              <w:spacing w:after="40"/>
-            </w:pPr>
-            <w:r>
-              <w:rPr>
-                <w:rFonts w:ascii="Arial" w:cs="Arial" w:eastAsia="Arial" w:hAnsi="Arial"/>
-                <w:b/>
-                <w:bCs/>
-                <w:color w:val="888888"/>
-                <w:sz w:val="18"/>
-                <w:szCs w:val="18"/>
-              </w:rPr>
-              <w:t xml:space="preserve">👁️ HINT VOOR DE INFORMATEUR: </w:t>
-            </w:r>
-            <w:r>
-              <w:rPr>
-                <w:rFonts w:ascii="Arial" w:cs="Arial" w:eastAsia="Arial" w:hAnsi="Arial"/>
-                <w:i/>
-                <w:iCs/>
-                <w:color w:val="888888"/>
-                <w:sz w:val="18"/>
-                <w:szCs w:val="18"/>
-              </w:rPr>
-              <w:t xml:space="preserve">KKB in tranen van geluk. VBB vóór (Nederlands product). DDP ziet investering. PPP sterk tegen (zuivelindustrie). PAN: “belachelijk... maar eigenlijk wel grappig.”</w:t>
+              <w:t xml:space="preserve">De Informateur bedenkt TER PLEKKE een crisiskaart! Mag alles zijn, zolang het grappig en eerlijk is. Geen genade.</w:t>
             </w:r>
           </w:p>
         </w:tc>
@@ -11684,6 +11767,37 @@
         </w:rPr>
         <w:t xml:space="preserve">✂ - - - - - - - - - - - - - - - - - - - - - - - - - - - - - - - - - - - - ✂</w:t>
       </w:r>
+    </w:p>
+    <w:p>
+      <w:r>
+        <w:br w:type="page"/>
+      </w:r>
+    </w:p>
+    <w:p>
+      <w:pPr>
+        <w:pStyle w:val="Heading1"/>
+      </w:pPr>
+      <w:r>
+        <w:t xml:space="preserve">Wetsvoorstellen — De Regeerperiode</w:t>
+      </w:r>
+    </w:p>
+    <w:p>
+      <w:pPr>
+        <w:spacing w:after="120"/>
+      </w:pPr>
+      <w:r>
+        <w:rPr>
+          <w:i/>
+          <w:iCs/>
+          <w:color w:val="666666"/>
+        </w:rPr>
+        <w:t xml:space="preserve">De Informateur leest deze voor in Ronde 3. De hint is alleen voor de Informateur!</w:t>
+      </w:r>
+    </w:p>
+    <w:p>
+      <w:pPr>
+        <w:spacing w:after="80"/>
+      </w:pPr>
     </w:p>
     <w:tbl>
       <w:tblPr>
@@ -11731,7 +11845,7 @@
                 <w:sz w:val="24"/>
                 <w:szCs w:val="24"/>
               </w:rPr>
-              <w:t xml:space="preserve">WET #6: De Grote Cultuurwet</w:t>
+              <w:t xml:space="preserve">WET #1: De Nationale Snackwet</w:t>
             </w:r>
           </w:p>
           <w:p>
@@ -11739,7 +11853,7 @@
               <w:spacing w:after="120"/>
             </w:pPr>
             <w:r>
-              <w:t xml:space="preserve">De cultuurbegroting wordt verdubbeld. Daarnaast wordt een verplicht kunstvak ingevoerd voor alle volwassenen: 20 uur per jaar.</w:t>
+              <w:t xml:space="preserve">BTW op alle traditionele Nederlandse snacks (bitterballen, frikandellen, kroketten, kaassoufflés) wordt verlaagd naar 0%.</w:t>
             </w:r>
           </w:p>
           <w:p>
@@ -11771,7 +11885,7 @@
                 <w:sz w:val="18"/>
                 <w:szCs w:val="18"/>
               </w:rPr>
-              <w:t xml:space="preserve">KCV extatisch. FBL vóór (subsidies!). DDP sterk tegen (kosten). FRR deels vóór (discipline) maar tegen (nutteloos). VBB: “Mag het kookkunst zijn?”</w:t>
+              <w:t xml:space="preserve">VBB/KKB/DDP waarschijnlijk vóór (snacks, kaas, minder belasting). PPP waarschijnlijk tegen (ongezond, dierlijk). FBL neutraal. FRR wil “verantwoord snackbeleid”.</w:t>
             </w:r>
           </w:p>
         </w:tc>
@@ -11838,7 +11952,7 @@
                 <w:sz w:val="24"/>
                 <w:szCs w:val="24"/>
               </w:rPr>
-              <w:t xml:space="preserve">WET #7: Wet Afschaffing Eigen Risico</w:t>
+              <w:t xml:space="preserve">WET #2: Wet Digitale Grondrechten</w:t>
             </w:r>
           </w:p>
           <w:p>
@@ -11846,7 +11960,7 @@
               <w:spacing w:after="120"/>
             </w:pPr>
             <w:r>
-              <w:t xml:space="preserve">Het eigen risico in de zorg wordt volledig afgeschaft. Kosten worden gedekt door een verhoging van de inkomensbelasting met 1,5%.</w:t>
+              <w:t xml:space="preserve">Gratis WiFi wordt als grondrecht opgenomen in de Grondwet. Elke Nederlander heeft recht op een basisniveau van gratis internet.</w:t>
             </w:r>
           </w:p>
           <w:p>
@@ -11878,7 +11992,7 @@
                 <w:sz w:val="18"/>
                 <w:szCs w:val="18"/>
               </w:rPr>
-              <w:t xml:space="preserve">PPP/FBL/KCV/PAN vóór (sociaal, en PAN wil sowieso iets afschaffen). DDP sterk tegen (kosten). FRR: “Eigen verantwoordelijkheid!” DAM: “Misschien halveren?”</w:t>
+              <w:t xml:space="preserve">WIFI/DDP/KCV waarschijnlijk vóór (innovatie, groei, toegang). FRR waarschijnlijk tegen (meer schermtijd). PAN misschien vóór (gratis spul). PTNT-types huiverig.</w:t>
             </w:r>
           </w:p>
         </w:tc>
@@ -11945,7 +12059,7 @@
                 <w:sz w:val="24"/>
                 <w:szCs w:val="24"/>
               </w:rPr>
-              <w:t xml:space="preserve">WET #8: De Nationale Efficiëntiewet</w:t>
+              <w:t xml:space="preserve">WET #3: De Nationale Siësta Act</w:t>
             </w:r>
           </w:p>
           <w:p>
@@ -11953,7 +12067,7 @@
               <w:spacing w:after="120"/>
             </w:pPr>
             <w:r>
-              <w:t xml:space="preserve">Alle overheidsvergaderingen mogen maximaal 30 minuten duren. Alle formulieren en communicatie worden uitsluitend digitaal.</w:t>
+              <w:t xml:space="preserve">Verplichte middagpauze van 14:00 tot 15:30 voor alle werknemers. Werkgevers die bellen of mailen tijdens de siësta worden beboet.</w:t>
             </w:r>
           </w:p>
           <w:p>
@@ -11985,7 +12099,7 @@
                 <w:sz w:val="18"/>
                 <w:szCs w:val="18"/>
               </w:rPr>
-              <w:t xml:space="preserve">WIFI/DDP vóór. FRR deels (efficiënt = goed, digitaal = eng). DAM sterk tegen (“Werkgroepen hebben TIJD nodig!”). PAN vóór (minder overheid). KCV: “En de culturele impact?”</w:t>
+              <w:t xml:space="preserve">FBL/VBB vóór (rust en borrel!). DDP/FRR sterk tegen (productiviteit/orde). PPP vóór (minder produceren). PAN: “Afschaffen van de middag!”</w:t>
             </w:r>
           </w:p>
         </w:tc>
@@ -12005,37 +12119,6 @@
         </w:rPr>
         <w:t xml:space="preserve">✂ - - - - - - - - - - - - - - - - - - - - - - - - - - - - - - - - - - - - ✂</w:t>
       </w:r>
-    </w:p>
-    <w:p>
-      <w:r>
-        <w:br w:type="page"/>
-      </w:r>
-    </w:p>
-    <w:p>
-      <w:pPr>
-        <w:pStyle w:val="Heading1"/>
-      </w:pPr>
-      <w:r>
-        <w:t xml:space="preserve">Kabinetscrisis — Ronde 4</w:t>
-      </w:r>
-    </w:p>
-    <w:p>
-      <w:pPr>
-        <w:spacing w:after="120"/>
-      </w:pPr>
-      <w:r>
-        <w:rPr>
-          <w:i/>
-          <w:iCs/>
-          <w:color w:val="666666"/>
-        </w:rPr>
-        <w:t xml:space="preserve">Lees deze in volgorde voor. Ze worden steeds heftiger!</w:t>
-      </w:r>
-    </w:p>
-    <w:p>
-      <w:pPr>
-        <w:spacing w:after="80"/>
-      </w:pPr>
     </w:p>
     <w:tbl>
       <w:tblPr>
@@ -12062,7 +12145,7 @@
               <w:bottom w:val="single" w:color="1B3A5C" w:sz="2"/>
               <w:right w:val="single" w:color="1B3A5C" w:sz="2"/>
             </w:tcBorders>
-            <w:shd w:fill="FFF9E0" w:val="clear"/>
+            <w:shd w:fill="E8F0FE" w:val="clear"/>
             <w:tcMar>
               <w:top w:type="dxa" w:w="120"/>
               <w:left w:type="dxa" w:w="200"/>
@@ -12072,6 +12155,35 @@
           </w:tcPr>
           <w:p>
             <w:pPr>
+              <w:spacing w:after="60"/>
+            </w:pPr>
+            <w:r>
+              <w:rPr>
+                <w:rFonts w:ascii="Arial" w:cs="Arial" w:eastAsia="Arial" w:hAnsi="Arial"/>
+                <w:b/>
+                <w:bCs/>
+                <w:color w:val="1B3A5C"/>
+                <w:sz w:val="24"/>
+                <w:szCs w:val="24"/>
+              </w:rPr>
+              <w:t xml:space="preserve">WET #4: De Groene Woensdag</w:t>
+            </w:r>
+          </w:p>
+          <w:p>
+            <w:pPr>
+              <w:spacing w:after="120"/>
+            </w:pPr>
+            <w:r>
+              <w:t xml:space="preserve">Elke woensdag wordt autovrij in heel Nederland. Alle niet-essentiële winkels zijn dicht. Iedereen besteedt de dag aan natuur en gemeenschap.</w:t>
+            </w:r>
+          </w:p>
+          <w:p>
+            <w:pPr>
+              <w:spacing w:after="80"/>
+            </w:pPr>
+          </w:p>
+          <w:p>
+            <w:pPr>
               <w:spacing w:after="40"/>
             </w:pPr>
             <w:r>
@@ -12080,45 +12192,21 @@
                 <w:b/>
                 <w:bCs/>
                 <w:color w:val="888888"/>
-                <w:sz w:val="20"/>
-                <w:szCs w:val="20"/>
-              </w:rPr>
-              <w:t xml:space="preserve">CRISIS 1/6</w:t>
-            </w:r>
-            <w:r>
-              <w:rPr>
-                <w:rFonts w:ascii="Arial" w:cs="Arial" w:eastAsia="Arial" w:hAnsi="Arial"/>
-                <w:b/>
-                <w:bCs/>
+                <w:sz w:val="18"/>
+                <w:szCs w:val="18"/>
+              </w:rPr>
+              <w:t xml:space="preserve">👁️ HINT VOOR DE INFORMATEUR: </w:t>
+            </w:r>
+            <w:r>
+              <w:rPr>
+                <w:rFonts w:ascii="Arial" w:cs="Arial" w:eastAsia="Arial" w:hAnsi="Arial"/>
+                <w:i/>
+                <w:iCs/>
                 <w:color w:val="888888"/>
-                <w:sz w:val="20"/>
-                <w:szCs w:val="20"/>
-              </w:rPr>
-              <w:t xml:space="preserve">  [MILD]</w:t>
-            </w:r>
-          </w:p>
-          <w:p>
-            <w:pPr>
-              <w:spacing w:after="60"/>
-            </w:pPr>
-            <w:r>
-              <w:rPr>
-                <w:rFonts w:ascii="Arial" w:cs="Arial" w:eastAsia="Arial" w:hAnsi="Arial"/>
-                <w:b/>
-                <w:bCs/>
-                <w:color w:val="1B3A5C"/>
-                <w:sz w:val="26"/>
-                <w:szCs w:val="26"/>
-              </w:rPr>
-              <w:t xml:space="preserve">De Bonnetjesaffaire</w:t>
-            </w:r>
-          </w:p>
-          <w:p>
-            <w:pPr>
-              <w:spacing w:after="120"/>
-            </w:pPr>
-            <w:r>
-              <w:t xml:space="preserve">De Minister van Financiën heeft voor €47.000 aan bitterballen gedeclareerd op de staatsrekening. “Het was een werkdiner,” verklaart hij. “Alle 47 avonden.”</w:t>
+                <w:sz w:val="18"/>
+                <w:szCs w:val="18"/>
+              </w:rPr>
+              <w:t xml:space="preserve">PPP sterk vóór, FBL vóór (vrije dag!). DDP/VBB sterk tegen (economie, horeca dicht!). KKB: “Kaasmarkten dan ook dicht?!” FRR: structuur is fijn, sluiting niet.</w:t>
             </w:r>
           </w:p>
         </w:tc>
@@ -12164,7 +12252,7 @@
               <w:bottom w:val="single" w:color="1B3A5C" w:sz="2"/>
               <w:right w:val="single" w:color="1B3A5C" w:sz="2"/>
             </w:tcBorders>
-            <w:shd w:fill="FFF3E8" w:val="clear"/>
+            <w:shd w:fill="E8F0FE" w:val="clear"/>
             <w:tcMar>
               <w:top w:type="dxa" w:w="120"/>
               <w:left w:type="dxa" w:w="200"/>
@@ -12174,6 +12262,35 @@
           </w:tcPr>
           <w:p>
             <w:pPr>
+              <w:spacing w:after="60"/>
+            </w:pPr>
+            <w:r>
+              <w:rPr>
+                <w:rFonts w:ascii="Arial" w:cs="Arial" w:eastAsia="Arial" w:hAnsi="Arial"/>
+                <w:b/>
+                <w:bCs/>
+                <w:color w:val="1B3A5C"/>
+                <w:sz w:val="24"/>
+                <w:szCs w:val="24"/>
+              </w:rPr>
+              <w:t xml:space="preserve">WET #5: Kaas als Strategische Reserve</w:t>
+            </w:r>
+          </w:p>
+          <w:p>
+            <w:pPr>
+              <w:spacing w:after="120"/>
+            </w:pPr>
+            <w:r>
+              <w:t xml:space="preserve">Nederland legt een nationale kaasvoorraad aan van 10 miljoen kilo, vergelijkbaar met de strategische oliereserve. Te financieren uit een kleine heffing op zuivelimport.</w:t>
+            </w:r>
+          </w:p>
+          <w:p>
+            <w:pPr>
+              <w:spacing w:after="80"/>
+            </w:pPr>
+          </w:p>
+          <w:p>
+            <w:pPr>
               <w:spacing w:after="40"/>
             </w:pPr>
             <w:r>
@@ -12182,45 +12299,21 @@
                 <w:b/>
                 <w:bCs/>
                 <w:color w:val="888888"/>
-                <w:sz w:val="20"/>
-                <w:szCs w:val="20"/>
-              </w:rPr>
-              <w:t xml:space="preserve">CRISIS 2/6</w:t>
-            </w:r>
-            <w:r>
-              <w:rPr>
-                <w:rFonts w:ascii="Arial" w:cs="Arial" w:eastAsia="Arial" w:hAnsi="Arial"/>
-                <w:b/>
-                <w:bCs/>
+                <w:sz w:val="18"/>
+                <w:szCs w:val="18"/>
+              </w:rPr>
+              <w:t xml:space="preserve">👁️ HINT VOOR DE INFORMATEUR: </w:t>
+            </w:r>
+            <w:r>
+              <w:rPr>
+                <w:rFonts w:ascii="Arial" w:cs="Arial" w:eastAsia="Arial" w:hAnsi="Arial"/>
+                <w:i/>
+                <w:iCs/>
                 <w:color w:val="888888"/>
-                <w:sz w:val="20"/>
-                <w:szCs w:val="20"/>
-              </w:rPr>
-              <w:t xml:space="preserve">  [MEDIUM]</w:t>
-            </w:r>
-          </w:p>
-          <w:p>
-            <w:pPr>
-              <w:spacing w:after="60"/>
-            </w:pPr>
-            <w:r>
-              <w:rPr>
-                <w:rFonts w:ascii="Arial" w:cs="Arial" w:eastAsia="Arial" w:hAnsi="Arial"/>
-                <w:b/>
-                <w:bCs/>
-                <w:color w:val="1B3A5C"/>
-                <w:sz w:val="26"/>
-                <w:szCs w:val="26"/>
-              </w:rPr>
-              <w:t xml:space="preserve">Het Appjes-lek</w:t>
-            </w:r>
-          </w:p>
-          <w:p>
-            <w:pPr>
-              <w:spacing w:after="120"/>
-            </w:pPr>
-            <w:r>
-              <w:t xml:space="preserve">Een journalist publiceert appjes van de Minister-President. Daarin noemt de MP de oppositie “een stel circusclowns zonder tent” en de eigen coalitiepartners “noodzakelijk kwaad.”</w:t>
+                <w:sz w:val="18"/>
+                <w:szCs w:val="18"/>
+              </w:rPr>
+              <w:t xml:space="preserve">KKB in tranen van geluk. VBB vóór (Nederlands product). DDP ziet investering. PPP sterk tegen (zuivelindustrie). PAN: “belachelijk... maar eigenlijk wel grappig.”</w:t>
             </w:r>
           </w:p>
         </w:tc>
@@ -12266,7 +12359,7 @@
               <w:bottom w:val="single" w:color="1B3A5C" w:sz="2"/>
               <w:right w:val="single" w:color="1B3A5C" w:sz="2"/>
             </w:tcBorders>
-            <w:shd w:fill="FFF3E8" w:val="clear"/>
+            <w:shd w:fill="E8F0FE" w:val="clear"/>
             <w:tcMar>
               <w:top w:type="dxa" w:w="120"/>
               <w:left w:type="dxa" w:w="200"/>
@@ -12276,6 +12369,35 @@
           </w:tcPr>
           <w:p>
             <w:pPr>
+              <w:spacing w:after="60"/>
+            </w:pPr>
+            <w:r>
+              <w:rPr>
+                <w:rFonts w:ascii="Arial" w:cs="Arial" w:eastAsia="Arial" w:hAnsi="Arial"/>
+                <w:b/>
+                <w:bCs/>
+                <w:color w:val="1B3A5C"/>
+                <w:sz w:val="24"/>
+                <w:szCs w:val="24"/>
+              </w:rPr>
+              <w:t xml:space="preserve">WET #6: De Grote Cultuurwet</w:t>
+            </w:r>
+          </w:p>
+          <w:p>
+            <w:pPr>
+              <w:spacing w:after="120"/>
+            </w:pPr>
+            <w:r>
+              <w:t xml:space="preserve">De cultuurbegroting wordt verdubbeld. Daarnaast wordt een verplicht kunstvak ingevoerd voor alle volwassenen: 20 uur per jaar.</w:t>
+            </w:r>
+          </w:p>
+          <w:p>
+            <w:pPr>
+              <w:spacing w:after="80"/>
+            </w:pPr>
+          </w:p>
+          <w:p>
+            <w:pPr>
               <w:spacing w:after="40"/>
             </w:pPr>
             <w:r>
@@ -12284,45 +12406,21 @@
                 <w:b/>
                 <w:bCs/>
                 <w:color w:val="888888"/>
-                <w:sz w:val="20"/>
-                <w:szCs w:val="20"/>
-              </w:rPr>
-              <w:t xml:space="preserve">CRISIS 3/6</w:t>
-            </w:r>
-            <w:r>
-              <w:rPr>
-                <w:rFonts w:ascii="Arial" w:cs="Arial" w:eastAsia="Arial" w:hAnsi="Arial"/>
-                <w:b/>
-                <w:bCs/>
+                <w:sz w:val="18"/>
+                <w:szCs w:val="18"/>
+              </w:rPr>
+              <w:t xml:space="preserve">👁️ HINT VOOR DE INFORMATEUR: </w:t>
+            </w:r>
+            <w:r>
+              <w:rPr>
+                <w:rFonts w:ascii="Arial" w:cs="Arial" w:eastAsia="Arial" w:hAnsi="Arial"/>
+                <w:i/>
+                <w:iCs/>
                 <w:color w:val="888888"/>
-                <w:sz w:val="20"/>
-                <w:szCs w:val="20"/>
-              </w:rPr>
-              <w:t xml:space="preserve">  [MEDIUM]</w:t>
-            </w:r>
-          </w:p>
-          <w:p>
-            <w:pPr>
-              <w:spacing w:after="60"/>
-            </w:pPr>
-            <w:r>
-              <w:rPr>
-                <w:rFonts w:ascii="Arial" w:cs="Arial" w:eastAsia="Arial" w:hAnsi="Arial"/>
-                <w:b/>
-                <w:bCs/>
-                <w:color w:val="1B3A5C"/>
-                <w:sz w:val="26"/>
-                <w:szCs w:val="26"/>
-              </w:rPr>
-              <w:t xml:space="preserve">Het Begrotingsgat</w:t>
-            </w:r>
-          </w:p>
-          <w:p>
-            <w:pPr>
-              <w:spacing w:after="120"/>
-            </w:pPr>
-            <w:r>
-              <w:t xml:space="preserve">Het CPB rekent het coalitieakkoord door: er mist 6 miljard euro. Iemand heeft de komma verkeerd gezet. De hele begroting klopt van geen kant. De pers gaat los.</w:t>
+                <w:sz w:val="18"/>
+                <w:szCs w:val="18"/>
+              </w:rPr>
+              <w:t xml:space="preserve">KCV extatisch. FBL vóór (subsidies!). DDP sterk tegen (kosten). FRR deels vóór (discipline) maar tegen (nutteloos). VBB: “Mag het kookkunst zijn?”</w:t>
             </w:r>
           </w:p>
         </w:tc>
@@ -12368,7 +12466,7 @@
               <w:bottom w:val="single" w:color="1B3A5C" w:sz="2"/>
               <w:right w:val="single" w:color="1B3A5C" w:sz="2"/>
             </w:tcBorders>
-            <w:shd w:fill="FDE8E8" w:val="clear"/>
+            <w:shd w:fill="E8F0FE" w:val="clear"/>
             <w:tcMar>
               <w:top w:type="dxa" w:w="120"/>
               <w:left w:type="dxa" w:w="200"/>
@@ -12378,6 +12476,35 @@
           </w:tcPr>
           <w:p>
             <w:pPr>
+              <w:spacing w:after="60"/>
+            </w:pPr>
+            <w:r>
+              <w:rPr>
+                <w:rFonts w:ascii="Arial" w:cs="Arial" w:eastAsia="Arial" w:hAnsi="Arial"/>
+                <w:b/>
+                <w:bCs/>
+                <w:color w:val="1B3A5C"/>
+                <w:sz w:val="24"/>
+                <w:szCs w:val="24"/>
+              </w:rPr>
+              <w:t xml:space="preserve">WET #7: Wet Afschaffing Eigen Risico</w:t>
+            </w:r>
+          </w:p>
+          <w:p>
+            <w:pPr>
+              <w:spacing w:after="120"/>
+            </w:pPr>
+            <w:r>
+              <w:t xml:space="preserve">Het eigen risico in de zorg wordt volledig afgeschaft. Kosten worden gedekt door een verhoging van de inkomensbelasting met 1,5%.</w:t>
+            </w:r>
+          </w:p>
+          <w:p>
+            <w:pPr>
+              <w:spacing w:after="80"/>
+            </w:pPr>
+          </w:p>
+          <w:p>
+            <w:pPr>
               <w:spacing w:after="40"/>
             </w:pPr>
             <w:r>
@@ -12386,45 +12513,21 @@
                 <w:b/>
                 <w:bCs/>
                 <w:color w:val="888888"/>
-                <w:sz w:val="20"/>
-                <w:szCs w:val="20"/>
-              </w:rPr>
-              <w:t xml:space="preserve">CRISIS 4/6</w:t>
-            </w:r>
-            <w:r>
-              <w:rPr>
-                <w:rFonts w:ascii="Arial" w:cs="Arial" w:eastAsia="Arial" w:hAnsi="Arial"/>
-                <w:b/>
-                <w:bCs/>
+                <w:sz w:val="18"/>
+                <w:szCs w:val="18"/>
+              </w:rPr>
+              <w:t xml:space="preserve">👁️ HINT VOOR DE INFORMATEUR: </w:t>
+            </w:r>
+            <w:r>
+              <w:rPr>
+                <w:rFonts w:ascii="Arial" w:cs="Arial" w:eastAsia="Arial" w:hAnsi="Arial"/>
+                <w:i/>
+                <w:iCs/>
                 <w:color w:val="888888"/>
-                <w:sz w:val="20"/>
-                <w:szCs w:val="20"/>
-              </w:rPr>
-              <w:t xml:space="preserve">  [ZWAAR]</w:t>
-            </w:r>
-          </w:p>
-          <w:p>
-            <w:pPr>
-              <w:spacing w:after="60"/>
-            </w:pPr>
-            <w:r>
-              <w:rPr>
-                <w:rFonts w:ascii="Arial" w:cs="Arial" w:eastAsia="Arial" w:hAnsi="Arial"/>
-                <w:b/>
-                <w:bCs/>
-                <w:color w:val="1B3A5C"/>
-                <w:sz w:val="26"/>
-                <w:szCs w:val="26"/>
-              </w:rPr>
-              <w:t xml:space="preserve">De Overstap</w:t>
-            </w:r>
-          </w:p>
-          <w:p>
-            <w:pPr>
-              <w:spacing w:after="120"/>
-            </w:pPr>
-            <w:r>
-              <w:t xml:space="preserve">De grootste oppositiepartij biedt aan om toe te treden tot de coalitie — maar alleen als de Minister-President opstapt. De Informateur wijst aan welke partijen dit betreft.</w:t>
+                <w:sz w:val="18"/>
+                <w:szCs w:val="18"/>
+              </w:rPr>
+              <w:t xml:space="preserve">PPP/FBL/KCV/PAN vóór (sociaal, en PAN wil sowieso iets afschaffen). DDP sterk tegen (kosten). FRR: “Eigen verantwoordelijkheid!” DAM: “Misschien halveren?”</w:t>
             </w:r>
           </w:p>
         </w:tc>
@@ -12470,7 +12573,7 @@
               <w:bottom w:val="single" w:color="1B3A5C" w:sz="2"/>
               <w:right w:val="single" w:color="1B3A5C" w:sz="2"/>
             </w:tcBorders>
-            <w:shd w:fill="FDE8E8" w:val="clear"/>
+            <w:shd w:fill="E8F0FE" w:val="clear"/>
             <w:tcMar>
               <w:top w:type="dxa" w:w="120"/>
               <w:left w:type="dxa" w:w="200"/>
@@ -12480,6 +12583,35 @@
           </w:tcPr>
           <w:p>
             <w:pPr>
+              <w:spacing w:after="60"/>
+            </w:pPr>
+            <w:r>
+              <w:rPr>
+                <w:rFonts w:ascii="Arial" w:cs="Arial" w:eastAsia="Arial" w:hAnsi="Arial"/>
+                <w:b/>
+                <w:bCs/>
+                <w:color w:val="1B3A5C"/>
+                <w:sz w:val="24"/>
+                <w:szCs w:val="24"/>
+              </w:rPr>
+              <w:t xml:space="preserve">WET #8: De Nationale Efficiëntiewet</w:t>
+            </w:r>
+          </w:p>
+          <w:p>
+            <w:pPr>
+              <w:spacing w:after="120"/>
+            </w:pPr>
+            <w:r>
+              <w:t xml:space="preserve">Alle overheidsvergaderingen mogen maximaal 30 minuten duren. Alle formulieren en communicatie worden uitsluitend digitaal.</w:t>
+            </w:r>
+          </w:p>
+          <w:p>
+            <w:pPr>
+              <w:spacing w:after="80"/>
+            </w:pPr>
+          </w:p>
+          <w:p>
+            <w:pPr>
               <w:spacing w:after="40"/>
             </w:pPr>
             <w:r>
@@ -12488,45 +12620,21 @@
                 <w:b/>
                 <w:bCs/>
                 <w:color w:val="888888"/>
-                <w:sz w:val="20"/>
-                <w:szCs w:val="20"/>
-              </w:rPr>
-              <w:t xml:space="preserve">CRISIS 5/6</w:t>
-            </w:r>
-            <w:r>
-              <w:rPr>
-                <w:rFonts w:ascii="Arial" w:cs="Arial" w:eastAsia="Arial" w:hAnsi="Arial"/>
-                <w:b/>
-                <w:bCs/>
+                <w:sz w:val="18"/>
+                <w:szCs w:val="18"/>
+              </w:rPr>
+              <w:t xml:space="preserve">👁️ HINT VOOR DE INFORMATEUR: </w:t>
+            </w:r>
+            <w:r>
+              <w:rPr>
+                <w:rFonts w:ascii="Arial" w:cs="Arial" w:eastAsia="Arial" w:hAnsi="Arial"/>
+                <w:i/>
+                <w:iCs/>
                 <w:color w:val="888888"/>
-                <w:sz w:val="20"/>
-                <w:szCs w:val="20"/>
-              </w:rPr>
-              <w:t xml:space="preserve">  [ZWAAR]</w:t>
-            </w:r>
-          </w:p>
-          <w:p>
-            <w:pPr>
-              <w:spacing w:after="60"/>
-            </w:pPr>
-            <w:r>
-              <w:rPr>
-                <w:rFonts w:ascii="Arial" w:cs="Arial" w:eastAsia="Arial" w:hAnsi="Arial"/>
-                <w:b/>
-                <w:bCs/>
-                <w:color w:val="1B3A5C"/>
-                <w:sz w:val="26"/>
-                <w:szCs w:val="26"/>
-              </w:rPr>
-              <w:t xml:space="preserve">Het Gebroken Belofte</w:t>
-            </w:r>
-          </w:p>
-          <w:p>
-            <w:pPr>
-              <w:spacing w:after="120"/>
-            </w:pPr>
-            <w:r>
-              <w:t xml:space="preserve">Een interne memo lekt uit: het belangrijkste punt uit het coalitieakkoord is bewust vaag gehouden en zou nooit echt uitgevoerd worden. De Informateur kiest welk punt dit is.</w:t>
+                <w:sz w:val="18"/>
+                <w:szCs w:val="18"/>
+              </w:rPr>
+              <w:t xml:space="preserve">WIFI/DDP vóór. FRR deels (efficiënt = goed, digitaal = eng). DAM sterk tegen (“Werkgroepen hebben TIJD nodig!”). PAN vóór (minder overheid). KCV: “En de culturele impact?”</w:t>
             </w:r>
           </w:p>
         </w:tc>
@@ -12546,6 +12654,37 @@
         </w:rPr>
         <w:t xml:space="preserve">✂ - - - - - - - - - - - - - - - - - - - - - - - - - - - - - - - - - - - - ✂</w:t>
       </w:r>
+    </w:p>
+    <w:p>
+      <w:r>
+        <w:br w:type="page"/>
+      </w:r>
+    </w:p>
+    <w:p>
+      <w:pPr>
+        <w:pStyle w:val="Heading1"/>
+      </w:pPr>
+      <w:r>
+        <w:t xml:space="preserve">Kabinetscrisis — Ronde 4</w:t>
+      </w:r>
+    </w:p>
+    <w:p>
+      <w:pPr>
+        <w:spacing w:after="120"/>
+      </w:pPr>
+      <w:r>
+        <w:rPr>
+          <w:i/>
+          <w:iCs/>
+          <w:color w:val="666666"/>
+        </w:rPr>
+        <w:t xml:space="preserve">Lees deze in volgorde voor. Ze worden steeds heftiger!</w:t>
+      </w:r>
+    </w:p>
+    <w:p>
+      <w:pPr>
+        <w:spacing w:after="80"/>
+      </w:pPr>
     </w:p>
     <w:tbl>
       <w:tblPr>
@@ -12572,7 +12711,7 @@
               <w:bottom w:val="single" w:color="1B3A5C" w:sz="2"/>
               <w:right w:val="single" w:color="1B3A5C" w:sz="2"/>
             </w:tcBorders>
-            <w:shd w:fill="F0E8F5" w:val="clear"/>
+            <w:shd w:fill="FFF9E0" w:val="clear"/>
             <w:tcMar>
               <w:top w:type="dxa" w:w="120"/>
               <w:left w:type="dxa" w:w="200"/>
@@ -12593,18 +12732,18 @@
                 <w:sz w:val="20"/>
                 <w:szCs w:val="20"/>
               </w:rPr>
-              <w:t xml:space="preserve">CRISIS 6/6</w:t>
-            </w:r>
-            <w:r>
-              <w:rPr>
-                <w:rFonts w:ascii="Arial" w:cs="Arial" w:eastAsia="Arial" w:hAnsi="Arial"/>
-                <w:b/>
-                <w:bCs/>
-                <w:color w:val="CC0000"/>
-                <w:sz w:val="20"/>
-                <w:szCs w:val="20"/>
-              </w:rPr>
-              <w:t xml:space="preserve">  [EXTREEM]</w:t>
+              <w:t xml:space="preserve">CRISIS 1/6</w:t>
+            </w:r>
+            <w:r>
+              <w:rPr>
+                <w:rFonts w:ascii="Arial" w:cs="Arial" w:eastAsia="Arial" w:hAnsi="Arial"/>
+                <w:b/>
+                <w:bCs/>
+                <w:color w:val="888888"/>
+                <w:sz w:val="20"/>
+                <w:szCs w:val="20"/>
+              </w:rPr>
+              <w:t xml:space="preserve"> [MILD]</w:t>
             </w:r>
           </w:p>
           <w:p>
@@ -12620,7 +12759,7 @@
                 <w:sz w:val="26"/>
                 <w:szCs w:val="26"/>
               </w:rPr>
-              <w:t xml:space="preserve">De Nacht van...</w:t>
+              <w:t xml:space="preserve">De Bonnetjesaffaire</w:t>
             </w:r>
           </w:p>
           <w:p>
@@ -12628,7 +12767,7 @@
               <w:spacing w:after="120"/>
             </w:pPr>
             <w:r>
-              <w:t xml:space="preserve">De Koning ontbiedt de Minister-President. Het parlement is in rep en roer. EXTRA: De Informateur mag voor deze stemming de geheime agenda van één speler naar keuze onthullen!</w:t>
+              <w:t xml:space="preserve">De Minister van Financiën heeft voor €47.000 aan bitterballen gedeclareerd op de staatsrekening. “Het was een werkdiner,” verklaart hij. “Alle 47 avonden.”</w:t>
             </w:r>
           </w:p>
         </w:tc>
@@ -12648,37 +12787,6 @@
         </w:rPr>
         <w:t xml:space="preserve">✂ - - - - - - - - - - - - - - - - - - - - - - - - - - - - - - - - - - - - ✂</w:t>
       </w:r>
-    </w:p>
-    <w:p>
-      <w:r>
-        <w:br w:type="page"/>
-      </w:r>
-    </w:p>
-    <w:p>
-      <w:pPr>
-        <w:pStyle w:val="Heading1"/>
-      </w:pPr>
-      <w:r>
-        <w:t xml:space="preserve">Geheime Agenda’s — Ronde 4</w:t>
-      </w:r>
-    </w:p>
-    <w:p>
-      <w:pPr>
-        <w:spacing w:after="120"/>
-      </w:pPr>
-      <w:r>
-        <w:rPr>
-          <w:i/>
-          <w:iCs/>
-          <w:color w:val="666666"/>
-        </w:rPr>
-        <w:t xml:space="preserve">Knip uit. Iedereen trekt er blind één aan het begin van Ronde 4. GEHEIM HOUDEN!</w:t>
-      </w:r>
-    </w:p>
-    <w:p>
-      <w:pPr>
-        <w:spacing w:after="80"/>
-      </w:pPr>
     </w:p>
     <w:tbl>
       <w:tblPr>
@@ -12705,7 +12813,7 @@
               <w:bottom w:val="single" w:color="1B3A5C" w:sz="2"/>
               <w:right w:val="single" w:color="1B3A5C" w:sz="2"/>
             </w:tcBorders>
-            <w:shd w:fill="E8F5E8" w:val="clear"/>
+            <w:shd w:fill="FFF3E8" w:val="clear"/>
             <w:tcMar>
               <w:top w:type="dxa" w:w="120"/>
               <w:left w:type="dxa" w:w="200"/>
@@ -12715,8 +12823,34 @@
           </w:tcPr>
           <w:p>
             <w:pPr>
-              <w:spacing w:after="60"/>
-              <w:jc w:val="center"/>
+              <w:spacing w:after="40"/>
+            </w:pPr>
+            <w:r>
+              <w:rPr>
+                <w:rFonts w:ascii="Arial" w:cs="Arial" w:eastAsia="Arial" w:hAnsi="Arial"/>
+                <w:b/>
+                <w:bCs/>
+                <w:color w:val="888888"/>
+                <w:sz w:val="20"/>
+                <w:szCs w:val="20"/>
+              </w:rPr>
+              <w:t xml:space="preserve">CRISIS 2/6</w:t>
+            </w:r>
+            <w:r>
+              <w:rPr>
+                <w:rFonts w:ascii="Arial" w:cs="Arial" w:eastAsia="Arial" w:hAnsi="Arial"/>
+                <w:b/>
+                <w:bCs/>
+                <w:color w:val="888888"/>
+                <w:sz w:val="20"/>
+                <w:szCs w:val="20"/>
+              </w:rPr>
+              <w:t xml:space="preserve"> [MEDIUM]</w:t>
+            </w:r>
+          </w:p>
+          <w:p>
+            <w:pPr>
+              <w:spacing w:after="60"/>
             </w:pPr>
             <w:r>
               <w:rPr>
@@ -12724,23 +12858,18 @@
                 <w:b/>
                 <w:bCs/>
                 <w:color w:val="1B3A5C"/>
-                <w:sz w:val="32"/>
-                <w:szCs w:val="32"/>
-              </w:rPr>
-              <w:t xml:space="preserve">LOYALIST</w:t>
-            </w:r>
-          </w:p>
-          <w:p>
-            <w:pPr>
-              <w:jc w:val="center"/>
-            </w:pPr>
-            <w:r>
-              <w:rPr>
-                <w:rFonts w:ascii="Arial" w:cs="Arial" w:eastAsia="Arial" w:hAnsi="Arial"/>
-                <w:sz w:val="22"/>
-                <w:szCs w:val="22"/>
-              </w:rPr>
-              <w:t xml:space="preserve">Je krijgt +3 punten als het kabinet OVERLEEFT (alle 6 crises doorstaat).</w:t>
+                <w:sz w:val="26"/>
+                <w:szCs w:val="26"/>
+              </w:rPr>
+              <w:t xml:space="preserve">Het Appjes-lek</w:t>
+            </w:r>
+          </w:p>
+          <w:p>
+            <w:pPr>
+              <w:spacing w:after="120"/>
+            </w:pPr>
+            <w:r>
+              <w:t xml:space="preserve">Een journalist publiceert appjes van de Minister-President. Daarin noemt de MP de oppositie “een stel circusclowns zonder tent” en de eigen coalitiepartners “noodzakelijk kwaad.”</w:t>
             </w:r>
           </w:p>
         </w:tc>
@@ -12786,7 +12915,7 @@
               <w:bottom w:val="single" w:color="1B3A5C" w:sz="2"/>
               <w:right w:val="single" w:color="1B3A5C" w:sz="2"/>
             </w:tcBorders>
-            <w:shd w:fill="E8F5E8" w:val="clear"/>
+            <w:shd w:fill="FFF3E8" w:val="clear"/>
             <w:tcMar>
               <w:top w:type="dxa" w:w="120"/>
               <w:left w:type="dxa" w:w="200"/>
@@ -12796,8 +12925,34 @@
           </w:tcPr>
           <w:p>
             <w:pPr>
-              <w:spacing w:after="60"/>
-              <w:jc w:val="center"/>
+              <w:spacing w:after="40"/>
+            </w:pPr>
+            <w:r>
+              <w:rPr>
+                <w:rFonts w:ascii="Arial" w:cs="Arial" w:eastAsia="Arial" w:hAnsi="Arial"/>
+                <w:b/>
+                <w:bCs/>
+                <w:color w:val="888888"/>
+                <w:sz w:val="20"/>
+                <w:szCs w:val="20"/>
+              </w:rPr>
+              <w:t xml:space="preserve">CRISIS 3/6</w:t>
+            </w:r>
+            <w:r>
+              <w:rPr>
+                <w:rFonts w:ascii="Arial" w:cs="Arial" w:eastAsia="Arial" w:hAnsi="Arial"/>
+                <w:b/>
+                <w:bCs/>
+                <w:color w:val="888888"/>
+                <w:sz w:val="20"/>
+                <w:szCs w:val="20"/>
+              </w:rPr>
+              <w:t xml:space="preserve"> [MEDIUM]</w:t>
+            </w:r>
+          </w:p>
+          <w:p>
+            <w:pPr>
+              <w:spacing w:after="60"/>
             </w:pPr>
             <w:r>
               <w:rPr>
@@ -12805,23 +12960,18 @@
                 <w:b/>
                 <w:bCs/>
                 <w:color w:val="1B3A5C"/>
-                <w:sz w:val="32"/>
-                <w:szCs w:val="32"/>
-              </w:rPr>
-              <w:t xml:space="preserve">LOYALIST</w:t>
-            </w:r>
-          </w:p>
-          <w:p>
-            <w:pPr>
-              <w:jc w:val="center"/>
-            </w:pPr>
-            <w:r>
-              <w:rPr>
-                <w:rFonts w:ascii="Arial" w:cs="Arial" w:eastAsia="Arial" w:hAnsi="Arial"/>
-                <w:sz w:val="22"/>
-                <w:szCs w:val="22"/>
-              </w:rPr>
-              <w:t xml:space="preserve">Je krijgt +3 punten als het kabinet OVERLEEFT (alle 6 crises doorstaat).</w:t>
+                <w:sz w:val="26"/>
+                <w:szCs w:val="26"/>
+              </w:rPr>
+              <w:t xml:space="preserve">Het Begrotingsgat</w:t>
+            </w:r>
+          </w:p>
+          <w:p>
+            <w:pPr>
+              <w:spacing w:after="120"/>
+            </w:pPr>
+            <w:r>
+              <w:t xml:space="preserve">Het CPB rekent het coalitieakkoord door: er mist 6 miljard euro. Iemand heeft de komma verkeerd gezet. De hele begroting klopt van geen kant. De pers gaat los.</w:t>
             </w:r>
           </w:p>
         </w:tc>
@@ -12867,7 +13017,7 @@
               <w:bottom w:val="single" w:color="1B3A5C" w:sz="2"/>
               <w:right w:val="single" w:color="1B3A5C" w:sz="2"/>
             </w:tcBorders>
-            <w:shd w:fill="E8F5E8" w:val="clear"/>
+            <w:shd w:fill="FDE8E8" w:val="clear"/>
             <w:tcMar>
               <w:top w:type="dxa" w:w="120"/>
               <w:left w:type="dxa" w:w="200"/>
@@ -12877,8 +13027,34 @@
           </w:tcPr>
           <w:p>
             <w:pPr>
-              <w:spacing w:after="60"/>
-              <w:jc w:val="center"/>
+              <w:spacing w:after="40"/>
+            </w:pPr>
+            <w:r>
+              <w:rPr>
+                <w:rFonts w:ascii="Arial" w:cs="Arial" w:eastAsia="Arial" w:hAnsi="Arial"/>
+                <w:b/>
+                <w:bCs/>
+                <w:color w:val="888888"/>
+                <w:sz w:val="20"/>
+                <w:szCs w:val="20"/>
+              </w:rPr>
+              <w:t xml:space="preserve">CRISIS 4/6</w:t>
+            </w:r>
+            <w:r>
+              <w:rPr>
+                <w:rFonts w:ascii="Arial" w:cs="Arial" w:eastAsia="Arial" w:hAnsi="Arial"/>
+                <w:b/>
+                <w:bCs/>
+                <w:color w:val="888888"/>
+                <w:sz w:val="20"/>
+                <w:szCs w:val="20"/>
+              </w:rPr>
+              <w:t xml:space="preserve"> [ZWAAR]</w:t>
+            </w:r>
+          </w:p>
+          <w:p>
+            <w:pPr>
+              <w:spacing w:after="60"/>
             </w:pPr>
             <w:r>
               <w:rPr>
@@ -12886,23 +13062,18 @@
                 <w:b/>
                 <w:bCs/>
                 <w:color w:val="1B3A5C"/>
-                <w:sz w:val="32"/>
-                <w:szCs w:val="32"/>
-              </w:rPr>
-              <w:t xml:space="preserve">LOYALIST</w:t>
-            </w:r>
-          </w:p>
-          <w:p>
-            <w:pPr>
-              <w:jc w:val="center"/>
-            </w:pPr>
-            <w:r>
-              <w:rPr>
-                <w:rFonts w:ascii="Arial" w:cs="Arial" w:eastAsia="Arial" w:hAnsi="Arial"/>
-                <w:sz w:val="22"/>
-                <w:szCs w:val="22"/>
-              </w:rPr>
-              <w:t xml:space="preserve">Je krijgt +3 punten als het kabinet OVERLEEFT (alle 6 crises doorstaat).</w:t>
+                <w:sz w:val="26"/>
+                <w:szCs w:val="26"/>
+              </w:rPr>
+              <w:t xml:space="preserve">De Overstap</w:t>
+            </w:r>
+          </w:p>
+          <w:p>
+            <w:pPr>
+              <w:spacing w:after="120"/>
+            </w:pPr>
+            <w:r>
+              <w:t xml:space="preserve">De grootste oppositiepartij biedt aan om toe te treden tot de coalitie — maar alleen als de Minister-President opstapt. De Informateur wijst aan welke partijen dit betreft.</w:t>
             </w:r>
           </w:p>
         </w:tc>
@@ -12958,8 +13129,34 @@
           </w:tcPr>
           <w:p>
             <w:pPr>
-              <w:spacing w:after="60"/>
-              <w:jc w:val="center"/>
+              <w:spacing w:after="40"/>
+            </w:pPr>
+            <w:r>
+              <w:rPr>
+                <w:rFonts w:ascii="Arial" w:cs="Arial" w:eastAsia="Arial" w:hAnsi="Arial"/>
+                <w:b/>
+                <w:bCs/>
+                <w:color w:val="888888"/>
+                <w:sz w:val="20"/>
+                <w:szCs w:val="20"/>
+              </w:rPr>
+              <w:t xml:space="preserve">CRISIS 5/6</w:t>
+            </w:r>
+            <w:r>
+              <w:rPr>
+                <w:rFonts w:ascii="Arial" w:cs="Arial" w:eastAsia="Arial" w:hAnsi="Arial"/>
+                <w:b/>
+                <w:bCs/>
+                <w:color w:val="888888"/>
+                <w:sz w:val="20"/>
+                <w:szCs w:val="20"/>
+              </w:rPr>
+              <w:t xml:space="preserve"> [ZWAAR]</w:t>
+            </w:r>
+          </w:p>
+          <w:p>
+            <w:pPr>
+              <w:spacing w:after="60"/>
             </w:pPr>
             <w:r>
               <w:rPr>
@@ -12967,23 +13164,18 @@
                 <w:b/>
                 <w:bCs/>
                 <w:color w:val="1B3A5C"/>
-                <w:sz w:val="32"/>
-                <w:szCs w:val="32"/>
-              </w:rPr>
-              <w:t xml:space="preserve">OPSTANDELING</w:t>
-            </w:r>
-          </w:p>
-          <w:p>
-            <w:pPr>
-              <w:jc w:val="center"/>
-            </w:pPr>
-            <w:r>
-              <w:rPr>
-                <w:rFonts w:ascii="Arial" w:cs="Arial" w:eastAsia="Arial" w:hAnsi="Arial"/>
-                <w:sz w:val="22"/>
-                <w:szCs w:val="22"/>
-              </w:rPr>
-              <w:t xml:space="preserve">Je krijgt +3 punten als het kabinet VALT (motie van wantrouwen wordt aangenomen).</w:t>
+                <w:sz w:val="26"/>
+                <w:szCs w:val="26"/>
+              </w:rPr>
+              <w:t xml:space="preserve">Het Gebroken Belofte</w:t>
+            </w:r>
+          </w:p>
+          <w:p>
+            <w:pPr>
+              <w:spacing w:after="120"/>
+            </w:pPr>
+            <w:r>
+              <w:t xml:space="preserve">Een interne memo lekt uit: het belangrijkste punt uit het coalitieakkoord is bewust vaag gehouden en zou nooit echt uitgevoerd worden. De Informateur kiest welk punt dit is.</w:t>
             </w:r>
           </w:p>
         </w:tc>
@@ -13029,7 +13221,7 @@
               <w:bottom w:val="single" w:color="1B3A5C" w:sz="2"/>
               <w:right w:val="single" w:color="1B3A5C" w:sz="2"/>
             </w:tcBorders>
-            <w:shd w:fill="FDE8E8" w:val="clear"/>
+            <w:shd w:fill="F0E8F5" w:val="clear"/>
             <w:tcMar>
               <w:top w:type="dxa" w:w="120"/>
               <w:left w:type="dxa" w:w="200"/>
@@ -13039,8 +13231,34 @@
           </w:tcPr>
           <w:p>
             <w:pPr>
-              <w:spacing w:after="60"/>
-              <w:jc w:val="center"/>
+              <w:spacing w:after="40"/>
+            </w:pPr>
+            <w:r>
+              <w:rPr>
+                <w:rFonts w:ascii="Arial" w:cs="Arial" w:eastAsia="Arial" w:hAnsi="Arial"/>
+                <w:b/>
+                <w:bCs/>
+                <w:color w:val="888888"/>
+                <w:sz w:val="20"/>
+                <w:szCs w:val="20"/>
+              </w:rPr>
+              <w:t xml:space="preserve">CRISIS 6/6</w:t>
+            </w:r>
+            <w:r>
+              <w:rPr>
+                <w:rFonts w:ascii="Arial" w:cs="Arial" w:eastAsia="Arial" w:hAnsi="Arial"/>
+                <w:b/>
+                <w:bCs/>
+                <w:color w:val="CC0000"/>
+                <w:sz w:val="20"/>
+                <w:szCs w:val="20"/>
+              </w:rPr>
+              <w:t xml:space="preserve"> [EXTREEM]</w:t>
+            </w:r>
+          </w:p>
+          <w:p>
+            <w:pPr>
+              <w:spacing w:after="60"/>
             </w:pPr>
             <w:r>
               <w:rPr>
@@ -13048,23 +13266,18 @@
                 <w:b/>
                 <w:bCs/>
                 <w:color w:val="1B3A5C"/>
-                <w:sz w:val="32"/>
-                <w:szCs w:val="32"/>
-              </w:rPr>
-              <w:t xml:space="preserve">OPSTANDELING</w:t>
-            </w:r>
-          </w:p>
-          <w:p>
-            <w:pPr>
-              <w:jc w:val="center"/>
-            </w:pPr>
-            <w:r>
-              <w:rPr>
-                <w:rFonts w:ascii="Arial" w:cs="Arial" w:eastAsia="Arial" w:hAnsi="Arial"/>
-                <w:sz w:val="22"/>
-                <w:szCs w:val="22"/>
-              </w:rPr>
-              <w:t xml:space="preserve">Je krijgt +3 punten als het kabinet VALT (motie van wantrouwen wordt aangenomen).</w:t>
+                <w:sz w:val="26"/>
+                <w:szCs w:val="26"/>
+              </w:rPr>
+              <w:t xml:space="preserve">De Nacht van...</w:t>
+            </w:r>
+          </w:p>
+          <w:p>
+            <w:pPr>
+              <w:spacing w:after="120"/>
+            </w:pPr>
+            <w:r>
+              <w:t xml:space="preserve">De Koning ontbiedt de Minister-President. Het parlement is in rep en roer. EXTRA: De Informateur mag voor deze stemming de geheime agenda van één speler naar keuze onthullen!</w:t>
             </w:r>
           </w:p>
         </w:tc>
@@ -13084,6 +13297,37 @@
         </w:rPr>
         <w:t xml:space="preserve">✂ - - - - - - - - - - - - - - - - - - - - - - - - - - - - - - - - - - - - ✂</w:t>
       </w:r>
+    </w:p>
+    <w:p>
+      <w:r>
+        <w:br w:type="page"/>
+      </w:r>
+    </w:p>
+    <w:p>
+      <w:pPr>
+        <w:pStyle w:val="Heading1"/>
+      </w:pPr>
+      <w:r>
+        <w:t xml:space="preserve">Geheime Agenda’s — Ronde 4</w:t>
+      </w:r>
+    </w:p>
+    <w:p>
+      <w:pPr>
+        <w:spacing w:after="120"/>
+      </w:pPr>
+      <w:r>
+        <w:rPr>
+          <w:i/>
+          <w:iCs/>
+          <w:color w:val="666666"/>
+        </w:rPr>
+        <w:t xml:space="preserve">Knip uit. Iedereen trekt er blind één aan het begin van Ronde 4. GEHEIM HOUDEN!</w:t>
+      </w:r>
+    </w:p>
+    <w:p>
+      <w:pPr>
+        <w:spacing w:after="80"/>
+      </w:pPr>
     </w:p>
     <w:tbl>
       <w:tblPr>
@@ -13110,7 +13354,7 @@
               <w:bottom w:val="single" w:color="1B3A5C" w:sz="2"/>
               <w:right w:val="single" w:color="1B3A5C" w:sz="2"/>
             </w:tcBorders>
-            <w:shd w:fill="FDE8E8" w:val="clear"/>
+            <w:shd w:fill="E8F5E8" w:val="clear"/>
             <w:tcMar>
               <w:top w:type="dxa" w:w="120"/>
               <w:left w:type="dxa" w:w="200"/>
@@ -13132,7 +13376,7 @@
                 <w:sz w:val="32"/>
                 <w:szCs w:val="32"/>
               </w:rPr>
-              <w:t xml:space="preserve">OPSTANDELING</w:t>
+              <w:t xml:space="preserve">LOYALIST</w:t>
             </w:r>
           </w:p>
           <w:p>
@@ -13145,7 +13389,7 @@
                 <w:sz w:val="22"/>
                 <w:szCs w:val="22"/>
               </w:rPr>
-              <w:t xml:space="preserve">Je krijgt +3 punten als het kabinet VALT (motie van wantrouwen wordt aangenomen).</w:t>
+              <w:t xml:space="preserve">Je krijgt +3 punten als het kabinet OVERLEEFT (alle 6 crises doorstaat).</w:t>
             </w:r>
           </w:p>
         </w:tc>
@@ -13191,7 +13435,7 @@
               <w:bottom w:val="single" w:color="1B3A5C" w:sz="2"/>
               <w:right w:val="single" w:color="1B3A5C" w:sz="2"/>
             </w:tcBorders>
-            <w:shd w:fill="FFF9E0" w:val="clear"/>
+            <w:shd w:fill="E8F5E8" w:val="clear"/>
             <w:tcMar>
               <w:top w:type="dxa" w:w="120"/>
               <w:left w:type="dxa" w:w="200"/>
@@ -13213,7 +13457,7 @@
                 <w:sz w:val="32"/>
                 <w:szCs w:val="32"/>
               </w:rPr>
-              <w:t xml:space="preserve">OPPORTUNIST</w:t>
+              <w:t xml:space="preserve">LOYALIST</w:t>
             </w:r>
           </w:p>
           <w:p>
@@ -13226,7 +13470,7 @@
                 <w:sz w:val="22"/>
                 <w:szCs w:val="22"/>
               </w:rPr>
-              <w:t xml:space="preserve">Je krijgt +3 punten als je minstens één keer van stem wisselt (eerst voor, dan tegen, of andersom) tijdens de crisisrondes.</w:t>
+              <w:t xml:space="preserve">Je krijgt +3 punten als het kabinet OVERLEEFT (alle 6 crises doorstaat).</w:t>
             </w:r>
           </w:p>
         </w:tc>
@@ -13272,7 +13516,7 @@
               <w:bottom w:val="single" w:color="1B3A5C" w:sz="2"/>
               <w:right w:val="single" w:color="1B3A5C" w:sz="2"/>
             </w:tcBorders>
-            <w:shd w:fill="FFF9E0" w:val="clear"/>
+            <w:shd w:fill="E8F5E8" w:val="clear"/>
             <w:tcMar>
               <w:top w:type="dxa" w:w="120"/>
               <w:left w:type="dxa" w:w="200"/>
@@ -13294,7 +13538,7 @@
                 <w:sz w:val="32"/>
                 <w:szCs w:val="32"/>
               </w:rPr>
-              <w:t xml:space="preserve">OPPORTUNIST</w:t>
+              <w:t xml:space="preserve">LOYALIST</w:t>
             </w:r>
           </w:p>
           <w:p>
@@ -13307,7 +13551,7 @@
                 <w:sz w:val="22"/>
                 <w:szCs w:val="22"/>
               </w:rPr>
-              <w:t xml:space="preserve">Je krijgt +3 punten als je minstens één keer van stem wisselt (eerst voor, dan tegen, of andersom) tijdens de crisisrondes.</w:t>
+              <w:t xml:space="preserve">Je krijgt +3 punten als het kabinet OVERLEEFT (alle 6 crises doorstaat).</w:t>
             </w:r>
           </w:p>
         </w:tc>
@@ -13353,7 +13597,7 @@
               <w:bottom w:val="single" w:color="1B3A5C" w:sz="2"/>
               <w:right w:val="single" w:color="1B3A5C" w:sz="2"/>
             </w:tcBorders>
-            <w:shd w:fill="F0E8F5" w:val="clear"/>
+            <w:shd w:fill="FDE8E8" w:val="clear"/>
             <w:tcMar>
               <w:top w:type="dxa" w:w="120"/>
               <w:left w:type="dxa" w:w="200"/>
@@ -13375,7 +13619,7 @@
                 <w:sz w:val="32"/>
                 <w:szCs w:val="32"/>
               </w:rPr>
-              <w:t xml:space="preserve">KINGMAKER</w:t>
+              <w:t xml:space="preserve">OPSTANDELING</w:t>
             </w:r>
           </w:p>
           <w:p>
@@ -13388,7 +13632,7 @@
                 <w:sz w:val="22"/>
                 <w:szCs w:val="22"/>
               </w:rPr>
-              <w:t xml:space="preserve">Je krijgt +3 punten als jouw stem op enig moment het verschil maakt — het kantelpunt tussen overleven en vallen. De Informateur bepaalt dit.</w:t>
+              <w:t xml:space="preserve">Je krijgt +3 punten als het kabinet VALT (motie van wantrouwen wordt aangenomen).</w:t>
             </w:r>
           </w:p>
         </w:tc>
@@ -13434,7 +13678,7 @@
               <w:bottom w:val="single" w:color="1B3A5C" w:sz="2"/>
               <w:right w:val="single" w:color="1B3A5C" w:sz="2"/>
             </w:tcBorders>
-            <w:shd w:fill="F0E8F5" w:val="clear"/>
+            <w:shd w:fill="FDE8E8" w:val="clear"/>
             <w:tcMar>
               <w:top w:type="dxa" w:w="120"/>
               <w:left w:type="dxa" w:w="200"/>
@@ -13456,7 +13700,7 @@
                 <w:sz w:val="32"/>
                 <w:szCs w:val="32"/>
               </w:rPr>
-              <w:t xml:space="preserve">KINGMAKER</w:t>
+              <w:t xml:space="preserve">OPSTANDELING</w:t>
             </w:r>
           </w:p>
           <w:p>
@@ -13469,7 +13713,7 @@
                 <w:sz w:val="22"/>
                 <w:szCs w:val="22"/>
               </w:rPr>
-              <w:t xml:space="preserve">Je krijgt +3 punten als jouw stem op enig moment het verschil maakt — het kantelpunt tussen overleven en vallen. De Informateur bepaalt dit.</w:t>
+              <w:t xml:space="preserve">Je krijgt +3 punten als het kabinet VALT (motie van wantrouwen wordt aangenomen).</w:t>
             </w:r>
           </w:p>
         </w:tc>
@@ -13489,32 +13733,6 @@
         </w:rPr>
         <w:t xml:space="preserve">✂ - - - - - - - - - - - - - - - - - - - - - - - - - - - - - - - - - - - - ✂</w:t>
       </w:r>
-    </w:p>
-    <w:p>
-      <w:r>
-        <w:br w:type="page"/>
-      </w:r>
-    </w:p>
-    <w:p>
-      <w:pPr>
-        <w:pStyle w:val="Heading1"/>
-      </w:pPr>
-      <w:r>
-        <w:t xml:space="preserve">Coalitieakkoord Template</w:t>
-      </w:r>
-    </w:p>
-    <w:p>
-      <w:pPr>
-        <w:spacing w:after="120"/>
-      </w:pPr>
-      <w:r>
-        <w:t xml:space="preserve">Vul in als de coalitie gevormd is! Alle coalitiepartijen ondertekenen.</w:t>
-      </w:r>
-    </w:p>
-    <w:p>
-      <w:pPr>
-        <w:spacing w:after="80"/>
-      </w:pPr>
     </w:p>
     <w:tbl>
       <w:tblPr>
@@ -13541,7 +13759,7 @@
               <w:bottom w:val="single" w:color="1B3A5C" w:sz="2"/>
               <w:right w:val="single" w:color="1B3A5C" w:sz="2"/>
             </w:tcBorders>
-            <w:shd w:fill="FFFFFF" w:val="clear"/>
+            <w:shd w:fill="FDE8E8" w:val="clear"/>
             <w:tcMar>
               <w:top w:type="dxa" w:w="120"/>
               <w:left w:type="dxa" w:w="200"/>
@@ -13551,7 +13769,7 @@
           </w:tcPr>
           <w:p>
             <w:pPr>
-              <w:spacing w:after="200"/>
+              <w:spacing w:after="60"/>
               <w:jc w:val="center"/>
             </w:pPr>
             <w:r>
@@ -13563,6 +13781,437 @@
                 <w:sz w:val="32"/>
                 <w:szCs w:val="32"/>
               </w:rPr>
+              <w:t xml:space="preserve">OPSTANDELING</w:t>
+            </w:r>
+          </w:p>
+          <w:p>
+            <w:pPr>
+              <w:jc w:val="center"/>
+            </w:pPr>
+            <w:r>
+              <w:rPr>
+                <w:rFonts w:ascii="Arial" w:cs="Arial" w:eastAsia="Arial" w:hAnsi="Arial"/>
+                <w:sz w:val="22"/>
+                <w:szCs w:val="22"/>
+              </w:rPr>
+              <w:t xml:space="preserve">Je krijgt +3 punten als het kabinet VALT (motie van wantrouwen wordt aangenomen).</w:t>
+            </w:r>
+          </w:p>
+        </w:tc>
+      </w:tr>
+    </w:tbl>
+    <w:p>
+      <w:pPr>
+        <w:spacing w:after="100"/>
+        <w:jc w:val="center"/>
+      </w:pPr>
+      <w:r>
+        <w:rPr>
+          <w:rFonts w:ascii="Arial" w:cs="Arial" w:eastAsia="Arial" w:hAnsi="Arial"/>
+          <w:color w:val="AAAAAA"/>
+          <w:sz w:val="18"/>
+          <w:szCs w:val="18"/>
+        </w:rPr>
+        <w:t xml:space="preserve">✂ - - - - - - - - - - - - - - - - - - - - - - - - - - - - - - - - - - - - ✂</w:t>
+      </w:r>
+    </w:p>
+    <w:tbl>
+      <w:tblPr>
+        <w:tblW w:type="pct" w:w="100%"/>
+        <w:tblBorders>
+          <w:top w:val="single" w:color="auto" w:sz="4"/>
+          <w:left w:val="single" w:color="auto" w:sz="4"/>
+          <w:bottom w:val="single" w:color="auto" w:sz="4"/>
+          <w:right w:val="single" w:color="auto" w:sz="4"/>
+          <w:insideH w:val="single" w:color="auto" w:sz="4"/>
+          <w:insideV w:val="single" w:color="auto" w:sz="4"/>
+        </w:tblBorders>
+      </w:tblPr>
+      <w:tblGrid>
+        <w:gridCol w:w="9026"/>
+      </w:tblGrid>
+      <w:tr>
+        <w:tc>
+          <w:tcPr>
+            <w:tcW w:type="dxa" w:w="9026"/>
+            <w:tcBorders>
+              <w:top w:val="single" w:color="1B3A5C" w:sz="2"/>
+              <w:left w:val="single" w:color="FF6B00" w:sz="6"/>
+              <w:bottom w:val="single" w:color="1B3A5C" w:sz="2"/>
+              <w:right w:val="single" w:color="1B3A5C" w:sz="2"/>
+            </w:tcBorders>
+            <w:shd w:fill="FFF9E0" w:val="clear"/>
+            <w:tcMar>
+              <w:top w:type="dxa" w:w="120"/>
+              <w:left w:type="dxa" w:w="200"/>
+              <w:bottom w:type="dxa" w:w="120"/>
+              <w:right w:type="dxa" w:w="200"/>
+            </w:tcMar>
+          </w:tcPr>
+          <w:p>
+            <w:pPr>
+              <w:spacing w:after="60"/>
+              <w:jc w:val="center"/>
+            </w:pPr>
+            <w:r>
+              <w:rPr>
+                <w:rFonts w:ascii="Arial" w:cs="Arial" w:eastAsia="Arial" w:hAnsi="Arial"/>
+                <w:b/>
+                <w:bCs/>
+                <w:color w:val="1B3A5C"/>
+                <w:sz w:val="32"/>
+                <w:szCs w:val="32"/>
+              </w:rPr>
+              <w:t xml:space="preserve">OPPORTUNIST</w:t>
+            </w:r>
+          </w:p>
+          <w:p>
+            <w:pPr>
+              <w:jc w:val="center"/>
+            </w:pPr>
+            <w:r>
+              <w:rPr>
+                <w:rFonts w:ascii="Arial" w:cs="Arial" w:eastAsia="Arial" w:hAnsi="Arial"/>
+                <w:sz w:val="22"/>
+                <w:szCs w:val="22"/>
+              </w:rPr>
+              <w:t xml:space="preserve">Je krijgt +3 punten als je in de coalitie zit EN minimaal 1Ã TEGEN het kabinet stemt bij een crisis. Sabotage van binnenuit!</w:t>
+            </w:r>
+          </w:p>
+        </w:tc>
+      </w:tr>
+    </w:tbl>
+    <w:p>
+      <w:pPr>
+        <w:spacing w:after="100"/>
+        <w:jc w:val="center"/>
+      </w:pPr>
+      <w:r>
+        <w:rPr>
+          <w:rFonts w:ascii="Arial" w:cs="Arial" w:eastAsia="Arial" w:hAnsi="Arial"/>
+          <w:color w:val="AAAAAA"/>
+          <w:sz w:val="18"/>
+          <w:szCs w:val="18"/>
+        </w:rPr>
+        <w:t xml:space="preserve">✂ - - - - - - - - - - - - - - - - - - - - - - - - - - - - - - - - - - - - ✂</w:t>
+      </w:r>
+    </w:p>
+    <w:tbl>
+      <w:tblPr>
+        <w:tblW w:type="pct" w:w="100%"/>
+        <w:tblBorders>
+          <w:top w:val="single" w:color="auto" w:sz="4"/>
+          <w:left w:val="single" w:color="auto" w:sz="4"/>
+          <w:bottom w:val="single" w:color="auto" w:sz="4"/>
+          <w:right w:val="single" w:color="auto" w:sz="4"/>
+          <w:insideH w:val="single" w:color="auto" w:sz="4"/>
+          <w:insideV w:val="single" w:color="auto" w:sz="4"/>
+        </w:tblBorders>
+      </w:tblPr>
+      <w:tblGrid>
+        <w:gridCol w:w="9026"/>
+      </w:tblGrid>
+      <w:tr>
+        <w:tc>
+          <w:tcPr>
+            <w:tcW w:type="dxa" w:w="9026"/>
+            <w:tcBorders>
+              <w:top w:val="single" w:color="1B3A5C" w:sz="2"/>
+              <w:left w:val="single" w:color="FF6B00" w:sz="6"/>
+              <w:bottom w:val="single" w:color="1B3A5C" w:sz="2"/>
+              <w:right w:val="single" w:color="1B3A5C" w:sz="2"/>
+            </w:tcBorders>
+            <w:shd w:fill="FFF9E0" w:val="clear"/>
+            <w:tcMar>
+              <w:top w:type="dxa" w:w="120"/>
+              <w:left w:type="dxa" w:w="200"/>
+              <w:bottom w:type="dxa" w:w="120"/>
+              <w:right w:type="dxa" w:w="200"/>
+            </w:tcMar>
+          </w:tcPr>
+          <w:p>
+            <w:pPr>
+              <w:spacing w:after="60"/>
+              <w:jc w:val="center"/>
+            </w:pPr>
+            <w:r>
+              <w:rPr>
+                <w:rFonts w:ascii="Arial" w:cs="Arial" w:eastAsia="Arial" w:hAnsi="Arial"/>
+                <w:b/>
+                <w:bCs/>
+                <w:color w:val="1B3A5C"/>
+                <w:sz w:val="32"/>
+                <w:szCs w:val="32"/>
+              </w:rPr>
+              <w:t xml:space="preserve">OPPORTUNIST</w:t>
+            </w:r>
+          </w:p>
+          <w:p>
+            <w:pPr>
+              <w:jc w:val="center"/>
+            </w:pPr>
+            <w:r>
+              <w:rPr>
+                <w:rFonts w:ascii="Arial" w:cs="Arial" w:eastAsia="Arial" w:hAnsi="Arial"/>
+                <w:sz w:val="22"/>
+                <w:szCs w:val="22"/>
+              </w:rPr>
+              <w:t xml:space="preserve">Je krijgt +3 punten als je in de coalitie zit EN minimaal 1Ã TEGEN het kabinet stemt bij een crisis. Sabotage van binnenuit!</w:t>
+            </w:r>
+          </w:p>
+        </w:tc>
+      </w:tr>
+    </w:tbl>
+    <w:p>
+      <w:pPr>
+        <w:spacing w:after="100"/>
+        <w:jc w:val="center"/>
+      </w:pPr>
+      <w:r>
+        <w:rPr>
+          <w:rFonts w:ascii="Arial" w:cs="Arial" w:eastAsia="Arial" w:hAnsi="Arial"/>
+          <w:color w:val="AAAAAA"/>
+          <w:sz w:val="18"/>
+          <w:szCs w:val="18"/>
+        </w:rPr>
+        <w:t xml:space="preserve">✂ - - - - - - - - - - - - - - - - - - - - - - - - - - - - - - - - - - - - ✂</w:t>
+      </w:r>
+    </w:p>
+    <w:tbl>
+      <w:tblPr>
+        <w:tblW w:type="pct" w:w="100%"/>
+        <w:tblBorders>
+          <w:top w:val="single" w:color="auto" w:sz="4"/>
+          <w:left w:val="single" w:color="auto" w:sz="4"/>
+          <w:bottom w:val="single" w:color="auto" w:sz="4"/>
+          <w:right w:val="single" w:color="auto" w:sz="4"/>
+          <w:insideH w:val="single" w:color="auto" w:sz="4"/>
+          <w:insideV w:val="single" w:color="auto" w:sz="4"/>
+        </w:tblBorders>
+      </w:tblPr>
+      <w:tblGrid>
+        <w:gridCol w:w="9026"/>
+      </w:tblGrid>
+      <w:tr>
+        <w:tc>
+          <w:tcPr>
+            <w:tcW w:type="dxa" w:w="9026"/>
+            <w:tcBorders>
+              <w:top w:val="single" w:color="1B3A5C" w:sz="2"/>
+              <w:left w:val="single" w:color="FF6B00" w:sz="6"/>
+              <w:bottom w:val="single" w:color="1B3A5C" w:sz="2"/>
+              <w:right w:val="single" w:color="1B3A5C" w:sz="2"/>
+            </w:tcBorders>
+            <w:shd w:fill="F0E8F5" w:val="clear"/>
+            <w:tcMar>
+              <w:top w:type="dxa" w:w="120"/>
+              <w:left w:type="dxa" w:w="200"/>
+              <w:bottom w:type="dxa" w:w="120"/>
+              <w:right w:type="dxa" w:w="200"/>
+            </w:tcMar>
+          </w:tcPr>
+          <w:p>
+            <w:pPr>
+              <w:spacing w:after="60"/>
+              <w:jc w:val="center"/>
+            </w:pPr>
+            <w:r>
+              <w:rPr>
+                <w:rFonts w:ascii="Arial" w:cs="Arial" w:eastAsia="Arial" w:hAnsi="Arial"/>
+                <w:b/>
+                <w:bCs/>
+                <w:color w:val="1B3A5C"/>
+                <w:sz w:val="32"/>
+                <w:szCs w:val="32"/>
+              </w:rPr>
+              <w:t xml:space="preserve">KINGMAKER</w:t>
+            </w:r>
+          </w:p>
+          <w:p>
+            <w:pPr>
+              <w:jc w:val="center"/>
+            </w:pPr>
+            <w:r>
+              <w:rPr>
+                <w:rFonts w:ascii="Arial" w:cs="Arial" w:eastAsia="Arial" w:hAnsi="Arial"/>
+                <w:sz w:val="22"/>
+                <w:szCs w:val="22"/>
+              </w:rPr>
+              <w:t xml:space="preserve">Je krijgt +3 punten als je NIET in de coalitie zit, maar de Minister-President toch alle 6 crises overleeft. De koningmaker achter de schermen!</w:t>
+            </w:r>
+          </w:p>
+        </w:tc>
+      </w:tr>
+    </w:tbl>
+    <w:p>
+      <w:pPr>
+        <w:spacing w:after="100"/>
+        <w:jc w:val="center"/>
+      </w:pPr>
+      <w:r>
+        <w:rPr>
+          <w:rFonts w:ascii="Arial" w:cs="Arial" w:eastAsia="Arial" w:hAnsi="Arial"/>
+          <w:color w:val="AAAAAA"/>
+          <w:sz w:val="18"/>
+          <w:szCs w:val="18"/>
+        </w:rPr>
+        <w:t xml:space="preserve">✂ - - - - - - - - - - - - - - - - - - - - - - - - - - - - - - - - - - - - ✂</w:t>
+      </w:r>
+    </w:p>
+    <w:tbl>
+      <w:tblPr>
+        <w:tblW w:type="pct" w:w="100%"/>
+        <w:tblBorders>
+          <w:top w:val="single" w:color="auto" w:sz="4"/>
+          <w:left w:val="single" w:color="auto" w:sz="4"/>
+          <w:bottom w:val="single" w:color="auto" w:sz="4"/>
+          <w:right w:val="single" w:color="auto" w:sz="4"/>
+          <w:insideH w:val="single" w:color="auto" w:sz="4"/>
+          <w:insideV w:val="single" w:color="auto" w:sz="4"/>
+        </w:tblBorders>
+      </w:tblPr>
+      <w:tblGrid>
+        <w:gridCol w:w="9026"/>
+      </w:tblGrid>
+      <w:tr>
+        <w:tc>
+          <w:tcPr>
+            <w:tcW w:type="dxa" w:w="9026"/>
+            <w:tcBorders>
+              <w:top w:val="single" w:color="1B3A5C" w:sz="2"/>
+              <w:left w:val="single" w:color="FF6B00" w:sz="6"/>
+              <w:bottom w:val="single" w:color="1B3A5C" w:sz="2"/>
+              <w:right w:val="single" w:color="1B3A5C" w:sz="2"/>
+            </w:tcBorders>
+            <w:shd w:fill="F0E8F5" w:val="clear"/>
+            <w:tcMar>
+              <w:top w:type="dxa" w:w="120"/>
+              <w:left w:type="dxa" w:w="200"/>
+              <w:bottom w:type="dxa" w:w="120"/>
+              <w:right w:type="dxa" w:w="200"/>
+            </w:tcMar>
+          </w:tcPr>
+          <w:p>
+            <w:pPr>
+              <w:spacing w:after="60"/>
+              <w:jc w:val="center"/>
+            </w:pPr>
+            <w:r>
+              <w:rPr>
+                <w:rFonts w:ascii="Arial" w:cs="Arial" w:eastAsia="Arial" w:hAnsi="Arial"/>
+                <w:b/>
+                <w:bCs/>
+                <w:color w:val="1B3A5C"/>
+                <w:sz w:val="32"/>
+                <w:szCs w:val="32"/>
+              </w:rPr>
+              <w:t xml:space="preserve">KINGMAKER</w:t>
+            </w:r>
+          </w:p>
+          <w:p>
+            <w:pPr>
+              <w:jc w:val="center"/>
+            </w:pPr>
+            <w:r>
+              <w:rPr>
+                <w:rFonts w:ascii="Arial" w:cs="Arial" w:eastAsia="Arial" w:hAnsi="Arial"/>
+                <w:sz w:val="22"/>
+                <w:szCs w:val="22"/>
+              </w:rPr>
+              <w:t xml:space="preserve">Je krijgt +3 punten als je NIET in de coalitie zit, maar de Minister-President toch alle 6 crises overleeft. De koningmaker achter de schermen!</w:t>
+            </w:r>
+          </w:p>
+        </w:tc>
+      </w:tr>
+    </w:tbl>
+    <w:p>
+      <w:pPr>
+        <w:spacing w:after="100"/>
+        <w:jc w:val="center"/>
+      </w:pPr>
+      <w:r>
+        <w:rPr>
+          <w:rFonts w:ascii="Arial" w:cs="Arial" w:eastAsia="Arial" w:hAnsi="Arial"/>
+          <w:color w:val="AAAAAA"/>
+          <w:sz w:val="18"/>
+          <w:szCs w:val="18"/>
+        </w:rPr>
+        <w:t xml:space="preserve">✂ - - - - - - - - - - - - - - - - - - - - - - - - - - - - - - - - - - - - ✂</w:t>
+      </w:r>
+    </w:p>
+    <w:p>
+      <w:r>
+        <w:br w:type="page"/>
+      </w:r>
+    </w:p>
+    <w:p>
+      <w:pPr>
+        <w:pStyle w:val="Heading1"/>
+      </w:pPr>
+      <w:r>
+        <w:t xml:space="preserve">Coalitieakkoord Template</w:t>
+      </w:r>
+    </w:p>
+    <w:p>
+      <w:pPr>
+        <w:spacing w:after="120"/>
+      </w:pPr>
+      <w:r>
+        <w:t xml:space="preserve">Vul in als de coalitie gevormd is! Alle coalitiepartijen ondertekenen.</w:t>
+      </w:r>
+    </w:p>
+    <w:p>
+      <w:pPr>
+        <w:spacing w:after="80"/>
+      </w:pPr>
+    </w:p>
+    <w:tbl>
+      <w:tblPr>
+        <w:tblW w:type="pct" w:w="100%"/>
+        <w:tblBorders>
+          <w:top w:val="single" w:color="auto" w:sz="4"/>
+          <w:left w:val="single" w:color="auto" w:sz="4"/>
+          <w:bottom w:val="single" w:color="auto" w:sz="4"/>
+          <w:right w:val="single" w:color="auto" w:sz="4"/>
+          <w:insideH w:val="single" w:color="auto" w:sz="4"/>
+          <w:insideV w:val="single" w:color="auto" w:sz="4"/>
+        </w:tblBorders>
+      </w:tblPr>
+      <w:tblGrid>
+        <w:gridCol w:w="9026"/>
+      </w:tblGrid>
+      <w:tr>
+        <w:tc>
+          <w:tcPr>
+            <w:tcW w:type="dxa" w:w="9026"/>
+            <w:tcBorders>
+              <w:top w:val="single" w:color="1B3A5C" w:sz="2"/>
+              <w:left w:val="single" w:color="FF6B00" w:sz="6"/>
+              <w:bottom w:val="single" w:color="1B3A5C" w:sz="2"/>
+              <w:right w:val="single" w:color="1B3A5C" w:sz="2"/>
+            </w:tcBorders>
+            <w:shd w:fill="FFFFFF" w:val="clear"/>
+            <w:tcMar>
+              <w:top w:type="dxa" w:w="120"/>
+              <w:left w:type="dxa" w:w="200"/>
+              <w:bottom w:type="dxa" w:w="120"/>
+              <w:right w:type="dxa" w:w="200"/>
+            </w:tcMar>
+          </w:tcPr>
+          <w:p>
+            <w:pPr>
+              <w:spacing w:after="200"/>
+              <w:jc w:val="center"/>
+            </w:pPr>
+            <w:r>
+              <w:rPr>
+                <w:rFonts w:ascii="Arial" w:cs="Arial" w:eastAsia="Arial" w:hAnsi="Arial"/>
+                <w:b/>
+                <w:bCs/>
+                <w:color w:val="1B3A5C"/>
+                <w:sz w:val="32"/>
+                <w:szCs w:val="32"/>
+              </w:rPr>
               <w:t xml:space="preserve">COALITIEAKKOORD 2026</w:t>
             </w:r>
           </w:p>
@@ -13800,7 +14449,7 @@
                 <w:sz w:val="22"/>
                 <w:szCs w:val="22"/>
               </w:rPr>
-              <w:t xml:space="preserve">____________________________    ____________________________</w:t>
+              <w:t xml:space="preserve">____________________________  ____________________________</w:t>
             </w:r>
           </w:p>
           <w:p>
@@ -13813,7 +14462,7 @@
                 <w:sz w:val="22"/>
                 <w:szCs w:val="22"/>
               </w:rPr>
-              <w:t xml:space="preserve">____________________________    ____________________________</w:t>
+              <w:t xml:space="preserve">____________________________  ____________________________</w:t>
             </w:r>
           </w:p>
           <w:p>
@@ -13826,7 +14475,7 @@
                 <w:sz w:val="22"/>
                 <w:szCs w:val="22"/>
               </w:rPr>
-              <w:t xml:space="preserve">____________________________    ____________________________</w:t>
+              <w:t xml:space="preserve">____________________________  ____________________________</w:t>
             </w:r>
           </w:p>
           <w:p>
@@ -13839,7 +14488,7 @@
                 <w:sz w:val="22"/>
                 <w:szCs w:val="22"/>
               </w:rPr>
-              <w:t xml:space="preserve">____________________________    ____________________________</w:t>
+              <w:t xml:space="preserve">____________________________  ____________________________</w:t>
             </w:r>
           </w:p>
           <w:p>
@@ -13852,7 +14501,7 @@
                 <w:sz w:val="22"/>
                 <w:szCs w:val="22"/>
               </w:rPr>
-              <w:t xml:space="preserve">____________________________    ____________________________</w:t>
+              <w:t xml:space="preserve">____________________________  ____________________________</w:t>
             </w:r>
           </w:p>
         </w:tc>
@@ -16500,6 +17149,1276 @@
                 <w:szCs w:val="18"/>
               </w:rPr>
               <w:t xml:space="preserve">PAN</w:t>
+            </w:r>
+          </w:p>
+        </w:tc>
+        <w:tc>
+          <w:tcPr>
+            <w:tcW w:type="dxa" w:w="900"/>
+            <w:tcBorders>
+              <w:top w:val="single" w:color="DDDDDD" w:sz="1"/>
+              <w:left w:val="single" w:color="DDDDDD" w:sz="1"/>
+              <w:bottom w:val="single" w:color="DDDDDD" w:sz="1"/>
+              <w:right w:val="single" w:color="DDDDDD" w:sz="1"/>
+            </w:tcBorders>
+            <w:shd w:fill="FFFFFF" w:val="clear"/>
+            <w:tcMar>
+              <w:top w:type="dxa" w:w="80"/>
+              <w:left w:type="dxa" w:w="120"/>
+              <w:bottom w:type="dxa" w:w="80"/>
+              <w:right w:type="dxa" w:w="120"/>
+            </w:tcMar>
+          </w:tcPr>
+          <w:p>
+            <w:r>
+              <w:rPr>
+                <w:rFonts w:ascii="Arial" w:cs="Arial" w:eastAsia="Arial" w:hAnsi="Arial"/>
+                <w:sz w:val="18"/>
+                <w:szCs w:val="18"/>
+              </w:rPr>
+              <w:t xml:space="preserve"/>
+            </w:r>
+          </w:p>
+        </w:tc>
+        <w:tc>
+          <w:tcPr>
+            <w:tcW w:type="dxa" w:w="900"/>
+            <w:tcBorders>
+              <w:top w:val="single" w:color="DDDDDD" w:sz="1"/>
+              <w:left w:val="single" w:color="DDDDDD" w:sz="1"/>
+              <w:bottom w:val="single" w:color="DDDDDD" w:sz="1"/>
+              <w:right w:val="single" w:color="DDDDDD" w:sz="1"/>
+            </w:tcBorders>
+            <w:shd w:fill="FFFFFF" w:val="clear"/>
+            <w:tcMar>
+              <w:top w:type="dxa" w:w="80"/>
+              <w:left w:type="dxa" w:w="120"/>
+              <w:bottom w:type="dxa" w:w="80"/>
+              <w:right w:type="dxa" w:w="120"/>
+            </w:tcMar>
+          </w:tcPr>
+          <w:p>
+            <w:r>
+              <w:rPr>
+                <w:rFonts w:ascii="Arial" w:cs="Arial" w:eastAsia="Arial" w:hAnsi="Arial"/>
+                <w:sz w:val="18"/>
+                <w:szCs w:val="18"/>
+              </w:rPr>
+              <w:t xml:space="preserve"/>
+            </w:r>
+          </w:p>
+        </w:tc>
+        <w:tc>
+          <w:tcPr>
+            <w:tcW w:type="dxa" w:w="900"/>
+            <w:tcBorders>
+              <w:top w:val="single" w:color="DDDDDD" w:sz="1"/>
+              <w:left w:val="single" w:color="DDDDDD" w:sz="1"/>
+              <w:bottom w:val="single" w:color="DDDDDD" w:sz="1"/>
+              <w:right w:val="single" w:color="DDDDDD" w:sz="1"/>
+            </w:tcBorders>
+            <w:shd w:fill="FFFFFF" w:val="clear"/>
+            <w:tcMar>
+              <w:top w:type="dxa" w:w="80"/>
+              <w:left w:type="dxa" w:w="120"/>
+              <w:bottom w:type="dxa" w:w="80"/>
+              <w:right w:type="dxa" w:w="120"/>
+            </w:tcMar>
+          </w:tcPr>
+          <w:p>
+            <w:r>
+              <w:rPr>
+                <w:rFonts w:ascii="Arial" w:cs="Arial" w:eastAsia="Arial" w:hAnsi="Arial"/>
+                <w:sz w:val="18"/>
+                <w:szCs w:val="18"/>
+              </w:rPr>
+              <w:t xml:space="preserve"/>
+            </w:r>
+          </w:p>
+        </w:tc>
+        <w:tc>
+          <w:tcPr>
+            <w:tcW w:type="dxa" w:w="1000"/>
+            <w:tcBorders>
+              <w:top w:val="single" w:color="DDDDDD" w:sz="1"/>
+              <w:left w:val="single" w:color="DDDDDD" w:sz="1"/>
+              <w:bottom w:val="single" w:color="DDDDDD" w:sz="1"/>
+              <w:right w:val="single" w:color="DDDDDD" w:sz="1"/>
+            </w:tcBorders>
+            <w:shd w:fill="FFFFFF" w:val="clear"/>
+            <w:tcMar>
+              <w:top w:type="dxa" w:w="80"/>
+              <w:left w:type="dxa" w:w="120"/>
+              <w:bottom w:type="dxa" w:w="80"/>
+              <w:right w:type="dxa" w:w="120"/>
+            </w:tcMar>
+          </w:tcPr>
+          <w:p>
+            <w:r>
+              <w:rPr>
+                <w:rFonts w:ascii="Arial" w:cs="Arial" w:eastAsia="Arial" w:hAnsi="Arial"/>
+                <w:sz w:val="18"/>
+                <w:szCs w:val="18"/>
+              </w:rPr>
+              <w:t xml:space="preserve"/>
+            </w:r>
+          </w:p>
+        </w:tc>
+        <w:tc>
+          <w:tcPr>
+            <w:tcW w:type="dxa" w:w="900"/>
+            <w:tcBorders>
+              <w:top w:val="single" w:color="DDDDDD" w:sz="1"/>
+              <w:left w:val="single" w:color="DDDDDD" w:sz="1"/>
+              <w:bottom w:val="single" w:color="DDDDDD" w:sz="1"/>
+              <w:right w:val="single" w:color="DDDDDD" w:sz="1"/>
+            </w:tcBorders>
+            <w:shd w:fill="FFFFFF" w:val="clear"/>
+            <w:tcMar>
+              <w:top w:type="dxa" w:w="80"/>
+              <w:left w:type="dxa" w:w="120"/>
+              <w:bottom w:type="dxa" w:w="80"/>
+              <w:right w:type="dxa" w:w="120"/>
+            </w:tcMar>
+          </w:tcPr>
+          <w:p>
+            <w:r>
+              <w:rPr>
+                <w:rFonts w:ascii="Arial" w:cs="Arial" w:eastAsia="Arial" w:hAnsi="Arial"/>
+                <w:sz w:val="18"/>
+                <w:szCs w:val="18"/>
+              </w:rPr>
+              <w:t xml:space="preserve"/>
+            </w:r>
+          </w:p>
+        </w:tc>
+        <w:tc>
+          <w:tcPr>
+            <w:tcW w:type="dxa" w:w="1000"/>
+            <w:tcBorders>
+              <w:top w:val="single" w:color="DDDDDD" w:sz="1"/>
+              <w:left w:val="single" w:color="DDDDDD" w:sz="1"/>
+              <w:bottom w:val="single" w:color="DDDDDD" w:sz="1"/>
+              <w:right w:val="single" w:color="DDDDDD" w:sz="1"/>
+            </w:tcBorders>
+            <w:shd w:fill="FFFFFF" w:val="clear"/>
+            <w:tcMar>
+              <w:top w:type="dxa" w:w="80"/>
+              <w:left w:type="dxa" w:w="120"/>
+              <w:bottom w:type="dxa" w:w="80"/>
+              <w:right w:type="dxa" w:w="120"/>
+            </w:tcMar>
+          </w:tcPr>
+          <w:p>
+            <w:r>
+              <w:rPr>
+                <w:rFonts w:ascii="Arial" w:cs="Arial" w:eastAsia="Arial" w:hAnsi="Arial"/>
+                <w:sz w:val="18"/>
+                <w:szCs w:val="18"/>
+              </w:rPr>
+              <w:t xml:space="preserve"/>
+            </w:r>
+          </w:p>
+        </w:tc>
+        <w:tc>
+          <w:tcPr>
+            <w:tcW w:type="dxa" w:w="900"/>
+            <w:tcBorders>
+              <w:top w:val="single" w:color="DDDDDD" w:sz="1"/>
+              <w:left w:val="single" w:color="DDDDDD" w:sz="1"/>
+              <w:bottom w:val="single" w:color="DDDDDD" w:sz="1"/>
+              <w:right w:val="single" w:color="DDDDDD" w:sz="1"/>
+            </w:tcBorders>
+            <w:shd w:fill="FFFFFF" w:val="clear"/>
+            <w:tcMar>
+              <w:top w:type="dxa" w:w="80"/>
+              <w:left w:type="dxa" w:w="120"/>
+              <w:bottom w:type="dxa" w:w="80"/>
+              <w:right w:type="dxa" w:w="120"/>
+            </w:tcMar>
+          </w:tcPr>
+          <w:p>
+            <w:r>
+              <w:rPr>
+                <w:rFonts w:ascii="Arial" w:cs="Arial" w:eastAsia="Arial" w:hAnsi="Arial"/>
+                <w:sz w:val="18"/>
+                <w:szCs w:val="18"/>
+              </w:rPr>
+              <w:t xml:space="preserve"/>
+            </w:r>
+          </w:p>
+        </w:tc>
+        <w:tc>
+          <w:tcPr>
+            <w:tcW w:type="dxa" w:w="900"/>
+            <w:tcBorders>
+              <w:top w:val="single" w:color="DDDDDD" w:sz="1"/>
+              <w:left w:val="single" w:color="DDDDDD" w:sz="1"/>
+              <w:bottom w:val="single" w:color="DDDDDD" w:sz="1"/>
+              <w:right w:val="single" w:color="DDDDDD" w:sz="1"/>
+            </w:tcBorders>
+            <w:shd w:fill="FFFFFF" w:val="clear"/>
+            <w:tcMar>
+              <w:top w:type="dxa" w:w="80"/>
+              <w:left w:type="dxa" w:w="120"/>
+              <w:bottom w:type="dxa" w:w="80"/>
+              <w:right w:type="dxa" w:w="120"/>
+            </w:tcMar>
+          </w:tcPr>
+          <w:p>
+            <w:r>
+              <w:rPr>
+                <w:rFonts w:ascii="Arial" w:cs="Arial" w:eastAsia="Arial" w:hAnsi="Arial"/>
+                <w:sz w:val="18"/>
+                <w:szCs w:val="18"/>
+              </w:rPr>
+              <w:t xml:space="preserve"/>
+            </w:r>
+          </w:p>
+        </w:tc>
+      </w:tr>
+      <w:tr>
+        <w:tc>
+          <w:tcPr>
+            <w:tcW w:type="dxa" w:w="900"/>
+            <w:tcBorders>
+              <w:top w:val="single" w:color="DDDDDD" w:sz="1"/>
+              <w:left w:val="single" w:color="DDDDDD" w:sz="1"/>
+              <w:bottom w:val="single" w:color="DDDDDD" w:sz="1"/>
+              <w:right w:val="single" w:color="DDDDDD" w:sz="1"/>
+            </w:tcBorders>
+            <w:shd w:fill="FFFFFF" w:val="clear"/>
+            <w:tcMar>
+              <w:top w:type="dxa" w:w="80"/>
+              <w:left w:type="dxa" w:w="120"/>
+              <w:bottom w:type="dxa" w:w="80"/>
+              <w:right w:type="dxa" w:w="120"/>
+            </w:tcMar>
+          </w:tcPr>
+          <w:p>
+            <w:r>
+              <w:rPr>
+                <w:rFonts w:ascii="Arial" w:cs="Arial" w:eastAsia="Arial" w:hAnsi="Arial"/>
+                <w:sz w:val="18"/>
+                <w:szCs w:val="18"/>
+              </w:rPr>
+              <w:t xml:space="preserve">OMA</w:t>
+            </w:r>
+          </w:p>
+        </w:tc>
+        <w:tc>
+          <w:tcPr>
+            <w:tcW w:type="dxa" w:w="900"/>
+            <w:tcBorders>
+              <w:top w:val="single" w:color="DDDDDD" w:sz="1"/>
+              <w:left w:val="single" w:color="DDDDDD" w:sz="1"/>
+              <w:bottom w:val="single" w:color="DDDDDD" w:sz="1"/>
+              <w:right w:val="single" w:color="DDDDDD" w:sz="1"/>
+            </w:tcBorders>
+            <w:shd w:fill="FFFFFF" w:val="clear"/>
+            <w:tcMar>
+              <w:top w:type="dxa" w:w="80"/>
+              <w:left w:type="dxa" w:w="120"/>
+              <w:bottom w:type="dxa" w:w="80"/>
+              <w:right w:type="dxa" w:w="120"/>
+            </w:tcMar>
+          </w:tcPr>
+          <w:p>
+            <w:r>
+              <w:rPr>
+                <w:rFonts w:ascii="Arial" w:cs="Arial" w:eastAsia="Arial" w:hAnsi="Arial"/>
+                <w:sz w:val="18"/>
+                <w:szCs w:val="18"/>
+              </w:rPr>
+              <w:t xml:space="preserve"/>
+            </w:r>
+          </w:p>
+        </w:tc>
+        <w:tc>
+          <w:tcPr>
+            <w:tcW w:type="dxa" w:w="900"/>
+            <w:tcBorders>
+              <w:top w:val="single" w:color="DDDDDD" w:sz="1"/>
+              <w:left w:val="single" w:color="DDDDDD" w:sz="1"/>
+              <w:bottom w:val="single" w:color="DDDDDD" w:sz="1"/>
+              <w:right w:val="single" w:color="DDDDDD" w:sz="1"/>
+            </w:tcBorders>
+            <w:shd w:fill="FFFFFF" w:val="clear"/>
+            <w:tcMar>
+              <w:top w:type="dxa" w:w="80"/>
+              <w:left w:type="dxa" w:w="120"/>
+              <w:bottom w:type="dxa" w:w="80"/>
+              <w:right w:type="dxa" w:w="120"/>
+            </w:tcMar>
+          </w:tcPr>
+          <w:p>
+            <w:r>
+              <w:rPr>
+                <w:rFonts w:ascii="Arial" w:cs="Arial" w:eastAsia="Arial" w:hAnsi="Arial"/>
+                <w:sz w:val="18"/>
+                <w:szCs w:val="18"/>
+              </w:rPr>
+              <w:t xml:space="preserve"/>
+            </w:r>
+          </w:p>
+        </w:tc>
+        <w:tc>
+          <w:tcPr>
+            <w:tcW w:type="dxa" w:w="900"/>
+            <w:tcBorders>
+              <w:top w:val="single" w:color="DDDDDD" w:sz="1"/>
+              <w:left w:val="single" w:color="DDDDDD" w:sz="1"/>
+              <w:bottom w:val="single" w:color="DDDDDD" w:sz="1"/>
+              <w:right w:val="single" w:color="DDDDDD" w:sz="1"/>
+            </w:tcBorders>
+            <w:shd w:fill="FFFFFF" w:val="clear"/>
+            <w:tcMar>
+              <w:top w:type="dxa" w:w="80"/>
+              <w:left w:type="dxa" w:w="120"/>
+              <w:bottom w:type="dxa" w:w="80"/>
+              <w:right w:type="dxa" w:w="120"/>
+            </w:tcMar>
+          </w:tcPr>
+          <w:p>
+            <w:r>
+              <w:rPr>
+                <w:rFonts w:ascii="Arial" w:cs="Arial" w:eastAsia="Arial" w:hAnsi="Arial"/>
+                <w:sz w:val="18"/>
+                <w:szCs w:val="18"/>
+              </w:rPr>
+              <w:t xml:space="preserve"/>
+            </w:r>
+          </w:p>
+        </w:tc>
+        <w:tc>
+          <w:tcPr>
+            <w:tcW w:type="dxa" w:w="1000"/>
+            <w:tcBorders>
+              <w:top w:val="single" w:color="DDDDDD" w:sz="1"/>
+              <w:left w:val="single" w:color="DDDDDD" w:sz="1"/>
+              <w:bottom w:val="single" w:color="DDDDDD" w:sz="1"/>
+              <w:right w:val="single" w:color="DDDDDD" w:sz="1"/>
+            </w:tcBorders>
+            <w:shd w:fill="FFFFFF" w:val="clear"/>
+            <w:tcMar>
+              <w:top w:type="dxa" w:w="80"/>
+              <w:left w:type="dxa" w:w="120"/>
+              <w:bottom w:type="dxa" w:w="80"/>
+              <w:right w:type="dxa" w:w="120"/>
+            </w:tcMar>
+          </w:tcPr>
+          <w:p>
+            <w:r>
+              <w:rPr>
+                <w:rFonts w:ascii="Arial" w:cs="Arial" w:eastAsia="Arial" w:hAnsi="Arial"/>
+                <w:sz w:val="18"/>
+                <w:szCs w:val="18"/>
+              </w:rPr>
+              <w:t xml:space="preserve"/>
+            </w:r>
+          </w:p>
+        </w:tc>
+        <w:tc>
+          <w:tcPr>
+            <w:tcW w:type="dxa" w:w="900"/>
+            <w:tcBorders>
+              <w:top w:val="single" w:color="DDDDDD" w:sz="1"/>
+              <w:left w:val="single" w:color="DDDDDD" w:sz="1"/>
+              <w:bottom w:val="single" w:color="DDDDDD" w:sz="1"/>
+              <w:right w:val="single" w:color="DDDDDD" w:sz="1"/>
+            </w:tcBorders>
+            <w:shd w:fill="FFFFFF" w:val="clear"/>
+            <w:tcMar>
+              <w:top w:type="dxa" w:w="80"/>
+              <w:left w:type="dxa" w:w="120"/>
+              <w:bottom w:type="dxa" w:w="80"/>
+              <w:right w:type="dxa" w:w="120"/>
+            </w:tcMar>
+          </w:tcPr>
+          <w:p>
+            <w:r>
+              <w:rPr>
+                <w:rFonts w:ascii="Arial" w:cs="Arial" w:eastAsia="Arial" w:hAnsi="Arial"/>
+                <w:sz w:val="18"/>
+                <w:szCs w:val="18"/>
+              </w:rPr>
+              <w:t xml:space="preserve"/>
+            </w:r>
+          </w:p>
+        </w:tc>
+        <w:tc>
+          <w:tcPr>
+            <w:tcW w:type="dxa" w:w="1000"/>
+            <w:tcBorders>
+              <w:top w:val="single" w:color="DDDDDD" w:sz="1"/>
+              <w:left w:val="single" w:color="DDDDDD" w:sz="1"/>
+              <w:bottom w:val="single" w:color="DDDDDD" w:sz="1"/>
+              <w:right w:val="single" w:color="DDDDDD" w:sz="1"/>
+            </w:tcBorders>
+            <w:shd w:fill="FFFFFF" w:val="clear"/>
+            <w:tcMar>
+              <w:top w:type="dxa" w:w="80"/>
+              <w:left w:type="dxa" w:w="120"/>
+              <w:bottom w:type="dxa" w:w="80"/>
+              <w:right w:type="dxa" w:w="120"/>
+            </w:tcMar>
+          </w:tcPr>
+          <w:p>
+            <w:r>
+              <w:rPr>
+                <w:rFonts w:ascii="Arial" w:cs="Arial" w:eastAsia="Arial" w:hAnsi="Arial"/>
+                <w:sz w:val="18"/>
+                <w:szCs w:val="18"/>
+              </w:rPr>
+              <w:t xml:space="preserve"/>
+            </w:r>
+          </w:p>
+        </w:tc>
+        <w:tc>
+          <w:tcPr>
+            <w:tcW w:type="dxa" w:w="900"/>
+            <w:tcBorders>
+              <w:top w:val="single" w:color="DDDDDD" w:sz="1"/>
+              <w:left w:val="single" w:color="DDDDDD" w:sz="1"/>
+              <w:bottom w:val="single" w:color="DDDDDD" w:sz="1"/>
+              <w:right w:val="single" w:color="DDDDDD" w:sz="1"/>
+            </w:tcBorders>
+            <w:shd w:fill="FFFFFF" w:val="clear"/>
+            <w:tcMar>
+              <w:top w:type="dxa" w:w="80"/>
+              <w:left w:type="dxa" w:w="120"/>
+              <w:bottom w:type="dxa" w:w="80"/>
+              <w:right w:type="dxa" w:w="120"/>
+            </w:tcMar>
+          </w:tcPr>
+          <w:p>
+            <w:r>
+              <w:rPr>
+                <w:rFonts w:ascii="Arial" w:cs="Arial" w:eastAsia="Arial" w:hAnsi="Arial"/>
+                <w:sz w:val="18"/>
+                <w:szCs w:val="18"/>
+              </w:rPr>
+              <w:t xml:space="preserve"/>
+            </w:r>
+          </w:p>
+        </w:tc>
+        <w:tc>
+          <w:tcPr>
+            <w:tcW w:type="dxa" w:w="900"/>
+            <w:tcBorders>
+              <w:top w:val="single" w:color="DDDDDD" w:sz="1"/>
+              <w:left w:val="single" w:color="DDDDDD" w:sz="1"/>
+              <w:bottom w:val="single" w:color="DDDDDD" w:sz="1"/>
+              <w:right w:val="single" w:color="DDDDDD" w:sz="1"/>
+            </w:tcBorders>
+            <w:shd w:fill="FFFFFF" w:val="clear"/>
+            <w:tcMar>
+              <w:top w:type="dxa" w:w="80"/>
+              <w:left w:type="dxa" w:w="120"/>
+              <w:bottom w:type="dxa" w:w="80"/>
+              <w:right w:type="dxa" w:w="120"/>
+            </w:tcMar>
+          </w:tcPr>
+          <w:p>
+            <w:r>
+              <w:rPr>
+                <w:rFonts w:ascii="Arial" w:cs="Arial" w:eastAsia="Arial" w:hAnsi="Arial"/>
+                <w:sz w:val="18"/>
+                <w:szCs w:val="18"/>
+              </w:rPr>
+              <w:t xml:space="preserve"/>
+            </w:r>
+          </w:p>
+        </w:tc>
+      </w:tr>
+      <w:tr>
+        <w:tc>
+          <w:tcPr>
+            <w:tcW w:type="dxa" w:w="900"/>
+            <w:tcBorders>
+              <w:top w:val="single" w:color="DDDDDD" w:sz="1"/>
+              <w:left w:val="single" w:color="DDDDDD" w:sz="1"/>
+              <w:bottom w:val="single" w:color="DDDDDD" w:sz="1"/>
+              <w:right w:val="single" w:color="DDDDDD" w:sz="1"/>
+            </w:tcBorders>
+            <w:shd w:fill="FFFFFF" w:val="clear"/>
+            <w:tcMar>
+              <w:top w:type="dxa" w:w="80"/>
+              <w:left w:type="dxa" w:w="120"/>
+              <w:bottom w:type="dxa" w:w="80"/>
+              <w:right w:type="dxa" w:w="120"/>
+            </w:tcMar>
+          </w:tcPr>
+          <w:p>
+            <w:r>
+              <w:rPr>
+                <w:rFonts w:ascii="Arial" w:cs="Arial" w:eastAsia="Arial" w:hAnsi="Arial"/>
+                <w:sz w:val="18"/>
+                <w:szCs w:val="18"/>
+              </w:rPr>
+              <w:t xml:space="preserve">BNB</w:t>
+            </w:r>
+          </w:p>
+        </w:tc>
+        <w:tc>
+          <w:tcPr>
+            <w:tcW w:type="dxa" w:w="900"/>
+            <w:tcBorders>
+              <w:top w:val="single" w:color="DDDDDD" w:sz="1"/>
+              <w:left w:val="single" w:color="DDDDDD" w:sz="1"/>
+              <w:bottom w:val="single" w:color="DDDDDD" w:sz="1"/>
+              <w:right w:val="single" w:color="DDDDDD" w:sz="1"/>
+            </w:tcBorders>
+            <w:shd w:fill="FFFFFF" w:val="clear"/>
+            <w:tcMar>
+              <w:top w:type="dxa" w:w="80"/>
+              <w:left w:type="dxa" w:w="120"/>
+              <w:bottom w:type="dxa" w:w="80"/>
+              <w:right w:type="dxa" w:w="120"/>
+            </w:tcMar>
+          </w:tcPr>
+          <w:p>
+            <w:r>
+              <w:rPr>
+                <w:rFonts w:ascii="Arial" w:cs="Arial" w:eastAsia="Arial" w:hAnsi="Arial"/>
+                <w:sz w:val="18"/>
+                <w:szCs w:val="18"/>
+              </w:rPr>
+              <w:t xml:space="preserve"/>
+            </w:r>
+          </w:p>
+        </w:tc>
+        <w:tc>
+          <w:tcPr>
+            <w:tcW w:type="dxa" w:w="900"/>
+            <w:tcBorders>
+              <w:top w:val="single" w:color="DDDDDD" w:sz="1"/>
+              <w:left w:val="single" w:color="DDDDDD" w:sz="1"/>
+              <w:bottom w:val="single" w:color="DDDDDD" w:sz="1"/>
+              <w:right w:val="single" w:color="DDDDDD" w:sz="1"/>
+            </w:tcBorders>
+            <w:shd w:fill="FFFFFF" w:val="clear"/>
+            <w:tcMar>
+              <w:top w:type="dxa" w:w="80"/>
+              <w:left w:type="dxa" w:w="120"/>
+              <w:bottom w:type="dxa" w:w="80"/>
+              <w:right w:type="dxa" w:w="120"/>
+            </w:tcMar>
+          </w:tcPr>
+          <w:p>
+            <w:r>
+              <w:rPr>
+                <w:rFonts w:ascii="Arial" w:cs="Arial" w:eastAsia="Arial" w:hAnsi="Arial"/>
+                <w:sz w:val="18"/>
+                <w:szCs w:val="18"/>
+              </w:rPr>
+              <w:t xml:space="preserve"/>
+            </w:r>
+          </w:p>
+        </w:tc>
+        <w:tc>
+          <w:tcPr>
+            <w:tcW w:type="dxa" w:w="900"/>
+            <w:tcBorders>
+              <w:top w:val="single" w:color="DDDDDD" w:sz="1"/>
+              <w:left w:val="single" w:color="DDDDDD" w:sz="1"/>
+              <w:bottom w:val="single" w:color="DDDDDD" w:sz="1"/>
+              <w:right w:val="single" w:color="DDDDDD" w:sz="1"/>
+            </w:tcBorders>
+            <w:shd w:fill="FFFFFF" w:val="clear"/>
+            <w:tcMar>
+              <w:top w:type="dxa" w:w="80"/>
+              <w:left w:type="dxa" w:w="120"/>
+              <w:bottom w:type="dxa" w:w="80"/>
+              <w:right w:type="dxa" w:w="120"/>
+            </w:tcMar>
+          </w:tcPr>
+          <w:p>
+            <w:r>
+              <w:rPr>
+                <w:rFonts w:ascii="Arial" w:cs="Arial" w:eastAsia="Arial" w:hAnsi="Arial"/>
+                <w:sz w:val="18"/>
+                <w:szCs w:val="18"/>
+              </w:rPr>
+              <w:t xml:space="preserve"/>
+            </w:r>
+          </w:p>
+        </w:tc>
+        <w:tc>
+          <w:tcPr>
+            <w:tcW w:type="dxa" w:w="1000"/>
+            <w:tcBorders>
+              <w:top w:val="single" w:color="DDDDDD" w:sz="1"/>
+              <w:left w:val="single" w:color="DDDDDD" w:sz="1"/>
+              <w:bottom w:val="single" w:color="DDDDDD" w:sz="1"/>
+              <w:right w:val="single" w:color="DDDDDD" w:sz="1"/>
+            </w:tcBorders>
+            <w:shd w:fill="FFFFFF" w:val="clear"/>
+            <w:tcMar>
+              <w:top w:type="dxa" w:w="80"/>
+              <w:left w:type="dxa" w:w="120"/>
+              <w:bottom w:type="dxa" w:w="80"/>
+              <w:right w:type="dxa" w:w="120"/>
+            </w:tcMar>
+          </w:tcPr>
+          <w:p>
+            <w:r>
+              <w:rPr>
+                <w:rFonts w:ascii="Arial" w:cs="Arial" w:eastAsia="Arial" w:hAnsi="Arial"/>
+                <w:sz w:val="18"/>
+                <w:szCs w:val="18"/>
+              </w:rPr>
+              <w:t xml:space="preserve"/>
+            </w:r>
+          </w:p>
+        </w:tc>
+        <w:tc>
+          <w:tcPr>
+            <w:tcW w:type="dxa" w:w="900"/>
+            <w:tcBorders>
+              <w:top w:val="single" w:color="DDDDDD" w:sz="1"/>
+              <w:left w:val="single" w:color="DDDDDD" w:sz="1"/>
+              <w:bottom w:val="single" w:color="DDDDDD" w:sz="1"/>
+              <w:right w:val="single" w:color="DDDDDD" w:sz="1"/>
+            </w:tcBorders>
+            <w:shd w:fill="FFFFFF" w:val="clear"/>
+            <w:tcMar>
+              <w:top w:type="dxa" w:w="80"/>
+              <w:left w:type="dxa" w:w="120"/>
+              <w:bottom w:type="dxa" w:w="80"/>
+              <w:right w:type="dxa" w:w="120"/>
+            </w:tcMar>
+          </w:tcPr>
+          <w:p>
+            <w:r>
+              <w:rPr>
+                <w:rFonts w:ascii="Arial" w:cs="Arial" w:eastAsia="Arial" w:hAnsi="Arial"/>
+                <w:sz w:val="18"/>
+                <w:szCs w:val="18"/>
+              </w:rPr>
+              <w:t xml:space="preserve"/>
+            </w:r>
+          </w:p>
+        </w:tc>
+        <w:tc>
+          <w:tcPr>
+            <w:tcW w:type="dxa" w:w="1000"/>
+            <w:tcBorders>
+              <w:top w:val="single" w:color="DDDDDD" w:sz="1"/>
+              <w:left w:val="single" w:color="DDDDDD" w:sz="1"/>
+              <w:bottom w:val="single" w:color="DDDDDD" w:sz="1"/>
+              <w:right w:val="single" w:color="DDDDDD" w:sz="1"/>
+            </w:tcBorders>
+            <w:shd w:fill="FFFFFF" w:val="clear"/>
+            <w:tcMar>
+              <w:top w:type="dxa" w:w="80"/>
+              <w:left w:type="dxa" w:w="120"/>
+              <w:bottom w:type="dxa" w:w="80"/>
+              <w:right w:type="dxa" w:w="120"/>
+            </w:tcMar>
+          </w:tcPr>
+          <w:p>
+            <w:r>
+              <w:rPr>
+                <w:rFonts w:ascii="Arial" w:cs="Arial" w:eastAsia="Arial" w:hAnsi="Arial"/>
+                <w:sz w:val="18"/>
+                <w:szCs w:val="18"/>
+              </w:rPr>
+              <w:t xml:space="preserve"/>
+            </w:r>
+          </w:p>
+        </w:tc>
+        <w:tc>
+          <w:tcPr>
+            <w:tcW w:type="dxa" w:w="900"/>
+            <w:tcBorders>
+              <w:top w:val="single" w:color="DDDDDD" w:sz="1"/>
+              <w:left w:val="single" w:color="DDDDDD" w:sz="1"/>
+              <w:bottom w:val="single" w:color="DDDDDD" w:sz="1"/>
+              <w:right w:val="single" w:color="DDDDDD" w:sz="1"/>
+            </w:tcBorders>
+            <w:shd w:fill="FFFFFF" w:val="clear"/>
+            <w:tcMar>
+              <w:top w:type="dxa" w:w="80"/>
+              <w:left w:type="dxa" w:w="120"/>
+              <w:bottom w:type="dxa" w:w="80"/>
+              <w:right w:type="dxa" w:w="120"/>
+            </w:tcMar>
+          </w:tcPr>
+          <w:p>
+            <w:r>
+              <w:rPr>
+                <w:rFonts w:ascii="Arial" w:cs="Arial" w:eastAsia="Arial" w:hAnsi="Arial"/>
+                <w:sz w:val="18"/>
+                <w:szCs w:val="18"/>
+              </w:rPr>
+              <w:t xml:space="preserve"/>
+            </w:r>
+          </w:p>
+        </w:tc>
+        <w:tc>
+          <w:tcPr>
+            <w:tcW w:type="dxa" w:w="900"/>
+            <w:tcBorders>
+              <w:top w:val="single" w:color="DDDDDD" w:sz="1"/>
+              <w:left w:val="single" w:color="DDDDDD" w:sz="1"/>
+              <w:bottom w:val="single" w:color="DDDDDD" w:sz="1"/>
+              <w:right w:val="single" w:color="DDDDDD" w:sz="1"/>
+            </w:tcBorders>
+            <w:shd w:fill="FFFFFF" w:val="clear"/>
+            <w:tcMar>
+              <w:top w:type="dxa" w:w="80"/>
+              <w:left w:type="dxa" w:w="120"/>
+              <w:bottom w:type="dxa" w:w="80"/>
+              <w:right w:type="dxa" w:w="120"/>
+            </w:tcMar>
+          </w:tcPr>
+          <w:p>
+            <w:r>
+              <w:rPr>
+                <w:rFonts w:ascii="Arial" w:cs="Arial" w:eastAsia="Arial" w:hAnsi="Arial"/>
+                <w:sz w:val="18"/>
+                <w:szCs w:val="18"/>
+              </w:rPr>
+              <w:t xml:space="preserve"/>
+            </w:r>
+          </w:p>
+        </w:tc>
+      </w:tr>
+      <w:tr>
+        <w:tc>
+          <w:tcPr>
+            <w:tcW w:type="dxa" w:w="900"/>
+            <w:tcBorders>
+              <w:top w:val="single" w:color="DDDDDD" w:sz="1"/>
+              <w:left w:val="single" w:color="DDDDDD" w:sz="1"/>
+              <w:bottom w:val="single" w:color="DDDDDD" w:sz="1"/>
+              <w:right w:val="single" w:color="DDDDDD" w:sz="1"/>
+            </w:tcBorders>
+            <w:shd w:fill="FFFFFF" w:val="clear"/>
+            <w:tcMar>
+              <w:top w:type="dxa" w:w="80"/>
+              <w:left w:type="dxa" w:w="120"/>
+              <w:bottom w:type="dxa" w:w="80"/>
+              <w:right w:type="dxa" w:w="120"/>
+            </w:tcMar>
+          </w:tcPr>
+          <w:p>
+            <w:r>
+              <w:rPr>
+                <w:rFonts w:ascii="Arial" w:cs="Arial" w:eastAsia="Arial" w:hAnsi="Arial"/>
+                <w:sz w:val="18"/>
+                <w:szCs w:val="18"/>
+              </w:rPr>
+              <w:t xml:space="preserve">WOK</w:t>
+            </w:r>
+          </w:p>
+        </w:tc>
+        <w:tc>
+          <w:tcPr>
+            <w:tcW w:type="dxa" w:w="900"/>
+            <w:tcBorders>
+              <w:top w:val="single" w:color="DDDDDD" w:sz="1"/>
+              <w:left w:val="single" w:color="DDDDDD" w:sz="1"/>
+              <w:bottom w:val="single" w:color="DDDDDD" w:sz="1"/>
+              <w:right w:val="single" w:color="DDDDDD" w:sz="1"/>
+            </w:tcBorders>
+            <w:shd w:fill="FFFFFF" w:val="clear"/>
+            <w:tcMar>
+              <w:top w:type="dxa" w:w="80"/>
+              <w:left w:type="dxa" w:w="120"/>
+              <w:bottom w:type="dxa" w:w="80"/>
+              <w:right w:type="dxa" w:w="120"/>
+            </w:tcMar>
+          </w:tcPr>
+          <w:p>
+            <w:r>
+              <w:rPr>
+                <w:rFonts w:ascii="Arial" w:cs="Arial" w:eastAsia="Arial" w:hAnsi="Arial"/>
+                <w:sz w:val="18"/>
+                <w:szCs w:val="18"/>
+              </w:rPr>
+              <w:t xml:space="preserve"/>
+            </w:r>
+          </w:p>
+        </w:tc>
+        <w:tc>
+          <w:tcPr>
+            <w:tcW w:type="dxa" w:w="900"/>
+            <w:tcBorders>
+              <w:top w:val="single" w:color="DDDDDD" w:sz="1"/>
+              <w:left w:val="single" w:color="DDDDDD" w:sz="1"/>
+              <w:bottom w:val="single" w:color="DDDDDD" w:sz="1"/>
+              <w:right w:val="single" w:color="DDDDDD" w:sz="1"/>
+            </w:tcBorders>
+            <w:shd w:fill="FFFFFF" w:val="clear"/>
+            <w:tcMar>
+              <w:top w:type="dxa" w:w="80"/>
+              <w:left w:type="dxa" w:w="120"/>
+              <w:bottom w:type="dxa" w:w="80"/>
+              <w:right w:type="dxa" w:w="120"/>
+            </w:tcMar>
+          </w:tcPr>
+          <w:p>
+            <w:r>
+              <w:rPr>
+                <w:rFonts w:ascii="Arial" w:cs="Arial" w:eastAsia="Arial" w:hAnsi="Arial"/>
+                <w:sz w:val="18"/>
+                <w:szCs w:val="18"/>
+              </w:rPr>
+              <w:t xml:space="preserve"/>
+            </w:r>
+          </w:p>
+        </w:tc>
+        <w:tc>
+          <w:tcPr>
+            <w:tcW w:type="dxa" w:w="900"/>
+            <w:tcBorders>
+              <w:top w:val="single" w:color="DDDDDD" w:sz="1"/>
+              <w:left w:val="single" w:color="DDDDDD" w:sz="1"/>
+              <w:bottom w:val="single" w:color="DDDDDD" w:sz="1"/>
+              <w:right w:val="single" w:color="DDDDDD" w:sz="1"/>
+            </w:tcBorders>
+            <w:shd w:fill="FFFFFF" w:val="clear"/>
+            <w:tcMar>
+              <w:top w:type="dxa" w:w="80"/>
+              <w:left w:type="dxa" w:w="120"/>
+              <w:bottom w:type="dxa" w:w="80"/>
+              <w:right w:type="dxa" w:w="120"/>
+            </w:tcMar>
+          </w:tcPr>
+          <w:p>
+            <w:r>
+              <w:rPr>
+                <w:rFonts w:ascii="Arial" w:cs="Arial" w:eastAsia="Arial" w:hAnsi="Arial"/>
+                <w:sz w:val="18"/>
+                <w:szCs w:val="18"/>
+              </w:rPr>
+              <w:t xml:space="preserve"/>
+            </w:r>
+          </w:p>
+        </w:tc>
+        <w:tc>
+          <w:tcPr>
+            <w:tcW w:type="dxa" w:w="1000"/>
+            <w:tcBorders>
+              <w:top w:val="single" w:color="DDDDDD" w:sz="1"/>
+              <w:left w:val="single" w:color="DDDDDD" w:sz="1"/>
+              <w:bottom w:val="single" w:color="DDDDDD" w:sz="1"/>
+              <w:right w:val="single" w:color="DDDDDD" w:sz="1"/>
+            </w:tcBorders>
+            <w:shd w:fill="FFFFFF" w:val="clear"/>
+            <w:tcMar>
+              <w:top w:type="dxa" w:w="80"/>
+              <w:left w:type="dxa" w:w="120"/>
+              <w:bottom w:type="dxa" w:w="80"/>
+              <w:right w:type="dxa" w:w="120"/>
+            </w:tcMar>
+          </w:tcPr>
+          <w:p>
+            <w:r>
+              <w:rPr>
+                <w:rFonts w:ascii="Arial" w:cs="Arial" w:eastAsia="Arial" w:hAnsi="Arial"/>
+                <w:sz w:val="18"/>
+                <w:szCs w:val="18"/>
+              </w:rPr>
+              <w:t xml:space="preserve"/>
+            </w:r>
+          </w:p>
+        </w:tc>
+        <w:tc>
+          <w:tcPr>
+            <w:tcW w:type="dxa" w:w="900"/>
+            <w:tcBorders>
+              <w:top w:val="single" w:color="DDDDDD" w:sz="1"/>
+              <w:left w:val="single" w:color="DDDDDD" w:sz="1"/>
+              <w:bottom w:val="single" w:color="DDDDDD" w:sz="1"/>
+              <w:right w:val="single" w:color="DDDDDD" w:sz="1"/>
+            </w:tcBorders>
+            <w:shd w:fill="FFFFFF" w:val="clear"/>
+            <w:tcMar>
+              <w:top w:type="dxa" w:w="80"/>
+              <w:left w:type="dxa" w:w="120"/>
+              <w:bottom w:type="dxa" w:w="80"/>
+              <w:right w:type="dxa" w:w="120"/>
+            </w:tcMar>
+          </w:tcPr>
+          <w:p>
+            <w:r>
+              <w:rPr>
+                <w:rFonts w:ascii="Arial" w:cs="Arial" w:eastAsia="Arial" w:hAnsi="Arial"/>
+                <w:sz w:val="18"/>
+                <w:szCs w:val="18"/>
+              </w:rPr>
+              <w:t xml:space="preserve"/>
+            </w:r>
+          </w:p>
+        </w:tc>
+        <w:tc>
+          <w:tcPr>
+            <w:tcW w:type="dxa" w:w="1000"/>
+            <w:tcBorders>
+              <w:top w:val="single" w:color="DDDDDD" w:sz="1"/>
+              <w:left w:val="single" w:color="DDDDDD" w:sz="1"/>
+              <w:bottom w:val="single" w:color="DDDDDD" w:sz="1"/>
+              <w:right w:val="single" w:color="DDDDDD" w:sz="1"/>
+            </w:tcBorders>
+            <w:shd w:fill="FFFFFF" w:val="clear"/>
+            <w:tcMar>
+              <w:top w:type="dxa" w:w="80"/>
+              <w:left w:type="dxa" w:w="120"/>
+              <w:bottom w:type="dxa" w:w="80"/>
+              <w:right w:type="dxa" w:w="120"/>
+            </w:tcMar>
+          </w:tcPr>
+          <w:p>
+            <w:r>
+              <w:rPr>
+                <w:rFonts w:ascii="Arial" w:cs="Arial" w:eastAsia="Arial" w:hAnsi="Arial"/>
+                <w:sz w:val="18"/>
+                <w:szCs w:val="18"/>
+              </w:rPr>
+              <w:t xml:space="preserve"/>
+            </w:r>
+          </w:p>
+        </w:tc>
+        <w:tc>
+          <w:tcPr>
+            <w:tcW w:type="dxa" w:w="900"/>
+            <w:tcBorders>
+              <w:top w:val="single" w:color="DDDDDD" w:sz="1"/>
+              <w:left w:val="single" w:color="DDDDDD" w:sz="1"/>
+              <w:bottom w:val="single" w:color="DDDDDD" w:sz="1"/>
+              <w:right w:val="single" w:color="DDDDDD" w:sz="1"/>
+            </w:tcBorders>
+            <w:shd w:fill="FFFFFF" w:val="clear"/>
+            <w:tcMar>
+              <w:top w:type="dxa" w:w="80"/>
+              <w:left w:type="dxa" w:w="120"/>
+              <w:bottom w:type="dxa" w:w="80"/>
+              <w:right w:type="dxa" w:w="120"/>
+            </w:tcMar>
+          </w:tcPr>
+          <w:p>
+            <w:r>
+              <w:rPr>
+                <w:rFonts w:ascii="Arial" w:cs="Arial" w:eastAsia="Arial" w:hAnsi="Arial"/>
+                <w:sz w:val="18"/>
+                <w:szCs w:val="18"/>
+              </w:rPr>
+              <w:t xml:space="preserve"/>
+            </w:r>
+          </w:p>
+        </w:tc>
+        <w:tc>
+          <w:tcPr>
+            <w:tcW w:type="dxa" w:w="900"/>
+            <w:tcBorders>
+              <w:top w:val="single" w:color="DDDDDD" w:sz="1"/>
+              <w:left w:val="single" w:color="DDDDDD" w:sz="1"/>
+              <w:bottom w:val="single" w:color="DDDDDD" w:sz="1"/>
+              <w:right w:val="single" w:color="DDDDDD" w:sz="1"/>
+            </w:tcBorders>
+            <w:shd w:fill="FFFFFF" w:val="clear"/>
+            <w:tcMar>
+              <w:top w:type="dxa" w:w="80"/>
+              <w:left w:type="dxa" w:w="120"/>
+              <w:bottom w:type="dxa" w:w="80"/>
+              <w:right w:type="dxa" w:w="120"/>
+            </w:tcMar>
+          </w:tcPr>
+          <w:p>
+            <w:r>
+              <w:rPr>
+                <w:rFonts w:ascii="Arial" w:cs="Arial" w:eastAsia="Arial" w:hAnsi="Arial"/>
+                <w:sz w:val="18"/>
+                <w:szCs w:val="18"/>
+              </w:rPr>
+              <w:t xml:space="preserve"/>
+            </w:r>
+          </w:p>
+        </w:tc>
+      </w:tr>
+      <w:tr>
+        <w:tc>
+          <w:tcPr>
+            <w:tcW w:type="dxa" w:w="900"/>
+            <w:tcBorders>
+              <w:top w:val="single" w:color="DDDDDD" w:sz="1"/>
+              <w:left w:val="single" w:color="DDDDDD" w:sz="1"/>
+              <w:bottom w:val="single" w:color="DDDDDD" w:sz="1"/>
+              <w:right w:val="single" w:color="DDDDDD" w:sz="1"/>
+            </w:tcBorders>
+            <w:shd w:fill="FFFFFF" w:val="clear"/>
+            <w:tcMar>
+              <w:top w:type="dxa" w:w="80"/>
+              <w:left w:type="dxa" w:w="120"/>
+              <w:bottom w:type="dxa" w:w="80"/>
+              <w:right w:type="dxa" w:w="120"/>
+            </w:tcMar>
+          </w:tcPr>
+          <w:p>
+            <w:r>
+              <w:rPr>
+                <w:rFonts w:ascii="Arial" w:cs="Arial" w:eastAsia="Arial" w:hAnsi="Arial"/>
+                <w:sz w:val="18"/>
+                <w:szCs w:val="18"/>
+              </w:rPr>
+              <w:t xml:space="preserve">KGW</w:t>
+            </w:r>
+          </w:p>
+        </w:tc>
+        <w:tc>
+          <w:tcPr>
+            <w:tcW w:type="dxa" w:w="900"/>
+            <w:tcBorders>
+              <w:top w:val="single" w:color="DDDDDD" w:sz="1"/>
+              <w:left w:val="single" w:color="DDDDDD" w:sz="1"/>
+              <w:bottom w:val="single" w:color="DDDDDD" w:sz="1"/>
+              <w:right w:val="single" w:color="DDDDDD" w:sz="1"/>
+            </w:tcBorders>
+            <w:shd w:fill="FFFFFF" w:val="clear"/>
+            <w:tcMar>
+              <w:top w:type="dxa" w:w="80"/>
+              <w:left w:type="dxa" w:w="120"/>
+              <w:bottom w:type="dxa" w:w="80"/>
+              <w:right w:type="dxa" w:w="120"/>
+            </w:tcMar>
+          </w:tcPr>
+          <w:p>
+            <w:r>
+              <w:rPr>
+                <w:rFonts w:ascii="Arial" w:cs="Arial" w:eastAsia="Arial" w:hAnsi="Arial"/>
+                <w:sz w:val="18"/>
+                <w:szCs w:val="18"/>
+              </w:rPr>
+              <w:t xml:space="preserve"/>
+            </w:r>
+          </w:p>
+        </w:tc>
+        <w:tc>
+          <w:tcPr>
+            <w:tcW w:type="dxa" w:w="900"/>
+            <w:tcBorders>
+              <w:top w:val="single" w:color="DDDDDD" w:sz="1"/>
+              <w:left w:val="single" w:color="DDDDDD" w:sz="1"/>
+              <w:bottom w:val="single" w:color="DDDDDD" w:sz="1"/>
+              <w:right w:val="single" w:color="DDDDDD" w:sz="1"/>
+            </w:tcBorders>
+            <w:shd w:fill="FFFFFF" w:val="clear"/>
+            <w:tcMar>
+              <w:top w:type="dxa" w:w="80"/>
+              <w:left w:type="dxa" w:w="120"/>
+              <w:bottom w:type="dxa" w:w="80"/>
+              <w:right w:type="dxa" w:w="120"/>
+            </w:tcMar>
+          </w:tcPr>
+          <w:p>
+            <w:r>
+              <w:rPr>
+                <w:rFonts w:ascii="Arial" w:cs="Arial" w:eastAsia="Arial" w:hAnsi="Arial"/>
+                <w:sz w:val="18"/>
+                <w:szCs w:val="18"/>
+              </w:rPr>
+              <w:t xml:space="preserve"/>
+            </w:r>
+          </w:p>
+        </w:tc>
+        <w:tc>
+          <w:tcPr>
+            <w:tcW w:type="dxa" w:w="900"/>
+            <w:tcBorders>
+              <w:top w:val="single" w:color="DDDDDD" w:sz="1"/>
+              <w:left w:val="single" w:color="DDDDDD" w:sz="1"/>
+              <w:bottom w:val="single" w:color="DDDDDD" w:sz="1"/>
+              <w:right w:val="single" w:color="DDDDDD" w:sz="1"/>
+            </w:tcBorders>
+            <w:shd w:fill="FFFFFF" w:val="clear"/>
+            <w:tcMar>
+              <w:top w:type="dxa" w:w="80"/>
+              <w:left w:type="dxa" w:w="120"/>
+              <w:bottom w:type="dxa" w:w="80"/>
+              <w:right w:type="dxa" w:w="120"/>
+            </w:tcMar>
+          </w:tcPr>
+          <w:p>
+            <w:r>
+              <w:rPr>
+                <w:rFonts w:ascii="Arial" w:cs="Arial" w:eastAsia="Arial" w:hAnsi="Arial"/>
+                <w:sz w:val="18"/>
+                <w:szCs w:val="18"/>
+              </w:rPr>
+              <w:t xml:space="preserve"/>
+            </w:r>
+          </w:p>
+        </w:tc>
+        <w:tc>
+          <w:tcPr>
+            <w:tcW w:type="dxa" w:w="1000"/>
+            <w:tcBorders>
+              <w:top w:val="single" w:color="DDDDDD" w:sz="1"/>
+              <w:left w:val="single" w:color="DDDDDD" w:sz="1"/>
+              <w:bottom w:val="single" w:color="DDDDDD" w:sz="1"/>
+              <w:right w:val="single" w:color="DDDDDD" w:sz="1"/>
+            </w:tcBorders>
+            <w:shd w:fill="FFFFFF" w:val="clear"/>
+            <w:tcMar>
+              <w:top w:type="dxa" w:w="80"/>
+              <w:left w:type="dxa" w:w="120"/>
+              <w:bottom w:type="dxa" w:w="80"/>
+              <w:right w:type="dxa" w:w="120"/>
+            </w:tcMar>
+          </w:tcPr>
+          <w:p>
+            <w:r>
+              <w:rPr>
+                <w:rFonts w:ascii="Arial" w:cs="Arial" w:eastAsia="Arial" w:hAnsi="Arial"/>
+                <w:sz w:val="18"/>
+                <w:szCs w:val="18"/>
+              </w:rPr>
+              <w:t xml:space="preserve"/>
+            </w:r>
+          </w:p>
+        </w:tc>
+        <w:tc>
+          <w:tcPr>
+            <w:tcW w:type="dxa" w:w="900"/>
+            <w:tcBorders>
+              <w:top w:val="single" w:color="DDDDDD" w:sz="1"/>
+              <w:left w:val="single" w:color="DDDDDD" w:sz="1"/>
+              <w:bottom w:val="single" w:color="DDDDDD" w:sz="1"/>
+              <w:right w:val="single" w:color="DDDDDD" w:sz="1"/>
+            </w:tcBorders>
+            <w:shd w:fill="FFFFFF" w:val="clear"/>
+            <w:tcMar>
+              <w:top w:type="dxa" w:w="80"/>
+              <w:left w:type="dxa" w:w="120"/>
+              <w:bottom w:type="dxa" w:w="80"/>
+              <w:right w:type="dxa" w:w="120"/>
+            </w:tcMar>
+          </w:tcPr>
+          <w:p>
+            <w:r>
+              <w:rPr>
+                <w:rFonts w:ascii="Arial" w:cs="Arial" w:eastAsia="Arial" w:hAnsi="Arial"/>
+                <w:sz w:val="18"/>
+                <w:szCs w:val="18"/>
+              </w:rPr>
+              <w:t xml:space="preserve"/>
+            </w:r>
+          </w:p>
+        </w:tc>
+        <w:tc>
+          <w:tcPr>
+            <w:tcW w:type="dxa" w:w="1000"/>
+            <w:tcBorders>
+              <w:top w:val="single" w:color="DDDDDD" w:sz="1"/>
+              <w:left w:val="single" w:color="DDDDDD" w:sz="1"/>
+              <w:bottom w:val="single" w:color="DDDDDD" w:sz="1"/>
+              <w:right w:val="single" w:color="DDDDDD" w:sz="1"/>
+            </w:tcBorders>
+            <w:shd w:fill="FFFFFF" w:val="clear"/>
+            <w:tcMar>
+              <w:top w:type="dxa" w:w="80"/>
+              <w:left w:type="dxa" w:w="120"/>
+              <w:bottom w:type="dxa" w:w="80"/>
+              <w:right w:type="dxa" w:w="120"/>
+            </w:tcMar>
+          </w:tcPr>
+          <w:p>
+            <w:r>
+              <w:rPr>
+                <w:rFonts w:ascii="Arial" w:cs="Arial" w:eastAsia="Arial" w:hAnsi="Arial"/>
+                <w:sz w:val="18"/>
+                <w:szCs w:val="18"/>
+              </w:rPr>
+              <w:t xml:space="preserve"/>
+            </w:r>
+          </w:p>
+        </w:tc>
+        <w:tc>
+          <w:tcPr>
+            <w:tcW w:type="dxa" w:w="900"/>
+            <w:tcBorders>
+              <w:top w:val="single" w:color="DDDDDD" w:sz="1"/>
+              <w:left w:val="single" w:color="DDDDDD" w:sz="1"/>
+              <w:bottom w:val="single" w:color="DDDDDD" w:sz="1"/>
+              <w:right w:val="single" w:color="DDDDDD" w:sz="1"/>
+            </w:tcBorders>
+            <w:shd w:fill="FFFFFF" w:val="clear"/>
+            <w:tcMar>
+              <w:top w:type="dxa" w:w="80"/>
+              <w:left w:type="dxa" w:w="120"/>
+              <w:bottom w:type="dxa" w:w="80"/>
+              <w:right w:type="dxa" w:w="120"/>
+            </w:tcMar>
+          </w:tcPr>
+          <w:p>
+            <w:r>
+              <w:rPr>
+                <w:rFonts w:ascii="Arial" w:cs="Arial" w:eastAsia="Arial" w:hAnsi="Arial"/>
+                <w:sz w:val="18"/>
+                <w:szCs w:val="18"/>
+              </w:rPr>
+              <w:t xml:space="preserve"/>
+            </w:r>
+          </w:p>
+        </w:tc>
+        <w:tc>
+          <w:tcPr>
+            <w:tcW w:type="dxa" w:w="900"/>
+            <w:tcBorders>
+              <w:top w:val="single" w:color="DDDDDD" w:sz="1"/>
+              <w:left w:val="single" w:color="DDDDDD" w:sz="1"/>
+              <w:bottom w:val="single" w:color="DDDDDD" w:sz="1"/>
+              <w:right w:val="single" w:color="DDDDDD" w:sz="1"/>
+            </w:tcBorders>
+            <w:shd w:fill="FFFFFF" w:val="clear"/>
+            <w:tcMar>
+              <w:top w:type="dxa" w:w="80"/>
+              <w:left w:type="dxa" w:w="120"/>
+              <w:bottom w:type="dxa" w:w="80"/>
+              <w:right w:type="dxa" w:w="120"/>
+            </w:tcMar>
+          </w:tcPr>
+          <w:p>
+            <w:r>
+              <w:rPr>
+                <w:rFonts w:ascii="Arial" w:cs="Arial" w:eastAsia="Arial" w:hAnsi="Arial"/>
+                <w:sz w:val="18"/>
+                <w:szCs w:val="18"/>
+              </w:rPr>
+              <w:t xml:space="preserve"/>
+            </w:r>
+          </w:p>
+        </w:tc>
+      </w:tr>
+      <w:tr>
+        <w:tc>
+          <w:tcPr>
+            <w:tcW w:type="dxa" w:w="900"/>
+            <w:tcBorders>
+              <w:top w:val="single" w:color="DDDDDD" w:sz="1"/>
+              <w:left w:val="single" w:color="DDDDDD" w:sz="1"/>
+              <w:bottom w:val="single" w:color="DDDDDD" w:sz="1"/>
+              <w:right w:val="single" w:color="DDDDDD" w:sz="1"/>
+            </w:tcBorders>
+            <w:shd w:fill="FFFFFF" w:val="clear"/>
+            <w:tcMar>
+              <w:top w:type="dxa" w:w="80"/>
+              <w:left w:type="dxa" w:w="120"/>
+              <w:bottom w:type="dxa" w:w="80"/>
+              <w:right w:type="dxa" w:w="120"/>
+            </w:tcMar>
+          </w:tcPr>
+          <w:p>
+            <w:r>
+              <w:rPr>
+                <w:rFonts w:ascii="Arial" w:cs="Arial" w:eastAsia="Arial" w:hAnsi="Arial"/>
+                <w:sz w:val="18"/>
+                <w:szCs w:val="18"/>
+              </w:rPr>
+              <w:t xml:space="preserve">SVB</w:t>
             </w:r>
           </w:p>
         </w:tc>

</xml_diff>